<commit_message>
Deployed accf435 with MkDocs version: 1.6.1
</commit_message>
<xml_diff>
--- a/assets/downloads/visual-documentation/vd-github-actions-and-github-pages-workflow-model.docx
+++ b/assets/downloads/visual-documentation/vd-github-actions-and-github-pages-workflow-model.docx
@@ -1,6 +1,6 @@
 
 <file path=word/document.xml><?xml version="1.0" encoding="utf-8"?>
-<w:document xmlns:wpc="http://schemas.microsoft.com/office/word/2010/wordprocessingCanvas" xmlns:cx="http://schemas.microsoft.com/office/drawing/2014/chartex" xmlns:cx1="http://schemas.microsoft.com/office/drawing/2015/9/8/chartex" xmlns:cx2="http://schemas.microsoft.com/office/drawing/2015/10/21/chartex" xmlns:cx3="http://schemas.microsoft.com/office/drawing/2016/5/9/chartex" xmlns:cx4="http://schemas.microsoft.com/office/drawing/2016/5/10/chartex" xmlns:cx5="http://schemas.microsoft.com/office/drawing/2016/5/11/chartex" xmlns:cx6="http://schemas.microsoft.com/office/drawing/2016/5/12/chartex" xmlns:cx7="http://schemas.microsoft.com/office/drawing/2016/5/13/chartex" xmlns:cx8="http://schemas.microsoft.com/office/drawing/2016/5/14/chartex" xmlns:mc="http://schemas.openxmlformats.org/markup-compatibility/2006" xmlns:aink="http://schemas.microsoft.com/office/drawing/2016/ink" xmlns:am3d="http://schemas.microsoft.com/office/drawing/2017/model3d" xmlns:o="urn:schemas-microsoft-com:office:office" xmlns:r="http://schemas.openxmlformats.org/officeDocument/2006/relationships" xmlns:m="http://schemas.openxmlformats.org/officeDocument/2006/math" xmlns:v="urn:schemas-microsoft-com:vml" xmlns:wp14="http://schemas.microsoft.com/office/word/2010/wordprocessingDrawing" xmlns:wp="http://schemas.openxmlformats.org/drawingml/2006/wordprocessingDrawing" xmlns:w10="urn:schemas-microsoft-com:office:word" xmlns:w="http://schemas.openxmlformats.org/wordprocessingml/2006/main" xmlns:w14="http://schemas.microsoft.com/office/word/2010/wordml" xmlns:w15="http://schemas.microsoft.com/office/word/2012/wordml" xmlns:w16cid="http://schemas.microsoft.com/office/word/2016/wordml/cid" xmlns:w16se="http://schemas.microsoft.com/office/word/2015/wordml/symex" xmlns:wpg="http://schemas.microsoft.com/office/word/2010/wordprocessingGroup" xmlns:wpi="http://schemas.microsoft.com/office/word/2010/wordprocessingInk" xmlns:wne="http://schemas.microsoft.com/office/word/2006/wordml" xmlns:wps="http://schemas.microsoft.com/office/word/2010/wordprocessingShape" mc:Ignorable="w14 w15 w16se w16cid wp14">
+<w:document xmlns:wpc="http://schemas.microsoft.com/office/word/2010/wordprocessingCanvas" xmlns:cx="http://schemas.microsoft.com/office/drawing/2014/chartex" xmlns:cx1="http://schemas.microsoft.com/office/drawing/2015/9/8/chartex" xmlns:cx2="http://schemas.microsoft.com/office/drawing/2015/10/21/chartex" xmlns:cx3="http://schemas.microsoft.com/office/drawing/2016/5/9/chartex" xmlns:cx4="http://schemas.microsoft.com/office/drawing/2016/5/10/chartex" xmlns:cx5="http://schemas.microsoft.com/office/drawing/2016/5/11/chartex" xmlns:cx6="http://schemas.microsoft.com/office/drawing/2016/5/12/chartex" xmlns:cx7="http://schemas.microsoft.com/office/drawing/2016/5/13/chartex" xmlns:cx8="http://schemas.microsoft.com/office/drawing/2016/5/14/chartex" xmlns:mc="http://schemas.openxmlformats.org/markup-compatibility/2006" xmlns:m="http://schemas.openxmlformats.org/officeDocument/2006/math" xmlns:aink="http://schemas.microsoft.com/office/drawing/2016/ink" xmlns:am3d="http://schemas.microsoft.com/office/drawing/2017/model3d" xmlns:oel="http://schemas.microsoft.com/office/2019/extlst" xmlns:r="http://schemas.openxmlformats.org/officeDocument/2006/relationships" xmlns:wp14="http://schemas.microsoft.com/office/word/2010/wordprocessingDrawing" xmlns:wp="http://schemas.openxmlformats.org/drawingml/2006/wordprocessingDrawing" xmlns:wpg="http://schemas.microsoft.com/office/word/2010/wordprocessingGroup" xmlns:wpi="http://schemas.microsoft.com/office/word/2010/wordprocessingInk" xmlns:wps="http://schemas.microsoft.com/office/word/2010/wordprocessingShape" xmlns:o="urn:schemas-microsoft-com:office:office" xmlns:v="urn:schemas-microsoft-com:vml" xmlns:w10="urn:schemas-microsoft-com:office:word" xmlns:w="http://schemas.openxmlformats.org/wordprocessingml/2006/main" xmlns:w14="http://schemas.microsoft.com/office/word/2010/wordml" xmlns:w15="http://schemas.microsoft.com/office/word/2012/wordml" xmlns:w16cex="http://schemas.microsoft.com/office/word/2018/wordml/cex" xmlns:w16cid="http://schemas.microsoft.com/office/word/2016/wordml/cid" xmlns:w16="http://schemas.microsoft.com/office/word/2018/wordml" xmlns:w16sdtdh="http://schemas.microsoft.com/office/word/2020/wordml/sdtdatahash" xmlns:w16sdtfl="http://schemas.microsoft.com/office/word/2024/wordml/sdtformatlock" xmlns:w16se="http://schemas.microsoft.com/office/word/2015/wordml/symex" xmlns:w16du="http://schemas.microsoft.com/office/word/2023/wordml/word16du" xmlns:wne="http://schemas.microsoft.com/office/word/2006/wordml" mc:Ignorable="w14 w15 w16se w16cid w16 w16cex w16sdtdh w16sdtfl w16du wp14">
   <w:body>
     <w:sdt>
       <w:sdtPr>
@@ -10,7 +10,6 @@
           <w:docPartUnique/>
         </w:docPartObj>
       </w:sdtPr>
-      <w:sdtEndPr/>
       <w:sdtContent>
         <w:p>
           <w:pPr>
@@ -443,7 +442,7 @@
                 <v:stroke joinstyle="miter"/>
                 <v:path gradientshapeok="t" o:connecttype="rect"/>
               </v:shapetype>
-              <v:shape id="Text Box 131" o:spid="_x0000_s1026" type="#_x0000_t202" style="position:absolute;margin-left:168.3pt;margin-top:112.85pt;width:323pt;height:481.6pt;z-index:251658240;visibility:visible;mso-wrap-style:square;mso-width-percent:0;mso-height-percent:0;mso-wrap-distance-left:14.4pt;mso-wrap-distance-top:0;mso-wrap-distance-right:14.4pt;mso-wrap-distance-bottom:0;mso-position-horizontal:absolute;mso-position-horizontal-relative:margin;mso-position-vertical:absolute;mso-position-vertical-relative:margin;mso-width-percent:0;mso-height-percent:0;mso-width-relative:margin;mso-height-relative:page;v-text-anchor:top" o:gfxdata="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" filled="f" stroked="f" strokeweight=".5pt">
+              <v:shape id="Text Box 131" o:spid="_x0000_s1026" type="#_x0000_t202" style="position:absolute;margin-left:168.3pt;margin-top:112.85pt;width:323pt;height:481.6pt;z-index:251658240;visibility:visible;mso-wrap-style:square;mso-width-percent:0;mso-height-percent:0;mso-wrap-distance-left:14.4pt;mso-wrap-distance-top:0;mso-wrap-distance-right:14.4pt;mso-wrap-distance-bottom:0;mso-position-horizontal:absolute;mso-position-horizontal-relative:margin;mso-position-vertical:absolute;mso-position-vertical-relative:margin;mso-width-percent:0;mso-height-percent:0;mso-width-relative:margin;mso-height-relative:page;v-text-anchor:top" o:gfxdata="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" filled="f" stroked="f" strokeweight=".5pt">
                 <v:textbox inset="0,0,0,0">
                   <w:txbxContent>
                     <w:p>
@@ -844,7 +843,7 @@
             <w:rPr>
               <w:rFonts w:asciiTheme="minorHAnsi" w:eastAsiaTheme="minorEastAsia" w:hAnsiTheme="minorHAnsi"/>
               <w:noProof/>
-              <w:lang w:val="en-AE" w:eastAsia="en-AE"/>
+              <w:lang/>
             </w:rPr>
           </w:pPr>
           <w:r>
@@ -880,7 +879,7 @@
               <w:rPr>
                 <w:rFonts w:asciiTheme="minorHAnsi" w:eastAsiaTheme="minorEastAsia" w:hAnsiTheme="minorHAnsi"/>
                 <w:noProof/>
-                <w:lang w:val="en-AE" w:eastAsia="en-AE"/>
+                <w:lang/>
               </w:rPr>
               <w:tab/>
             </w:r>
@@ -951,7 +950,7 @@
             <w:rPr>
               <w:rFonts w:asciiTheme="minorHAnsi" w:eastAsiaTheme="minorEastAsia" w:hAnsiTheme="minorHAnsi"/>
               <w:noProof/>
-              <w:lang w:val="en-AE" w:eastAsia="en-AE"/>
+              <w:lang/>
             </w:rPr>
           </w:pPr>
           <w:hyperlink w:anchor="_Toc241581001" w:history="1">
@@ -966,7 +965,7 @@
               <w:rPr>
                 <w:rFonts w:asciiTheme="minorHAnsi" w:eastAsiaTheme="minorEastAsia" w:hAnsiTheme="minorHAnsi"/>
                 <w:noProof/>
-                <w:lang w:val="en-AE" w:eastAsia="en-AE"/>
+                <w:lang/>
               </w:rPr>
               <w:tab/>
             </w:r>
@@ -1037,7 +1036,7 @@
             <w:rPr>
               <w:rFonts w:asciiTheme="minorHAnsi" w:eastAsiaTheme="minorEastAsia" w:hAnsiTheme="minorHAnsi"/>
               <w:noProof/>
-              <w:lang w:val="en-AE" w:eastAsia="en-AE"/>
+              <w:lang/>
             </w:rPr>
           </w:pPr>
           <w:hyperlink w:anchor="_Toc241581002" w:history="1">
@@ -1052,7 +1051,7 @@
               <w:rPr>
                 <w:rFonts w:asciiTheme="minorHAnsi" w:eastAsiaTheme="minorEastAsia" w:hAnsiTheme="minorHAnsi"/>
                 <w:noProof/>
-                <w:lang w:val="en-AE" w:eastAsia="en-AE"/>
+                <w:lang/>
               </w:rPr>
               <w:tab/>
             </w:r>
@@ -1123,7 +1122,7 @@
             <w:rPr>
               <w:rFonts w:asciiTheme="minorHAnsi" w:eastAsiaTheme="minorEastAsia" w:hAnsiTheme="minorHAnsi"/>
               <w:noProof/>
-              <w:lang w:val="en-AE" w:eastAsia="en-AE"/>
+              <w:lang/>
             </w:rPr>
           </w:pPr>
           <w:hyperlink w:anchor="_Toc241581003" w:history="1">
@@ -1138,7 +1137,7 @@
               <w:rPr>
                 <w:rFonts w:asciiTheme="minorHAnsi" w:eastAsiaTheme="minorEastAsia" w:hAnsiTheme="minorHAnsi"/>
                 <w:noProof/>
-                <w:lang w:val="en-AE" w:eastAsia="en-AE"/>
+                <w:lang/>
               </w:rPr>
               <w:tab/>
             </w:r>
@@ -1209,7 +1208,7 @@
             <w:rPr>
               <w:rFonts w:asciiTheme="minorHAnsi" w:eastAsiaTheme="minorEastAsia" w:hAnsiTheme="minorHAnsi"/>
               <w:noProof/>
-              <w:lang w:val="en-AE" w:eastAsia="en-AE"/>
+              <w:lang/>
             </w:rPr>
           </w:pPr>
           <w:hyperlink w:anchor="_Toc241581004" w:history="1">
@@ -1224,7 +1223,7 @@
               <w:rPr>
                 <w:rFonts w:asciiTheme="minorHAnsi" w:eastAsiaTheme="minorEastAsia" w:hAnsiTheme="minorHAnsi"/>
                 <w:noProof/>
-                <w:lang w:val="en-AE" w:eastAsia="en-AE"/>
+                <w:lang/>
               </w:rPr>
               <w:tab/>
             </w:r>
@@ -1295,7 +1294,7 @@
             <w:rPr>
               <w:rFonts w:asciiTheme="minorHAnsi" w:eastAsiaTheme="minorEastAsia" w:hAnsiTheme="minorHAnsi"/>
               <w:noProof/>
-              <w:lang w:val="en-AE" w:eastAsia="en-AE"/>
+              <w:lang/>
             </w:rPr>
           </w:pPr>
           <w:hyperlink w:anchor="_Toc241581005" w:history="1">
@@ -1310,7 +1309,7 @@
               <w:rPr>
                 <w:rFonts w:asciiTheme="minorHAnsi" w:eastAsiaTheme="minorEastAsia" w:hAnsiTheme="minorHAnsi"/>
                 <w:noProof/>
-                <w:lang w:val="en-AE" w:eastAsia="en-AE"/>
+                <w:lang/>
               </w:rPr>
               <w:tab/>
             </w:r>
@@ -1381,7 +1380,7 @@
             <w:rPr>
               <w:rFonts w:asciiTheme="minorHAnsi" w:eastAsiaTheme="minorEastAsia" w:hAnsiTheme="minorHAnsi"/>
               <w:noProof/>
-              <w:lang w:val="en-AE" w:eastAsia="en-AE"/>
+              <w:lang/>
             </w:rPr>
           </w:pPr>
           <w:hyperlink w:anchor="_Toc241581006" w:history="1">
@@ -1396,7 +1395,7 @@
               <w:rPr>
                 <w:rFonts w:asciiTheme="minorHAnsi" w:eastAsiaTheme="minorEastAsia" w:hAnsiTheme="minorHAnsi"/>
                 <w:noProof/>
-                <w:lang w:val="en-AE" w:eastAsia="en-AE"/>
+                <w:lang/>
               </w:rPr>
               <w:tab/>
             </w:r>
@@ -1467,7 +1466,7 @@
             <w:rPr>
               <w:rFonts w:asciiTheme="minorHAnsi" w:eastAsiaTheme="minorEastAsia" w:hAnsiTheme="minorHAnsi"/>
               <w:noProof/>
-              <w:lang w:val="en-AE" w:eastAsia="en-AE"/>
+              <w:lang/>
             </w:rPr>
           </w:pPr>
           <w:hyperlink w:anchor="_Toc241581007" w:history="1">
@@ -1482,7 +1481,7 @@
               <w:rPr>
                 <w:rFonts w:asciiTheme="minorHAnsi" w:eastAsiaTheme="minorEastAsia" w:hAnsiTheme="minorHAnsi"/>
                 <w:noProof/>
-                <w:lang w:val="en-AE" w:eastAsia="en-AE"/>
+                <w:lang/>
               </w:rPr>
               <w:tab/>
             </w:r>
@@ -1635,7 +1634,7 @@
         <w:rPr>
           <w:rFonts w:asciiTheme="minorHAnsi" w:eastAsiaTheme="minorEastAsia" w:hAnsiTheme="minorHAnsi"/>
           <w:noProof/>
-          <w:lang w:val="en-AE" w:eastAsia="en-AE"/>
+          <w:lang/>
         </w:rPr>
       </w:pPr>
       <w:r>
@@ -1803,7 +1802,7 @@
         <w:rPr>
           <w:rFonts w:asciiTheme="minorHAnsi" w:eastAsiaTheme="minorEastAsia" w:hAnsiTheme="minorHAnsi"/>
           <w:noProof/>
-          <w:lang w:val="en-AE" w:eastAsia="en-AE"/>
+          <w:lang/>
         </w:rPr>
       </w:pPr>
       <w:r>
@@ -5304,27 +5303,14 @@
       <w:r>
         <w:t xml:space="preserve">Table </w:t>
       </w:r>
-      <w:r>
-        <w:fldChar w:fldCharType="begin"/>
-      </w:r>
-      <w:r>
-        <w:instrText xml:space="preserve"> SEQ Table \* ARABIC </w:instrText>
-      </w:r>
-      <w:r>
-        <w:fldChar w:fldCharType="separate"/>
-      </w:r>
-      <w:r>
-        <w:rPr>
-          <w:noProof/>
-        </w:rPr>
-        <w:t>1</w:t>
-      </w:r>
-      <w:r>
-        <w:rPr>
-          <w:noProof/>
-        </w:rPr>
-        <w:fldChar w:fldCharType="end"/>
-      </w:r>
+      <w:fldSimple w:instr=" SEQ Table \* ARABIC ">
+        <w:r>
+          <w:rPr>
+            <w:noProof/>
+          </w:rPr>
+          <w:t>1</w:t>
+        </w:r>
+      </w:fldSimple>
       <w:r>
         <w:t xml:space="preserve"> Case Study Fields</w:t>
       </w:r>
@@ -6013,24 +5999,14 @@
       <w:r>
         <w:t xml:space="preserve">Figure </w:t>
       </w:r>
-      <w:r>
-        <w:fldChar w:fldCharType="begin"/>
-      </w:r>
-      <w:r>
-        <w:instrText xml:space="preserve"> SEQ Figure \* ARABIC </w:instrText>
-      </w:r>
-      <w:r>
-        <w:fldChar w:fldCharType="separate"/>
-      </w:r>
-      <w:r>
-        <w:rPr>
-          <w:noProof/>
-        </w:rPr>
-        <w:t>1</w:t>
-      </w:r>
-      <w:r>
-        <w:fldChar w:fldCharType="end"/>
-      </w:r>
+      <w:fldSimple w:instr=" SEQ Figure \* ARABIC ">
+        <w:r>
+          <w:rPr>
+            <w:noProof/>
+          </w:rPr>
+          <w:t>1</w:t>
+        </w:r>
+      </w:fldSimple>
       <w:r>
         <w:t xml:space="preserve"> </w:t>
       </w:r>
@@ -6054,15 +6030,7 @@
         <w:pStyle w:val="Body2"/>
       </w:pPr>
       <w:r>
-        <w:t xml:space="preserve">The </w:t>
-      </w:r>
-      <w:proofErr w:type="spellStart"/>
-      <w:r>
-        <w:t>folliwng</w:t>
-      </w:r>
-      <w:proofErr w:type="spellEnd"/>
-      <w:r>
-        <w:t xml:space="preserve"> links to the original public documentation/repository.</w:t>
+        <w:t>The folliwng links to the original public documentation/repository.</w:t>
       </w:r>
     </w:p>
     <w:p>
@@ -6130,8 +6098,6 @@
           <w:numId w:val="0"/>
         </w:numPr>
       </w:pPr>
-      <w:bookmarkStart w:id="902" w:name="_GoBack"/>
-      <w:bookmarkEnd w:id="902"/>
     </w:p>
     <w:sectPr>
       <w:pgSz w:w="12240" w:h="15840" w:code="1"/>
@@ -6145,7 +6111,7 @@
 </file>
 
 <file path=word/endnotes.xml><?xml version="1.0" encoding="utf-8"?>
-<w:endnotes xmlns:wpc="http://schemas.microsoft.com/office/word/2010/wordprocessingCanvas" xmlns:cx="http://schemas.microsoft.com/office/drawing/2014/chartex" xmlns:cx1="http://schemas.microsoft.com/office/drawing/2015/9/8/chartex" xmlns:cx2="http://schemas.microsoft.com/office/drawing/2015/10/21/chartex" xmlns:cx3="http://schemas.microsoft.com/office/drawing/2016/5/9/chartex" xmlns:cx4="http://schemas.microsoft.com/office/drawing/2016/5/10/chartex" xmlns:cx5="http://schemas.microsoft.com/office/drawing/2016/5/11/chartex" xmlns:cx6="http://schemas.microsoft.com/office/drawing/2016/5/12/chartex" xmlns:cx7="http://schemas.microsoft.com/office/drawing/2016/5/13/chartex" xmlns:cx8="http://schemas.microsoft.com/office/drawing/2016/5/14/chartex" xmlns:mc="http://schemas.openxmlformats.org/markup-compatibility/2006" xmlns:aink="http://schemas.microsoft.com/office/drawing/2016/ink" xmlns:am3d="http://schemas.microsoft.com/office/drawing/2017/model3d" xmlns:o="urn:schemas-microsoft-com:office:office" xmlns:r="http://schemas.openxmlformats.org/officeDocument/2006/relationships" xmlns:m="http://schemas.openxmlformats.org/officeDocument/2006/math" xmlns:v="urn:schemas-microsoft-com:vml" xmlns:wp14="http://schemas.microsoft.com/office/word/2010/wordprocessingDrawing" xmlns:wp="http://schemas.openxmlformats.org/drawingml/2006/wordprocessingDrawing" xmlns:w10="urn:schemas-microsoft-com:office:word" xmlns:w="http://schemas.openxmlformats.org/wordprocessingml/2006/main" xmlns:w14="http://schemas.microsoft.com/office/word/2010/wordml" xmlns:w15="http://schemas.microsoft.com/office/word/2012/wordml" xmlns:w16cid="http://schemas.microsoft.com/office/word/2016/wordml/cid" xmlns:w16se="http://schemas.microsoft.com/office/word/2015/wordml/symex" xmlns:wpg="http://schemas.microsoft.com/office/word/2010/wordprocessingGroup" xmlns:wpi="http://schemas.microsoft.com/office/word/2010/wordprocessingInk" xmlns:wne="http://schemas.microsoft.com/office/word/2006/wordml" xmlns:wps="http://schemas.microsoft.com/office/word/2010/wordprocessingShape" mc:Ignorable="w14 w15 w16se w16cid wp14">
+<w:endnotes xmlns:wpc="http://schemas.microsoft.com/office/word/2010/wordprocessingCanvas" xmlns:cx="http://schemas.microsoft.com/office/drawing/2014/chartex" xmlns:cx1="http://schemas.microsoft.com/office/drawing/2015/9/8/chartex" xmlns:cx2="http://schemas.microsoft.com/office/drawing/2015/10/21/chartex" xmlns:cx3="http://schemas.microsoft.com/office/drawing/2016/5/9/chartex" xmlns:cx4="http://schemas.microsoft.com/office/drawing/2016/5/10/chartex" xmlns:cx5="http://schemas.microsoft.com/office/drawing/2016/5/11/chartex" xmlns:cx6="http://schemas.microsoft.com/office/drawing/2016/5/12/chartex" xmlns:cx7="http://schemas.microsoft.com/office/drawing/2016/5/13/chartex" xmlns:cx8="http://schemas.microsoft.com/office/drawing/2016/5/14/chartex" xmlns:mc="http://schemas.openxmlformats.org/markup-compatibility/2006" xmlns:m="http://schemas.openxmlformats.org/officeDocument/2006/math" xmlns:aink="http://schemas.microsoft.com/office/drawing/2016/ink" xmlns:am3d="http://schemas.microsoft.com/office/drawing/2017/model3d" xmlns:oel="http://schemas.microsoft.com/office/2019/extlst" xmlns:r="http://schemas.openxmlformats.org/officeDocument/2006/relationships" xmlns:wp14="http://schemas.microsoft.com/office/word/2010/wordprocessingDrawing" xmlns:wp="http://schemas.openxmlformats.org/drawingml/2006/wordprocessingDrawing" xmlns:wpg="http://schemas.microsoft.com/office/word/2010/wordprocessingGroup" xmlns:wpi="http://schemas.microsoft.com/office/word/2010/wordprocessingInk" xmlns:wps="http://schemas.microsoft.com/office/word/2010/wordprocessingShape" xmlns:o="urn:schemas-microsoft-com:office:office" xmlns:v="urn:schemas-microsoft-com:vml" xmlns:w10="urn:schemas-microsoft-com:office:word" xmlns:w="http://schemas.openxmlformats.org/wordprocessingml/2006/main" xmlns:w14="http://schemas.microsoft.com/office/word/2010/wordml" xmlns:w15="http://schemas.microsoft.com/office/word/2012/wordml" xmlns:w16cex="http://schemas.microsoft.com/office/word/2018/wordml/cex" xmlns:w16cid="http://schemas.microsoft.com/office/word/2016/wordml/cid" xmlns:w16="http://schemas.microsoft.com/office/word/2018/wordml" xmlns:w16sdtdh="http://schemas.microsoft.com/office/word/2020/wordml/sdtdatahash" xmlns:w16sdtfl="http://schemas.microsoft.com/office/word/2024/wordml/sdtformatlock" xmlns:w16se="http://schemas.microsoft.com/office/word/2015/wordml/symex" xmlns:w16du="http://schemas.microsoft.com/office/word/2023/wordml/word16du" xmlns:wne="http://schemas.microsoft.com/office/word/2006/wordml" mc:Ignorable="w14 w15 w16se w16cid w16 w16cex w16sdtdh w16sdtfl w16du wp14">
   <w:endnote w:type="separator" w:id="-1">
     <w:p>
       <w:pPr>
@@ -6170,7 +6136,7 @@
 </file>
 
 <file path=word/footer1.xml><?xml version="1.0" encoding="utf-8"?>
-<w:ftr xmlns:wpc="http://schemas.microsoft.com/office/word/2010/wordprocessingCanvas" xmlns:cx="http://schemas.microsoft.com/office/drawing/2014/chartex" xmlns:cx1="http://schemas.microsoft.com/office/drawing/2015/9/8/chartex" xmlns:cx2="http://schemas.microsoft.com/office/drawing/2015/10/21/chartex" xmlns:cx3="http://schemas.microsoft.com/office/drawing/2016/5/9/chartex" xmlns:cx4="http://schemas.microsoft.com/office/drawing/2016/5/10/chartex" xmlns:cx5="http://schemas.microsoft.com/office/drawing/2016/5/11/chartex" xmlns:cx6="http://schemas.microsoft.com/office/drawing/2016/5/12/chartex" xmlns:cx7="http://schemas.microsoft.com/office/drawing/2016/5/13/chartex" xmlns:cx8="http://schemas.microsoft.com/office/drawing/2016/5/14/chartex" xmlns:mc="http://schemas.openxmlformats.org/markup-compatibility/2006" xmlns:aink="http://schemas.microsoft.com/office/drawing/2016/ink" xmlns:am3d="http://schemas.microsoft.com/office/drawing/2017/model3d" xmlns:o="urn:schemas-microsoft-com:office:office" xmlns:r="http://schemas.openxmlformats.org/officeDocument/2006/relationships" xmlns:m="http://schemas.openxmlformats.org/officeDocument/2006/math" xmlns:v="urn:schemas-microsoft-com:vml" xmlns:wp14="http://schemas.microsoft.com/office/word/2010/wordprocessingDrawing" xmlns:wp="http://schemas.openxmlformats.org/drawingml/2006/wordprocessingDrawing" xmlns:w10="urn:schemas-microsoft-com:office:word" xmlns:w="http://schemas.openxmlformats.org/wordprocessingml/2006/main" xmlns:w14="http://schemas.microsoft.com/office/word/2010/wordml" xmlns:w15="http://schemas.microsoft.com/office/word/2012/wordml" xmlns:w16cid="http://schemas.microsoft.com/office/word/2016/wordml/cid" xmlns:w16se="http://schemas.microsoft.com/office/word/2015/wordml/symex" xmlns:wpg="http://schemas.microsoft.com/office/word/2010/wordprocessingGroup" xmlns:wpi="http://schemas.microsoft.com/office/word/2010/wordprocessingInk" xmlns:wne="http://schemas.microsoft.com/office/word/2006/wordml" xmlns:wps="http://schemas.microsoft.com/office/word/2010/wordprocessingShape" mc:Ignorable="w14 w15 w16se w16cid wp14">
+<w:ftr xmlns:wpc="http://schemas.microsoft.com/office/word/2010/wordprocessingCanvas" xmlns:cx="http://schemas.microsoft.com/office/drawing/2014/chartex" xmlns:cx1="http://schemas.microsoft.com/office/drawing/2015/9/8/chartex" xmlns:cx2="http://schemas.microsoft.com/office/drawing/2015/10/21/chartex" xmlns:cx3="http://schemas.microsoft.com/office/drawing/2016/5/9/chartex" xmlns:cx4="http://schemas.microsoft.com/office/drawing/2016/5/10/chartex" xmlns:cx5="http://schemas.microsoft.com/office/drawing/2016/5/11/chartex" xmlns:cx6="http://schemas.microsoft.com/office/drawing/2016/5/12/chartex" xmlns:cx7="http://schemas.microsoft.com/office/drawing/2016/5/13/chartex" xmlns:cx8="http://schemas.microsoft.com/office/drawing/2016/5/14/chartex" xmlns:mc="http://schemas.openxmlformats.org/markup-compatibility/2006" xmlns:m="http://schemas.openxmlformats.org/officeDocument/2006/math" xmlns:aink="http://schemas.microsoft.com/office/drawing/2016/ink" xmlns:am3d="http://schemas.microsoft.com/office/drawing/2017/model3d" xmlns:oel="http://schemas.microsoft.com/office/2019/extlst" xmlns:r="http://schemas.openxmlformats.org/officeDocument/2006/relationships" xmlns:wp14="http://schemas.microsoft.com/office/word/2010/wordprocessingDrawing" xmlns:wp="http://schemas.openxmlformats.org/drawingml/2006/wordprocessingDrawing" xmlns:wpg="http://schemas.microsoft.com/office/word/2010/wordprocessingGroup" xmlns:wpi="http://schemas.microsoft.com/office/word/2010/wordprocessingInk" xmlns:wps="http://schemas.microsoft.com/office/word/2010/wordprocessingShape" xmlns:o="urn:schemas-microsoft-com:office:office" xmlns:v="urn:schemas-microsoft-com:vml" xmlns:w10="urn:schemas-microsoft-com:office:word" xmlns:w="http://schemas.openxmlformats.org/wordprocessingml/2006/main" xmlns:w14="http://schemas.microsoft.com/office/word/2010/wordml" xmlns:w15="http://schemas.microsoft.com/office/word/2012/wordml" xmlns:w16cex="http://schemas.microsoft.com/office/word/2018/wordml/cex" xmlns:w16cid="http://schemas.microsoft.com/office/word/2016/wordml/cid" xmlns:w16="http://schemas.microsoft.com/office/word/2018/wordml" xmlns:w16sdtdh="http://schemas.microsoft.com/office/word/2020/wordml/sdtdatahash" xmlns:w16sdtfl="http://schemas.microsoft.com/office/word/2024/wordml/sdtformatlock" xmlns:w16se="http://schemas.microsoft.com/office/word/2015/wordml/symex" xmlns:w16du="http://schemas.microsoft.com/office/word/2023/wordml/word16du" xmlns:wne="http://schemas.microsoft.com/office/word/2006/wordml" mc:Ignorable="w14 w15 w16se w16cid w16 w16cex w16sdtdh w16sdtfl w16du wp14">
   <w:sdt>
     <w:sdtPr>
       <w:rPr>
@@ -6182,11 +6148,6 @@
         <w:docPartUnique/>
       </w:docPartObj>
     </w:sdtPr>
-    <w:sdtEndPr>
-      <w:rPr>
-        <w:rStyle w:val="PageNumber"/>
-      </w:rPr>
-    </w:sdtEndPr>
     <w:sdtContent>
       <w:p>
         <w:pPr>
@@ -6227,7 +6188,7 @@
 </file>
 
 <file path=word/footer2.xml><?xml version="1.0" encoding="utf-8"?>
-<w:ftr xmlns:wpc="http://schemas.microsoft.com/office/word/2010/wordprocessingCanvas" xmlns:cx="http://schemas.microsoft.com/office/drawing/2014/chartex" xmlns:cx1="http://schemas.microsoft.com/office/drawing/2015/9/8/chartex" xmlns:cx2="http://schemas.microsoft.com/office/drawing/2015/10/21/chartex" xmlns:cx3="http://schemas.microsoft.com/office/drawing/2016/5/9/chartex" xmlns:cx4="http://schemas.microsoft.com/office/drawing/2016/5/10/chartex" xmlns:cx5="http://schemas.microsoft.com/office/drawing/2016/5/11/chartex" xmlns:cx6="http://schemas.microsoft.com/office/drawing/2016/5/12/chartex" xmlns:cx7="http://schemas.microsoft.com/office/drawing/2016/5/13/chartex" xmlns:cx8="http://schemas.microsoft.com/office/drawing/2016/5/14/chartex" xmlns:mc="http://schemas.openxmlformats.org/markup-compatibility/2006" xmlns:aink="http://schemas.microsoft.com/office/drawing/2016/ink" xmlns:am3d="http://schemas.microsoft.com/office/drawing/2017/model3d" xmlns:o="urn:schemas-microsoft-com:office:office" xmlns:r="http://schemas.openxmlformats.org/officeDocument/2006/relationships" xmlns:m="http://schemas.openxmlformats.org/officeDocument/2006/math" xmlns:v="urn:schemas-microsoft-com:vml" xmlns:wp14="http://schemas.microsoft.com/office/word/2010/wordprocessingDrawing" xmlns:wp="http://schemas.openxmlformats.org/drawingml/2006/wordprocessingDrawing" xmlns:w10="urn:schemas-microsoft-com:office:word" xmlns:w="http://schemas.openxmlformats.org/wordprocessingml/2006/main" xmlns:w14="http://schemas.microsoft.com/office/word/2010/wordml" xmlns:w15="http://schemas.microsoft.com/office/word/2012/wordml" xmlns:w16cid="http://schemas.microsoft.com/office/word/2016/wordml/cid" xmlns:w16se="http://schemas.microsoft.com/office/word/2015/wordml/symex" xmlns:wpg="http://schemas.microsoft.com/office/word/2010/wordprocessingGroup" xmlns:wpi="http://schemas.microsoft.com/office/word/2010/wordprocessingInk" xmlns:wne="http://schemas.microsoft.com/office/word/2006/wordml" xmlns:wps="http://schemas.microsoft.com/office/word/2010/wordprocessingShape" mc:Ignorable="w14 w15 w16se w16cid wp14">
+<w:ftr xmlns:wpc="http://schemas.microsoft.com/office/word/2010/wordprocessingCanvas" xmlns:cx="http://schemas.microsoft.com/office/drawing/2014/chartex" xmlns:cx1="http://schemas.microsoft.com/office/drawing/2015/9/8/chartex" xmlns:cx2="http://schemas.microsoft.com/office/drawing/2015/10/21/chartex" xmlns:cx3="http://schemas.microsoft.com/office/drawing/2016/5/9/chartex" xmlns:cx4="http://schemas.microsoft.com/office/drawing/2016/5/10/chartex" xmlns:cx5="http://schemas.microsoft.com/office/drawing/2016/5/11/chartex" xmlns:cx6="http://schemas.microsoft.com/office/drawing/2016/5/12/chartex" xmlns:cx7="http://schemas.microsoft.com/office/drawing/2016/5/13/chartex" xmlns:cx8="http://schemas.microsoft.com/office/drawing/2016/5/14/chartex" xmlns:mc="http://schemas.openxmlformats.org/markup-compatibility/2006" xmlns:m="http://schemas.openxmlformats.org/officeDocument/2006/math" xmlns:aink="http://schemas.microsoft.com/office/drawing/2016/ink" xmlns:am3d="http://schemas.microsoft.com/office/drawing/2017/model3d" xmlns:oel="http://schemas.microsoft.com/office/2019/extlst" xmlns:r="http://schemas.openxmlformats.org/officeDocument/2006/relationships" xmlns:wp14="http://schemas.microsoft.com/office/word/2010/wordprocessingDrawing" xmlns:wp="http://schemas.openxmlformats.org/drawingml/2006/wordprocessingDrawing" xmlns:wpg="http://schemas.microsoft.com/office/word/2010/wordprocessingGroup" xmlns:wpi="http://schemas.microsoft.com/office/word/2010/wordprocessingInk" xmlns:wps="http://schemas.microsoft.com/office/word/2010/wordprocessingShape" xmlns:o="urn:schemas-microsoft-com:office:office" xmlns:v="urn:schemas-microsoft-com:vml" xmlns:w10="urn:schemas-microsoft-com:office:word" xmlns:w="http://schemas.openxmlformats.org/wordprocessingml/2006/main" xmlns:w14="http://schemas.microsoft.com/office/word/2010/wordml" xmlns:w15="http://schemas.microsoft.com/office/word/2012/wordml" xmlns:w16cex="http://schemas.microsoft.com/office/word/2018/wordml/cex" xmlns:w16cid="http://schemas.microsoft.com/office/word/2016/wordml/cid" xmlns:w16="http://schemas.microsoft.com/office/word/2018/wordml" xmlns:w16sdtdh="http://schemas.microsoft.com/office/word/2020/wordml/sdtdatahash" xmlns:w16sdtfl="http://schemas.microsoft.com/office/word/2024/wordml/sdtformatlock" xmlns:w16se="http://schemas.microsoft.com/office/word/2015/wordml/symex" xmlns:w16du="http://schemas.microsoft.com/office/word/2023/wordml/word16du" xmlns:wne="http://schemas.microsoft.com/office/word/2006/wordml" mc:Ignorable="w14 w15 w16se w16cid w16 w16cex w16sdtdh w16sdtfl w16du wp14">
   <w:p>
     <w:pPr>
       <w:pStyle w:val="Footer"/>
@@ -6237,7 +6198,7 @@
 </file>
 
 <file path=word/footer3.xml><?xml version="1.0" encoding="utf-8"?>
-<w:ftr xmlns:wpc="http://schemas.microsoft.com/office/word/2010/wordprocessingCanvas" xmlns:cx="http://schemas.microsoft.com/office/drawing/2014/chartex" xmlns:cx1="http://schemas.microsoft.com/office/drawing/2015/9/8/chartex" xmlns:cx2="http://schemas.microsoft.com/office/drawing/2015/10/21/chartex" xmlns:cx3="http://schemas.microsoft.com/office/drawing/2016/5/9/chartex" xmlns:cx4="http://schemas.microsoft.com/office/drawing/2016/5/10/chartex" xmlns:cx5="http://schemas.microsoft.com/office/drawing/2016/5/11/chartex" xmlns:cx6="http://schemas.microsoft.com/office/drawing/2016/5/12/chartex" xmlns:cx7="http://schemas.microsoft.com/office/drawing/2016/5/13/chartex" xmlns:cx8="http://schemas.microsoft.com/office/drawing/2016/5/14/chartex" xmlns:mc="http://schemas.openxmlformats.org/markup-compatibility/2006" xmlns:aink="http://schemas.microsoft.com/office/drawing/2016/ink" xmlns:am3d="http://schemas.microsoft.com/office/drawing/2017/model3d" xmlns:o="urn:schemas-microsoft-com:office:office" xmlns:r="http://schemas.openxmlformats.org/officeDocument/2006/relationships" xmlns:m="http://schemas.openxmlformats.org/officeDocument/2006/math" xmlns:v="urn:schemas-microsoft-com:vml" xmlns:wp14="http://schemas.microsoft.com/office/word/2010/wordprocessingDrawing" xmlns:wp="http://schemas.openxmlformats.org/drawingml/2006/wordprocessingDrawing" xmlns:w10="urn:schemas-microsoft-com:office:word" xmlns:w="http://schemas.openxmlformats.org/wordprocessingml/2006/main" xmlns:w14="http://schemas.microsoft.com/office/word/2010/wordml" xmlns:w15="http://schemas.microsoft.com/office/word/2012/wordml" xmlns:w16cid="http://schemas.microsoft.com/office/word/2016/wordml/cid" xmlns:w16se="http://schemas.microsoft.com/office/word/2015/wordml/symex" xmlns:wpg="http://schemas.microsoft.com/office/word/2010/wordprocessingGroup" xmlns:wpi="http://schemas.microsoft.com/office/word/2010/wordprocessingInk" xmlns:wne="http://schemas.microsoft.com/office/word/2006/wordml" xmlns:wps="http://schemas.microsoft.com/office/word/2010/wordprocessingShape" mc:Ignorable="w14 w15 w16se w16cid wp14">
+<w:ftr xmlns:wpc="http://schemas.microsoft.com/office/word/2010/wordprocessingCanvas" xmlns:cx="http://schemas.microsoft.com/office/drawing/2014/chartex" xmlns:cx1="http://schemas.microsoft.com/office/drawing/2015/9/8/chartex" xmlns:cx2="http://schemas.microsoft.com/office/drawing/2015/10/21/chartex" xmlns:cx3="http://schemas.microsoft.com/office/drawing/2016/5/9/chartex" xmlns:cx4="http://schemas.microsoft.com/office/drawing/2016/5/10/chartex" xmlns:cx5="http://schemas.microsoft.com/office/drawing/2016/5/11/chartex" xmlns:cx6="http://schemas.microsoft.com/office/drawing/2016/5/12/chartex" xmlns:cx7="http://schemas.microsoft.com/office/drawing/2016/5/13/chartex" xmlns:cx8="http://schemas.microsoft.com/office/drawing/2016/5/14/chartex" xmlns:mc="http://schemas.openxmlformats.org/markup-compatibility/2006" xmlns:m="http://schemas.openxmlformats.org/officeDocument/2006/math" xmlns:aink="http://schemas.microsoft.com/office/drawing/2016/ink" xmlns:am3d="http://schemas.microsoft.com/office/drawing/2017/model3d" xmlns:oel="http://schemas.microsoft.com/office/2019/extlst" xmlns:r="http://schemas.openxmlformats.org/officeDocument/2006/relationships" xmlns:wp14="http://schemas.microsoft.com/office/word/2010/wordprocessingDrawing" xmlns:wp="http://schemas.openxmlformats.org/drawingml/2006/wordprocessingDrawing" xmlns:wpg="http://schemas.microsoft.com/office/word/2010/wordprocessingGroup" xmlns:wpi="http://schemas.microsoft.com/office/word/2010/wordprocessingInk" xmlns:wps="http://schemas.microsoft.com/office/word/2010/wordprocessingShape" xmlns:o="urn:schemas-microsoft-com:office:office" xmlns:v="urn:schemas-microsoft-com:vml" xmlns:w10="urn:schemas-microsoft-com:office:word" xmlns:w="http://schemas.openxmlformats.org/wordprocessingml/2006/main" xmlns:w14="http://schemas.microsoft.com/office/word/2010/wordml" xmlns:w15="http://schemas.microsoft.com/office/word/2012/wordml" xmlns:w16cex="http://schemas.microsoft.com/office/word/2018/wordml/cex" xmlns:w16cid="http://schemas.microsoft.com/office/word/2016/wordml/cid" xmlns:w16="http://schemas.microsoft.com/office/word/2018/wordml" xmlns:w16sdtdh="http://schemas.microsoft.com/office/word/2020/wordml/sdtdatahash" xmlns:w16sdtfl="http://schemas.microsoft.com/office/word/2024/wordml/sdtformatlock" xmlns:w16se="http://schemas.microsoft.com/office/word/2015/wordml/symex" xmlns:w16du="http://schemas.microsoft.com/office/word/2023/wordml/word16du" xmlns:wne="http://schemas.microsoft.com/office/word/2006/wordml" mc:Ignorable="w14 w15 w16se w16cid w16 w16cex w16sdtdh w16sdtfl w16du wp14">
   <w:sdt>
     <w:sdtPr>
       <w:id w:val="-2033723439"/>
@@ -6584,7 +6545,7 @@
 </file>
 
 <file path=word/footnotes.xml><?xml version="1.0" encoding="utf-8"?>
-<w:footnotes xmlns:wpc="http://schemas.microsoft.com/office/word/2010/wordprocessingCanvas" xmlns:cx="http://schemas.microsoft.com/office/drawing/2014/chartex" xmlns:cx1="http://schemas.microsoft.com/office/drawing/2015/9/8/chartex" xmlns:cx2="http://schemas.microsoft.com/office/drawing/2015/10/21/chartex" xmlns:cx3="http://schemas.microsoft.com/office/drawing/2016/5/9/chartex" xmlns:cx4="http://schemas.microsoft.com/office/drawing/2016/5/10/chartex" xmlns:cx5="http://schemas.microsoft.com/office/drawing/2016/5/11/chartex" xmlns:cx6="http://schemas.microsoft.com/office/drawing/2016/5/12/chartex" xmlns:cx7="http://schemas.microsoft.com/office/drawing/2016/5/13/chartex" xmlns:cx8="http://schemas.microsoft.com/office/drawing/2016/5/14/chartex" xmlns:mc="http://schemas.openxmlformats.org/markup-compatibility/2006" xmlns:aink="http://schemas.microsoft.com/office/drawing/2016/ink" xmlns:am3d="http://schemas.microsoft.com/office/drawing/2017/model3d" xmlns:o="urn:schemas-microsoft-com:office:office" xmlns:r="http://schemas.openxmlformats.org/officeDocument/2006/relationships" xmlns:m="http://schemas.openxmlformats.org/officeDocument/2006/math" xmlns:v="urn:schemas-microsoft-com:vml" xmlns:wp14="http://schemas.microsoft.com/office/word/2010/wordprocessingDrawing" xmlns:wp="http://schemas.openxmlformats.org/drawingml/2006/wordprocessingDrawing" xmlns:w10="urn:schemas-microsoft-com:office:word" xmlns:w="http://schemas.openxmlformats.org/wordprocessingml/2006/main" xmlns:w14="http://schemas.microsoft.com/office/word/2010/wordml" xmlns:w15="http://schemas.microsoft.com/office/word/2012/wordml" xmlns:w16cid="http://schemas.microsoft.com/office/word/2016/wordml/cid" xmlns:w16se="http://schemas.microsoft.com/office/word/2015/wordml/symex" xmlns:wpg="http://schemas.microsoft.com/office/word/2010/wordprocessingGroup" xmlns:wpi="http://schemas.microsoft.com/office/word/2010/wordprocessingInk" xmlns:wne="http://schemas.microsoft.com/office/word/2006/wordml" xmlns:wps="http://schemas.microsoft.com/office/word/2010/wordprocessingShape" mc:Ignorable="w14 w15 w16se w16cid wp14">
+<w:footnotes xmlns:wpc="http://schemas.microsoft.com/office/word/2010/wordprocessingCanvas" xmlns:cx="http://schemas.microsoft.com/office/drawing/2014/chartex" xmlns:cx1="http://schemas.microsoft.com/office/drawing/2015/9/8/chartex" xmlns:cx2="http://schemas.microsoft.com/office/drawing/2015/10/21/chartex" xmlns:cx3="http://schemas.microsoft.com/office/drawing/2016/5/9/chartex" xmlns:cx4="http://schemas.microsoft.com/office/drawing/2016/5/10/chartex" xmlns:cx5="http://schemas.microsoft.com/office/drawing/2016/5/11/chartex" xmlns:cx6="http://schemas.microsoft.com/office/drawing/2016/5/12/chartex" xmlns:cx7="http://schemas.microsoft.com/office/drawing/2016/5/13/chartex" xmlns:cx8="http://schemas.microsoft.com/office/drawing/2016/5/14/chartex" xmlns:mc="http://schemas.openxmlformats.org/markup-compatibility/2006" xmlns:m="http://schemas.openxmlformats.org/officeDocument/2006/math" xmlns:aink="http://schemas.microsoft.com/office/drawing/2016/ink" xmlns:am3d="http://schemas.microsoft.com/office/drawing/2017/model3d" xmlns:oel="http://schemas.microsoft.com/office/2019/extlst" xmlns:r="http://schemas.openxmlformats.org/officeDocument/2006/relationships" xmlns:wp14="http://schemas.microsoft.com/office/word/2010/wordprocessingDrawing" xmlns:wp="http://schemas.openxmlformats.org/drawingml/2006/wordprocessingDrawing" xmlns:wpg="http://schemas.microsoft.com/office/word/2010/wordprocessingGroup" xmlns:wpi="http://schemas.microsoft.com/office/word/2010/wordprocessingInk" xmlns:wps="http://schemas.microsoft.com/office/word/2010/wordprocessingShape" xmlns:o="urn:schemas-microsoft-com:office:office" xmlns:v="urn:schemas-microsoft-com:vml" xmlns:w10="urn:schemas-microsoft-com:office:word" xmlns:w="http://schemas.openxmlformats.org/wordprocessingml/2006/main" xmlns:w14="http://schemas.microsoft.com/office/word/2010/wordml" xmlns:w15="http://schemas.microsoft.com/office/word/2012/wordml" xmlns:w16cex="http://schemas.microsoft.com/office/word/2018/wordml/cex" xmlns:w16cid="http://schemas.microsoft.com/office/word/2016/wordml/cid" xmlns:w16="http://schemas.microsoft.com/office/word/2018/wordml" xmlns:w16sdtdh="http://schemas.microsoft.com/office/word/2020/wordml/sdtdatahash" xmlns:w16sdtfl="http://schemas.microsoft.com/office/word/2024/wordml/sdtformatlock" xmlns:w16se="http://schemas.microsoft.com/office/word/2015/wordml/symex" xmlns:w16du="http://schemas.microsoft.com/office/word/2023/wordml/word16du" xmlns:wne="http://schemas.microsoft.com/office/word/2006/wordml" mc:Ignorable="w14 w15 w16se w16cid w16 w16cex w16sdtdh w16sdtfl w16du wp14">
   <w:footnote w:type="separator" w:id="-1">
     <w:p>
       <w:pPr>
@@ -6609,7 +6570,7 @@
 </file>
 
 <file path=word/header1.xml><?xml version="1.0" encoding="utf-8"?>
-<w:hdr xmlns:wpc="http://schemas.microsoft.com/office/word/2010/wordprocessingCanvas" xmlns:cx="http://schemas.microsoft.com/office/drawing/2014/chartex" xmlns:cx1="http://schemas.microsoft.com/office/drawing/2015/9/8/chartex" xmlns:cx2="http://schemas.microsoft.com/office/drawing/2015/10/21/chartex" xmlns:cx3="http://schemas.microsoft.com/office/drawing/2016/5/9/chartex" xmlns:cx4="http://schemas.microsoft.com/office/drawing/2016/5/10/chartex" xmlns:cx5="http://schemas.microsoft.com/office/drawing/2016/5/11/chartex" xmlns:cx6="http://schemas.microsoft.com/office/drawing/2016/5/12/chartex" xmlns:cx7="http://schemas.microsoft.com/office/drawing/2016/5/13/chartex" xmlns:cx8="http://schemas.microsoft.com/office/drawing/2016/5/14/chartex" xmlns:mc="http://schemas.openxmlformats.org/markup-compatibility/2006" xmlns:aink="http://schemas.microsoft.com/office/drawing/2016/ink" xmlns:am3d="http://schemas.microsoft.com/office/drawing/2017/model3d" xmlns:o="urn:schemas-microsoft-com:office:office" xmlns:r="http://schemas.openxmlformats.org/officeDocument/2006/relationships" xmlns:m="http://schemas.openxmlformats.org/officeDocument/2006/math" xmlns:v="urn:schemas-microsoft-com:vml" xmlns:wp14="http://schemas.microsoft.com/office/word/2010/wordprocessingDrawing" xmlns:wp="http://schemas.openxmlformats.org/drawingml/2006/wordprocessingDrawing" xmlns:w10="urn:schemas-microsoft-com:office:word" xmlns:w="http://schemas.openxmlformats.org/wordprocessingml/2006/main" xmlns:w14="http://schemas.microsoft.com/office/word/2010/wordml" xmlns:w15="http://schemas.microsoft.com/office/word/2012/wordml" xmlns:w16cid="http://schemas.microsoft.com/office/word/2016/wordml/cid" xmlns:w16se="http://schemas.microsoft.com/office/word/2015/wordml/symex" xmlns:wpg="http://schemas.microsoft.com/office/word/2010/wordprocessingGroup" xmlns:wpi="http://schemas.microsoft.com/office/word/2010/wordprocessingInk" xmlns:wne="http://schemas.microsoft.com/office/word/2006/wordml" xmlns:wps="http://schemas.microsoft.com/office/word/2010/wordprocessingShape" mc:Ignorable="w14 w15 w16se w16cid wp14">
+<w:hdr xmlns:wpc="http://schemas.microsoft.com/office/word/2010/wordprocessingCanvas" xmlns:cx="http://schemas.microsoft.com/office/drawing/2014/chartex" xmlns:cx1="http://schemas.microsoft.com/office/drawing/2015/9/8/chartex" xmlns:cx2="http://schemas.microsoft.com/office/drawing/2015/10/21/chartex" xmlns:cx3="http://schemas.microsoft.com/office/drawing/2016/5/9/chartex" xmlns:cx4="http://schemas.microsoft.com/office/drawing/2016/5/10/chartex" xmlns:cx5="http://schemas.microsoft.com/office/drawing/2016/5/11/chartex" xmlns:cx6="http://schemas.microsoft.com/office/drawing/2016/5/12/chartex" xmlns:cx7="http://schemas.microsoft.com/office/drawing/2016/5/13/chartex" xmlns:cx8="http://schemas.microsoft.com/office/drawing/2016/5/14/chartex" xmlns:mc="http://schemas.openxmlformats.org/markup-compatibility/2006" xmlns:m="http://schemas.openxmlformats.org/officeDocument/2006/math" xmlns:aink="http://schemas.microsoft.com/office/drawing/2016/ink" xmlns:am3d="http://schemas.microsoft.com/office/drawing/2017/model3d" xmlns:oel="http://schemas.microsoft.com/office/2019/extlst" xmlns:r="http://schemas.openxmlformats.org/officeDocument/2006/relationships" xmlns:wp14="http://schemas.microsoft.com/office/word/2010/wordprocessingDrawing" xmlns:wp="http://schemas.openxmlformats.org/drawingml/2006/wordprocessingDrawing" xmlns:wpg="http://schemas.microsoft.com/office/word/2010/wordprocessingGroup" xmlns:wpi="http://schemas.microsoft.com/office/word/2010/wordprocessingInk" xmlns:wps="http://schemas.microsoft.com/office/word/2010/wordprocessingShape" xmlns:o="urn:schemas-microsoft-com:office:office" xmlns:v="urn:schemas-microsoft-com:vml" xmlns:w10="urn:schemas-microsoft-com:office:word" xmlns:w="http://schemas.openxmlformats.org/wordprocessingml/2006/main" xmlns:w14="http://schemas.microsoft.com/office/word/2010/wordml" xmlns:w15="http://schemas.microsoft.com/office/word/2012/wordml" xmlns:w16cex="http://schemas.microsoft.com/office/word/2018/wordml/cex" xmlns:w16cid="http://schemas.microsoft.com/office/word/2016/wordml/cid" xmlns:w16="http://schemas.microsoft.com/office/word/2018/wordml" xmlns:w16sdtdh="http://schemas.microsoft.com/office/word/2020/wordml/sdtdatahash" xmlns:w16sdtfl="http://schemas.microsoft.com/office/word/2024/wordml/sdtformatlock" xmlns:w16se="http://schemas.microsoft.com/office/word/2015/wordml/symex" xmlns:w16du="http://schemas.microsoft.com/office/word/2023/wordml/word16du" xmlns:wne="http://schemas.microsoft.com/office/word/2006/wordml" mc:Ignorable="w14 w15 w16se w16cid w16 w16cex w16sdtdh w16sdtfl w16du wp14">
   <w:p>
     <w:pPr>
       <w:pStyle w:val="Header"/>
@@ -6618,7 +6579,7 @@
       <w:rPr>
         <w:noProof/>
       </w:rPr>
-      <w:pict w14:anchorId="71B626B9">
+      <w:pict w14:anchorId="5102D46B">
         <v:shapetype id="_x0000_t136" coordsize="21600,21600" o:spt="136" adj="10800" path="m@7,l@8,m@5,21600l@6,21600e">
           <v:formulas>
             <v:f eqn="sum #0 0 10800"/>
@@ -6643,7 +6604,7 @@
           </v:handles>
           <o:lock v:ext="edit" text="t" shapetype="t"/>
         </v:shapetype>
-        <v:shape id="_x0000_s2080" type="#_x0000_t136" alt="" style="position:absolute;margin-left:0;margin-top:0;width:410.05pt;height:249.6pt;rotation:315;z-index:-251650027;mso-wrap-edited:f;mso-width-percent:0;mso-height-percent:0;mso-position-horizontal:center;mso-position-horizontal-relative:margin;mso-position-vertical:center;mso-position-vertical-relative:margin;mso-width-percent:0;mso-height-percent:0" o:allowincell="f" fillcolor="#7f7f7f [1612]" stroked="f">
+        <v:shape id="_x0000_s1056" type="#_x0000_t136" alt="" style="position:absolute;margin-left:0;margin-top:0;width:410.05pt;height:249.6pt;rotation:315;z-index:-251650027;mso-wrap-edited:f;mso-width-percent:0;mso-height-percent:0;mso-position-horizontal:center;mso-position-horizontal-relative:margin;mso-position-vertical:center;mso-position-vertical-relative:margin;mso-width-percent:0;mso-height-percent:0" o:allowincell="f" fillcolor="#7f7f7f [1612]" stroked="f">
           <v:fill opacity="6553f"/>
           <v:textpath style="font-family:&quot;Helvetica Neue&quot;;font-size:1pt" string="JGS"/>
           <w10:wrap anchorx="margin" anchory="margin"/>
@@ -6654,7 +6615,7 @@
       <w:rPr>
         <w:noProof/>
       </w:rPr>
-      <w:pict w14:anchorId="734F39B8">
+      <w:pict w14:anchorId="0CEA5E22">
         <v:shapetype id="_x0000_t75" coordsize="21600,21600" o:spt="75" o:preferrelative="t" path="m@4@5l@4@11@9@11@9@5xe" filled="f" stroked="f">
           <v:stroke joinstyle="miter"/>
           <v:formulas>
@@ -6674,7 +6635,7 @@
           <v:path o:extrusionok="f" gradientshapeok="t" o:connecttype="rect"/>
           <o:lock v:ext="edit" aspectratio="t"/>
         </v:shapetype>
-        <v:shape id="_x0000_s2079" type="#_x0000_t75" alt="" style="position:absolute;margin-left:0;margin-top:0;width:459pt;height:594pt;z-index:-251658228;mso-wrap-edited:f;mso-width-percent:0;mso-height-percent:0;mso-position-horizontal:center;mso-position-horizontal-relative:margin;mso-position-vertical:center;mso-position-vertical-relative:margin;mso-width-percent:0;mso-height-percent:0" o:allowincell="f">
+        <v:shape id="_x0000_s1055" type="#_x0000_t75" alt="" style="position:absolute;margin-left:0;margin-top:0;width:459pt;height:594pt;z-index:-251658228;mso-wrap-edited:f;mso-width-percent:0;mso-height-percent:0;mso-position-horizontal:center;mso-position-horizontal-relative:margin;mso-position-vertical:center;mso-position-vertical-relative:margin;mso-width-percent:0;mso-height-percent:0" o:allowincell="f">
           <v:imagedata r:id="rId1" o:title="doc-front-page"/>
           <w10:wrap anchorx="margin" anchory="margin"/>
         </v:shape>
@@ -6684,8 +6645,8 @@
       <w:rPr>
         <w:noProof/>
       </w:rPr>
-      <w:pict w14:anchorId="2C94049B">
-        <v:shape id="_x0000_s2078" type="#_x0000_t75" alt="" style="position:absolute;margin-left:0;margin-top:0;width:459pt;height:594pt;z-index:-251658237;mso-wrap-edited:f;mso-width-percent:0;mso-height-percent:0;mso-position-horizontal:center;mso-position-horizontal-relative:margin;mso-position-vertical:center;mso-position-vertical-relative:margin;mso-width-percent:0;mso-height-percent:0" o:allowincell="f">
+      <w:pict w14:anchorId="6D3FF9D1">
+        <v:shape id="_x0000_s1054" type="#_x0000_t75" alt="" style="position:absolute;margin-left:0;margin-top:0;width:459pt;height:594pt;z-index:-251658237;mso-wrap-edited:f;mso-width-percent:0;mso-height-percent:0;mso-position-horizontal:center;mso-position-horizontal-relative:margin;mso-position-vertical:center;mso-position-vertical-relative:margin;mso-width-percent:0;mso-height-percent:0" o:allowincell="f">
           <v:imagedata r:id="rId1" o:title="doc-front-page"/>
           <w10:wrap anchorx="margin" anchory="margin"/>
         </v:shape>
@@ -6696,7 +6657,7 @@
 </file>
 
 <file path=word/header10.xml><?xml version="1.0" encoding="utf-8"?>
-<w:hdr xmlns:wpc="http://schemas.microsoft.com/office/word/2010/wordprocessingCanvas" xmlns:cx="http://schemas.microsoft.com/office/drawing/2014/chartex" xmlns:cx1="http://schemas.microsoft.com/office/drawing/2015/9/8/chartex" xmlns:cx2="http://schemas.microsoft.com/office/drawing/2015/10/21/chartex" xmlns:cx3="http://schemas.microsoft.com/office/drawing/2016/5/9/chartex" xmlns:cx4="http://schemas.microsoft.com/office/drawing/2016/5/10/chartex" xmlns:cx5="http://schemas.microsoft.com/office/drawing/2016/5/11/chartex" xmlns:cx6="http://schemas.microsoft.com/office/drawing/2016/5/12/chartex" xmlns:cx7="http://schemas.microsoft.com/office/drawing/2016/5/13/chartex" xmlns:cx8="http://schemas.microsoft.com/office/drawing/2016/5/14/chartex" xmlns:mc="http://schemas.openxmlformats.org/markup-compatibility/2006" xmlns:aink="http://schemas.microsoft.com/office/drawing/2016/ink" xmlns:am3d="http://schemas.microsoft.com/office/drawing/2017/model3d" xmlns:o="urn:schemas-microsoft-com:office:office" xmlns:r="http://schemas.openxmlformats.org/officeDocument/2006/relationships" xmlns:m="http://schemas.openxmlformats.org/officeDocument/2006/math" xmlns:v="urn:schemas-microsoft-com:vml" xmlns:wp14="http://schemas.microsoft.com/office/word/2010/wordprocessingDrawing" xmlns:wp="http://schemas.openxmlformats.org/drawingml/2006/wordprocessingDrawing" xmlns:w10="urn:schemas-microsoft-com:office:word" xmlns:w="http://schemas.openxmlformats.org/wordprocessingml/2006/main" xmlns:w14="http://schemas.microsoft.com/office/word/2010/wordml" xmlns:w15="http://schemas.microsoft.com/office/word/2012/wordml" xmlns:w16cid="http://schemas.microsoft.com/office/word/2016/wordml/cid" xmlns:w16se="http://schemas.microsoft.com/office/word/2015/wordml/symex" xmlns:wpg="http://schemas.microsoft.com/office/word/2010/wordprocessingGroup" xmlns:wpi="http://schemas.microsoft.com/office/word/2010/wordprocessingInk" xmlns:wne="http://schemas.microsoft.com/office/word/2006/wordml" xmlns:wps="http://schemas.microsoft.com/office/word/2010/wordprocessingShape" mc:Ignorable="w14 w15 w16se w16cid wp14">
+<w:hdr xmlns:wpc="http://schemas.microsoft.com/office/word/2010/wordprocessingCanvas" xmlns:cx="http://schemas.microsoft.com/office/drawing/2014/chartex" xmlns:cx1="http://schemas.microsoft.com/office/drawing/2015/9/8/chartex" xmlns:cx2="http://schemas.microsoft.com/office/drawing/2015/10/21/chartex" xmlns:cx3="http://schemas.microsoft.com/office/drawing/2016/5/9/chartex" xmlns:cx4="http://schemas.microsoft.com/office/drawing/2016/5/10/chartex" xmlns:cx5="http://schemas.microsoft.com/office/drawing/2016/5/11/chartex" xmlns:cx6="http://schemas.microsoft.com/office/drawing/2016/5/12/chartex" xmlns:cx7="http://schemas.microsoft.com/office/drawing/2016/5/13/chartex" xmlns:cx8="http://schemas.microsoft.com/office/drawing/2016/5/14/chartex" xmlns:mc="http://schemas.openxmlformats.org/markup-compatibility/2006" xmlns:m="http://schemas.openxmlformats.org/officeDocument/2006/math" xmlns:aink="http://schemas.microsoft.com/office/drawing/2016/ink" xmlns:am3d="http://schemas.microsoft.com/office/drawing/2017/model3d" xmlns:oel="http://schemas.microsoft.com/office/2019/extlst" xmlns:r="http://schemas.openxmlformats.org/officeDocument/2006/relationships" xmlns:wp14="http://schemas.microsoft.com/office/word/2010/wordprocessingDrawing" xmlns:wp="http://schemas.openxmlformats.org/drawingml/2006/wordprocessingDrawing" xmlns:wpg="http://schemas.microsoft.com/office/word/2010/wordprocessingGroup" xmlns:wpi="http://schemas.microsoft.com/office/word/2010/wordprocessingInk" xmlns:wps="http://schemas.microsoft.com/office/word/2010/wordprocessingShape" xmlns:o="urn:schemas-microsoft-com:office:office" xmlns:v="urn:schemas-microsoft-com:vml" xmlns:w10="urn:schemas-microsoft-com:office:word" xmlns:w="http://schemas.openxmlformats.org/wordprocessingml/2006/main" xmlns:w14="http://schemas.microsoft.com/office/word/2010/wordml" xmlns:w15="http://schemas.microsoft.com/office/word/2012/wordml" xmlns:w16cex="http://schemas.microsoft.com/office/word/2018/wordml/cex" xmlns:w16cid="http://schemas.microsoft.com/office/word/2016/wordml/cid" xmlns:w16="http://schemas.microsoft.com/office/word/2018/wordml" xmlns:w16sdtdh="http://schemas.microsoft.com/office/word/2020/wordml/sdtdatahash" xmlns:w16sdtfl="http://schemas.microsoft.com/office/word/2024/wordml/sdtformatlock" xmlns:w16se="http://schemas.microsoft.com/office/word/2015/wordml/symex" xmlns:w16du="http://schemas.microsoft.com/office/word/2023/wordml/word16du" xmlns:wne="http://schemas.microsoft.com/office/word/2006/wordml" mc:Ignorable="w14 w15 w16se w16cid w16 w16cex w16sdtdh w16sdtfl w16du wp14">
   <w:p>
     <w:pPr>
       <w:pStyle w:val="Header"/>
@@ -6705,7 +6666,7 @@
       <w:rPr>
         <w:noProof/>
       </w:rPr>
-      <w:pict w14:anchorId="18C44E70">
+      <w:pict w14:anchorId="6DFA0FE1">
         <v:shapetype id="_x0000_t136" coordsize="21600,21600" o:spt="136" adj="10800" path="m@7,l@8,m@5,21600l@6,21600e">
           <v:formulas>
             <v:f eqn="sum #0 0 10800"/>
@@ -6730,7 +6691,7 @@
           </v:handles>
           <o:lock v:ext="edit" text="t" shapetype="t"/>
         </v:shapetype>
-        <v:shape id="_x0000_s2060" type="#_x0000_t136" alt="" style="position:absolute;margin-left:0;margin-top:0;width:410.05pt;height:249.6pt;rotation:315;z-index:-251613163;mso-wrap-edited:f;mso-width-percent:0;mso-height-percent:0;mso-position-horizontal:center;mso-position-horizontal-relative:margin;mso-position-vertical:center;mso-position-vertical-relative:margin;mso-width-percent:0;mso-height-percent:0" o:allowincell="f" fillcolor="#7f7f7f [1612]" stroked="f">
+        <v:shape id="_x0000_s1036" type="#_x0000_t136" alt="" style="position:absolute;margin-left:0;margin-top:0;width:410.05pt;height:249.6pt;rotation:315;z-index:-251613163;mso-wrap-edited:f;mso-width-percent:0;mso-height-percent:0;mso-position-horizontal:center;mso-position-horizontal-relative:margin;mso-position-vertical:center;mso-position-vertical-relative:margin;mso-width-percent:0;mso-height-percent:0" o:allowincell="f" fillcolor="#7f7f7f [1612]" stroked="f">
           <v:fill opacity="6553f"/>
           <v:textpath style="font-family:&quot;Helvetica Neue&quot;;font-size:1pt" string="JGS"/>
           <w10:wrap anchorx="margin" anchory="margin"/>
@@ -6741,7 +6702,7 @@
       <w:rPr>
         <w:noProof/>
       </w:rPr>
-      <w:pict w14:anchorId="3DD72333">
+      <w:pict w14:anchorId="3E82BF63">
         <v:shapetype id="_x0000_t75" coordsize="21600,21600" o:spt="75" o:preferrelative="t" path="m@4@5l@4@11@9@11@9@5xe" filled="f" stroked="f">
           <v:stroke joinstyle="miter"/>
           <v:formulas>
@@ -6761,7 +6722,7 @@
           <v:path o:extrusionok="f" gradientshapeok="t" o:connecttype="rect"/>
           <o:lock v:ext="edit" aspectratio="t"/>
         </v:shapetype>
-        <v:shape id="_x0000_s2059" type="#_x0000_t75" alt="" style="position:absolute;margin-left:0;margin-top:0;width:459pt;height:594pt;z-index:-251658223;mso-wrap-edited:f;mso-width-percent:0;mso-height-percent:0;mso-position-horizontal:center;mso-position-horizontal-relative:margin;mso-position-vertical:center;mso-position-vertical-relative:margin;mso-width-percent:0;mso-height-percent:0" o:allowincell="f">
+        <v:shape id="_x0000_s1035" type="#_x0000_t75" alt="" style="position:absolute;margin-left:0;margin-top:0;width:459pt;height:594pt;z-index:-251658223;mso-wrap-edited:f;mso-width-percent:0;mso-height-percent:0;mso-position-horizontal:center;mso-position-horizontal-relative:margin;mso-position-vertical:center;mso-position-vertical-relative:margin;mso-width-percent:0;mso-height-percent:0" o:allowincell="f">
           <v:imagedata r:id="rId1" o:title="doc-front-page"/>
           <w10:wrap anchorx="margin" anchory="margin"/>
         </v:shape>
@@ -6771,8 +6732,8 @@
       <w:rPr>
         <w:noProof/>
       </w:rPr>
-      <w:pict w14:anchorId="19C704B3">
-        <v:shape id="_x0000_s2058" type="#_x0000_t75" alt="" style="position:absolute;margin-left:0;margin-top:0;width:459pt;height:594pt;z-index:-251658232;mso-wrap-edited:f;mso-width-percent:0;mso-height-percent:0;mso-position-horizontal:center;mso-position-horizontal-relative:margin;mso-position-vertical:center;mso-position-vertical-relative:margin;mso-width-percent:0;mso-height-percent:0" o:allowincell="f">
+      <w:pict w14:anchorId="7C7675EE">
+        <v:shape id="_x0000_s1034" type="#_x0000_t75" alt="" style="position:absolute;margin-left:0;margin-top:0;width:459pt;height:594pt;z-index:-251658232;mso-wrap-edited:f;mso-width-percent:0;mso-height-percent:0;mso-position-horizontal:center;mso-position-horizontal-relative:margin;mso-position-vertical:center;mso-position-vertical-relative:margin;mso-width-percent:0;mso-height-percent:0" o:allowincell="f">
           <v:imagedata r:id="rId1" o:title="doc-front-page"/>
           <w10:wrap anchorx="margin" anchory="margin"/>
         </v:shape>
@@ -6783,7 +6744,7 @@
 </file>
 
 <file path=word/header11.xml><?xml version="1.0" encoding="utf-8"?>
-<w:hdr xmlns:wpc="http://schemas.microsoft.com/office/word/2010/wordprocessingCanvas" xmlns:cx="http://schemas.microsoft.com/office/drawing/2014/chartex" xmlns:cx1="http://schemas.microsoft.com/office/drawing/2015/9/8/chartex" xmlns:cx2="http://schemas.microsoft.com/office/drawing/2015/10/21/chartex" xmlns:cx3="http://schemas.microsoft.com/office/drawing/2016/5/9/chartex" xmlns:cx4="http://schemas.microsoft.com/office/drawing/2016/5/10/chartex" xmlns:cx5="http://schemas.microsoft.com/office/drawing/2016/5/11/chartex" xmlns:cx6="http://schemas.microsoft.com/office/drawing/2016/5/12/chartex" xmlns:cx7="http://schemas.microsoft.com/office/drawing/2016/5/13/chartex" xmlns:cx8="http://schemas.microsoft.com/office/drawing/2016/5/14/chartex" xmlns:mc="http://schemas.openxmlformats.org/markup-compatibility/2006" xmlns:aink="http://schemas.microsoft.com/office/drawing/2016/ink" xmlns:am3d="http://schemas.microsoft.com/office/drawing/2017/model3d" xmlns:o="urn:schemas-microsoft-com:office:office" xmlns:r="http://schemas.openxmlformats.org/officeDocument/2006/relationships" xmlns:m="http://schemas.openxmlformats.org/officeDocument/2006/math" xmlns:v="urn:schemas-microsoft-com:vml" xmlns:wp14="http://schemas.microsoft.com/office/word/2010/wordprocessingDrawing" xmlns:wp="http://schemas.openxmlformats.org/drawingml/2006/wordprocessingDrawing" xmlns:w10="urn:schemas-microsoft-com:office:word" xmlns:w="http://schemas.openxmlformats.org/wordprocessingml/2006/main" xmlns:w14="http://schemas.microsoft.com/office/word/2010/wordml" xmlns:w15="http://schemas.microsoft.com/office/word/2012/wordml" xmlns:w16cid="http://schemas.microsoft.com/office/word/2016/wordml/cid" xmlns:w16se="http://schemas.microsoft.com/office/word/2015/wordml/symex" xmlns:wpg="http://schemas.microsoft.com/office/word/2010/wordprocessingGroup" xmlns:wpi="http://schemas.microsoft.com/office/word/2010/wordprocessingInk" xmlns:wne="http://schemas.microsoft.com/office/word/2006/wordml" xmlns:wps="http://schemas.microsoft.com/office/word/2010/wordprocessingShape" mc:Ignorable="w14 w15 w16se w16cid wp14">
+<w:hdr xmlns:wpc="http://schemas.microsoft.com/office/word/2010/wordprocessingCanvas" xmlns:cx="http://schemas.microsoft.com/office/drawing/2014/chartex" xmlns:cx1="http://schemas.microsoft.com/office/drawing/2015/9/8/chartex" xmlns:cx2="http://schemas.microsoft.com/office/drawing/2015/10/21/chartex" xmlns:cx3="http://schemas.microsoft.com/office/drawing/2016/5/9/chartex" xmlns:cx4="http://schemas.microsoft.com/office/drawing/2016/5/10/chartex" xmlns:cx5="http://schemas.microsoft.com/office/drawing/2016/5/11/chartex" xmlns:cx6="http://schemas.microsoft.com/office/drawing/2016/5/12/chartex" xmlns:cx7="http://schemas.microsoft.com/office/drawing/2016/5/13/chartex" xmlns:cx8="http://schemas.microsoft.com/office/drawing/2016/5/14/chartex" xmlns:mc="http://schemas.openxmlformats.org/markup-compatibility/2006" xmlns:m="http://schemas.openxmlformats.org/officeDocument/2006/math" xmlns:aink="http://schemas.microsoft.com/office/drawing/2016/ink" xmlns:am3d="http://schemas.microsoft.com/office/drawing/2017/model3d" xmlns:oel="http://schemas.microsoft.com/office/2019/extlst" xmlns:r="http://schemas.openxmlformats.org/officeDocument/2006/relationships" xmlns:wp14="http://schemas.microsoft.com/office/word/2010/wordprocessingDrawing" xmlns:wp="http://schemas.openxmlformats.org/drawingml/2006/wordprocessingDrawing" xmlns:wpg="http://schemas.microsoft.com/office/word/2010/wordprocessingGroup" xmlns:wpi="http://schemas.microsoft.com/office/word/2010/wordprocessingInk" xmlns:wps="http://schemas.microsoft.com/office/word/2010/wordprocessingShape" xmlns:o="urn:schemas-microsoft-com:office:office" xmlns:v="urn:schemas-microsoft-com:vml" xmlns:w10="urn:schemas-microsoft-com:office:word" xmlns:w="http://schemas.openxmlformats.org/wordprocessingml/2006/main" xmlns:w14="http://schemas.microsoft.com/office/word/2010/wordml" xmlns:w15="http://schemas.microsoft.com/office/word/2012/wordml" xmlns:w16cex="http://schemas.microsoft.com/office/word/2018/wordml/cex" xmlns:w16cid="http://schemas.microsoft.com/office/word/2016/wordml/cid" xmlns:w16="http://schemas.microsoft.com/office/word/2018/wordml" xmlns:w16sdtdh="http://schemas.microsoft.com/office/word/2020/wordml/sdtdatahash" xmlns:w16sdtfl="http://schemas.microsoft.com/office/word/2024/wordml/sdtformatlock" xmlns:w16se="http://schemas.microsoft.com/office/word/2015/wordml/symex" xmlns:w16du="http://schemas.microsoft.com/office/word/2023/wordml/word16du" xmlns:wne="http://schemas.microsoft.com/office/word/2006/wordml" mc:Ignorable="w14 w15 w16se w16cid w16 w16cex w16sdtdh w16sdtfl w16du wp14">
   <w:p>
     <w:pPr>
       <w:pStyle w:val="Header"/>
@@ -6792,7 +6753,7 @@
       <w:rPr>
         <w:noProof/>
       </w:rPr>
-      <w:pict w14:anchorId="2E3FD6E4">
+      <w:pict w14:anchorId="56D8C066">
         <v:shapetype id="_x0000_t136" coordsize="21600,21600" o:spt="136" adj="10800" path="m@7,l@8,m@5,21600l@6,21600e">
           <v:formulas>
             <v:f eqn="sum #0 0 10800"/>
@@ -6817,7 +6778,7 @@
           </v:handles>
           <o:lock v:ext="edit" text="t" shapetype="t"/>
         </v:shapetype>
-        <v:shape id="_x0000_s2057" type="#_x0000_t136" alt="" style="position:absolute;margin-left:0;margin-top:0;width:410.05pt;height:249.6pt;rotation:315;z-index:-251609067;mso-wrap-edited:f;mso-width-percent:0;mso-height-percent:0;mso-position-horizontal:center;mso-position-horizontal-relative:margin;mso-position-vertical:center;mso-position-vertical-relative:margin;mso-width-percent:0;mso-height-percent:0" o:allowincell="f" fillcolor="#7f7f7f [1612]" stroked="f">
+        <v:shape id="_x0000_s1033" type="#_x0000_t136" alt="" style="position:absolute;margin-left:0;margin-top:0;width:410.05pt;height:249.6pt;rotation:315;z-index:-251609067;mso-wrap-edited:f;mso-width-percent:0;mso-height-percent:0;mso-position-horizontal:center;mso-position-horizontal-relative:margin;mso-position-vertical:center;mso-position-vertical-relative:margin;mso-width-percent:0;mso-height-percent:0" o:allowincell="f" fillcolor="#7f7f7f [1612]" stroked="f">
           <v:fill opacity="6553f"/>
           <v:textpath style="font-family:&quot;Helvetica Neue&quot;;font-size:1pt" string="JGS"/>
           <w10:wrap anchorx="margin" anchory="margin"/>
@@ -6829,7 +6790,7 @@
 </file>
 
 <file path=word/header12.xml><?xml version="1.0" encoding="utf-8"?>
-<w:hdr xmlns:wpc="http://schemas.microsoft.com/office/word/2010/wordprocessingCanvas" xmlns:cx="http://schemas.microsoft.com/office/drawing/2014/chartex" xmlns:cx1="http://schemas.microsoft.com/office/drawing/2015/9/8/chartex" xmlns:cx2="http://schemas.microsoft.com/office/drawing/2015/10/21/chartex" xmlns:cx3="http://schemas.microsoft.com/office/drawing/2016/5/9/chartex" xmlns:cx4="http://schemas.microsoft.com/office/drawing/2016/5/10/chartex" xmlns:cx5="http://schemas.microsoft.com/office/drawing/2016/5/11/chartex" xmlns:cx6="http://schemas.microsoft.com/office/drawing/2016/5/12/chartex" xmlns:cx7="http://schemas.microsoft.com/office/drawing/2016/5/13/chartex" xmlns:cx8="http://schemas.microsoft.com/office/drawing/2016/5/14/chartex" xmlns:mc="http://schemas.openxmlformats.org/markup-compatibility/2006" xmlns:aink="http://schemas.microsoft.com/office/drawing/2016/ink" xmlns:am3d="http://schemas.microsoft.com/office/drawing/2017/model3d" xmlns:o="urn:schemas-microsoft-com:office:office" xmlns:r="http://schemas.openxmlformats.org/officeDocument/2006/relationships" xmlns:m="http://schemas.openxmlformats.org/officeDocument/2006/math" xmlns:v="urn:schemas-microsoft-com:vml" xmlns:wp14="http://schemas.microsoft.com/office/word/2010/wordprocessingDrawing" xmlns:wp="http://schemas.openxmlformats.org/drawingml/2006/wordprocessingDrawing" xmlns:w10="urn:schemas-microsoft-com:office:word" xmlns:w="http://schemas.openxmlformats.org/wordprocessingml/2006/main" xmlns:w14="http://schemas.microsoft.com/office/word/2010/wordml" xmlns:w15="http://schemas.microsoft.com/office/word/2012/wordml" xmlns:w16cid="http://schemas.microsoft.com/office/word/2016/wordml/cid" xmlns:w16se="http://schemas.microsoft.com/office/word/2015/wordml/symex" xmlns:wpg="http://schemas.microsoft.com/office/word/2010/wordprocessingGroup" xmlns:wpi="http://schemas.microsoft.com/office/word/2010/wordprocessingInk" xmlns:wne="http://schemas.microsoft.com/office/word/2006/wordml" xmlns:wps="http://schemas.microsoft.com/office/word/2010/wordprocessingShape" mc:Ignorable="w14 w15 w16se w16cid wp14">
+<w:hdr xmlns:wpc="http://schemas.microsoft.com/office/word/2010/wordprocessingCanvas" xmlns:cx="http://schemas.microsoft.com/office/drawing/2014/chartex" xmlns:cx1="http://schemas.microsoft.com/office/drawing/2015/9/8/chartex" xmlns:cx2="http://schemas.microsoft.com/office/drawing/2015/10/21/chartex" xmlns:cx3="http://schemas.microsoft.com/office/drawing/2016/5/9/chartex" xmlns:cx4="http://schemas.microsoft.com/office/drawing/2016/5/10/chartex" xmlns:cx5="http://schemas.microsoft.com/office/drawing/2016/5/11/chartex" xmlns:cx6="http://schemas.microsoft.com/office/drawing/2016/5/12/chartex" xmlns:cx7="http://schemas.microsoft.com/office/drawing/2016/5/13/chartex" xmlns:cx8="http://schemas.microsoft.com/office/drawing/2016/5/14/chartex" xmlns:mc="http://schemas.openxmlformats.org/markup-compatibility/2006" xmlns:m="http://schemas.openxmlformats.org/officeDocument/2006/math" xmlns:aink="http://schemas.microsoft.com/office/drawing/2016/ink" xmlns:am3d="http://schemas.microsoft.com/office/drawing/2017/model3d" xmlns:oel="http://schemas.microsoft.com/office/2019/extlst" xmlns:r="http://schemas.openxmlformats.org/officeDocument/2006/relationships" xmlns:wp14="http://schemas.microsoft.com/office/word/2010/wordprocessingDrawing" xmlns:wp="http://schemas.openxmlformats.org/drawingml/2006/wordprocessingDrawing" xmlns:wpg="http://schemas.microsoft.com/office/word/2010/wordprocessingGroup" xmlns:wpi="http://schemas.microsoft.com/office/word/2010/wordprocessingInk" xmlns:wps="http://schemas.microsoft.com/office/word/2010/wordprocessingShape" xmlns:o="urn:schemas-microsoft-com:office:office" xmlns:v="urn:schemas-microsoft-com:vml" xmlns:w10="urn:schemas-microsoft-com:office:word" xmlns:w="http://schemas.openxmlformats.org/wordprocessingml/2006/main" xmlns:w14="http://schemas.microsoft.com/office/word/2010/wordml" xmlns:w15="http://schemas.microsoft.com/office/word/2012/wordml" xmlns:w16cex="http://schemas.microsoft.com/office/word/2018/wordml/cex" xmlns:w16cid="http://schemas.microsoft.com/office/word/2016/wordml/cid" xmlns:w16="http://schemas.microsoft.com/office/word/2018/wordml" xmlns:w16sdtdh="http://schemas.microsoft.com/office/word/2020/wordml/sdtdatahash" xmlns:w16sdtfl="http://schemas.microsoft.com/office/word/2024/wordml/sdtformatlock" xmlns:w16se="http://schemas.microsoft.com/office/word/2015/wordml/symex" xmlns:w16du="http://schemas.microsoft.com/office/word/2023/wordml/word16du" xmlns:wne="http://schemas.microsoft.com/office/word/2006/wordml" mc:Ignorable="w14 w15 w16se w16cid w16 w16cex w16sdtdh w16sdtfl w16du wp14">
   <w:p>
     <w:pPr>
       <w:pStyle w:val="Header"/>
@@ -6838,7 +6799,7 @@
       <w:rPr>
         <w:noProof/>
       </w:rPr>
-      <w:pict w14:anchorId="22F2584D">
+      <w:pict w14:anchorId="0674751D">
         <v:shapetype id="_x0000_t136" coordsize="21600,21600" o:spt="136" adj="10800" path="m@7,l@8,m@5,21600l@6,21600e">
           <v:formulas>
             <v:f eqn="sum #0 0 10800"/>
@@ -6863,7 +6824,7 @@
           </v:handles>
           <o:lock v:ext="edit" text="t" shapetype="t"/>
         </v:shapetype>
-        <v:shape id="_x0000_s2056" type="#_x0000_t136" alt="" style="position:absolute;margin-left:0;margin-top:0;width:410.05pt;height:249.6pt;rotation:315;z-index:-251617259;mso-wrap-edited:f;mso-width-percent:0;mso-height-percent:0;mso-position-horizontal:center;mso-position-horizontal-relative:margin;mso-position-vertical:center;mso-position-vertical-relative:margin;mso-width-percent:0;mso-height-percent:0" o:allowincell="f" fillcolor="#7f7f7f [1612]" stroked="f">
+        <v:shape id="_x0000_s1032" type="#_x0000_t136" alt="" style="position:absolute;margin-left:0;margin-top:0;width:410.05pt;height:249.6pt;rotation:315;z-index:-251617259;mso-wrap-edited:f;mso-width-percent:0;mso-height-percent:0;mso-position-horizontal:center;mso-position-horizontal-relative:margin;mso-position-vertical:center;mso-position-vertical-relative:margin;mso-width-percent:0;mso-height-percent:0" o:allowincell="f" fillcolor="#7f7f7f [1612]" stroked="f">
           <v:fill opacity="6553f"/>
           <v:textpath style="font-family:&quot;Helvetica Neue&quot;;font-size:1pt" string="JGS"/>
           <w10:wrap anchorx="margin" anchory="margin"/>
@@ -6875,7 +6836,7 @@
 </file>
 
 <file path=word/header13.xml><?xml version="1.0" encoding="utf-8"?>
-<w:hdr xmlns:wpc="http://schemas.microsoft.com/office/word/2010/wordprocessingCanvas" xmlns:cx="http://schemas.microsoft.com/office/drawing/2014/chartex" xmlns:cx1="http://schemas.microsoft.com/office/drawing/2015/9/8/chartex" xmlns:cx2="http://schemas.microsoft.com/office/drawing/2015/10/21/chartex" xmlns:cx3="http://schemas.microsoft.com/office/drawing/2016/5/9/chartex" xmlns:cx4="http://schemas.microsoft.com/office/drawing/2016/5/10/chartex" xmlns:cx5="http://schemas.microsoft.com/office/drawing/2016/5/11/chartex" xmlns:cx6="http://schemas.microsoft.com/office/drawing/2016/5/12/chartex" xmlns:cx7="http://schemas.microsoft.com/office/drawing/2016/5/13/chartex" xmlns:cx8="http://schemas.microsoft.com/office/drawing/2016/5/14/chartex" xmlns:mc="http://schemas.openxmlformats.org/markup-compatibility/2006" xmlns:aink="http://schemas.microsoft.com/office/drawing/2016/ink" xmlns:am3d="http://schemas.microsoft.com/office/drawing/2017/model3d" xmlns:o="urn:schemas-microsoft-com:office:office" xmlns:r="http://schemas.openxmlformats.org/officeDocument/2006/relationships" xmlns:m="http://schemas.openxmlformats.org/officeDocument/2006/math" xmlns:v="urn:schemas-microsoft-com:vml" xmlns:wp14="http://schemas.microsoft.com/office/word/2010/wordprocessingDrawing" xmlns:wp="http://schemas.openxmlformats.org/drawingml/2006/wordprocessingDrawing" xmlns:w10="urn:schemas-microsoft-com:office:word" xmlns:w="http://schemas.openxmlformats.org/wordprocessingml/2006/main" xmlns:w14="http://schemas.microsoft.com/office/word/2010/wordml" xmlns:w15="http://schemas.microsoft.com/office/word/2012/wordml" xmlns:w16cid="http://schemas.microsoft.com/office/word/2016/wordml/cid" xmlns:w16se="http://schemas.microsoft.com/office/word/2015/wordml/symex" xmlns:wpg="http://schemas.microsoft.com/office/word/2010/wordprocessingGroup" xmlns:wpi="http://schemas.microsoft.com/office/word/2010/wordprocessingInk" xmlns:wne="http://schemas.microsoft.com/office/word/2006/wordml" xmlns:wps="http://schemas.microsoft.com/office/word/2010/wordprocessingShape" mc:Ignorable="w14 w15 w16se w16cid wp14">
+<w:hdr xmlns:wpc="http://schemas.microsoft.com/office/word/2010/wordprocessingCanvas" xmlns:cx="http://schemas.microsoft.com/office/drawing/2014/chartex" xmlns:cx1="http://schemas.microsoft.com/office/drawing/2015/9/8/chartex" xmlns:cx2="http://schemas.microsoft.com/office/drawing/2015/10/21/chartex" xmlns:cx3="http://schemas.microsoft.com/office/drawing/2016/5/9/chartex" xmlns:cx4="http://schemas.microsoft.com/office/drawing/2016/5/10/chartex" xmlns:cx5="http://schemas.microsoft.com/office/drawing/2016/5/11/chartex" xmlns:cx6="http://schemas.microsoft.com/office/drawing/2016/5/12/chartex" xmlns:cx7="http://schemas.microsoft.com/office/drawing/2016/5/13/chartex" xmlns:cx8="http://schemas.microsoft.com/office/drawing/2016/5/14/chartex" xmlns:mc="http://schemas.openxmlformats.org/markup-compatibility/2006" xmlns:m="http://schemas.openxmlformats.org/officeDocument/2006/math" xmlns:aink="http://schemas.microsoft.com/office/drawing/2016/ink" xmlns:am3d="http://schemas.microsoft.com/office/drawing/2017/model3d" xmlns:oel="http://schemas.microsoft.com/office/2019/extlst" xmlns:r="http://schemas.openxmlformats.org/officeDocument/2006/relationships" xmlns:wp14="http://schemas.microsoft.com/office/word/2010/wordprocessingDrawing" xmlns:wp="http://schemas.openxmlformats.org/drawingml/2006/wordprocessingDrawing" xmlns:wpg="http://schemas.microsoft.com/office/word/2010/wordprocessingGroup" xmlns:wpi="http://schemas.microsoft.com/office/word/2010/wordprocessingInk" xmlns:wps="http://schemas.microsoft.com/office/word/2010/wordprocessingShape" xmlns:o="urn:schemas-microsoft-com:office:office" xmlns:v="urn:schemas-microsoft-com:vml" xmlns:w10="urn:schemas-microsoft-com:office:word" xmlns:w="http://schemas.openxmlformats.org/wordprocessingml/2006/main" xmlns:w14="http://schemas.microsoft.com/office/word/2010/wordml" xmlns:w15="http://schemas.microsoft.com/office/word/2012/wordml" xmlns:w16cex="http://schemas.microsoft.com/office/word/2018/wordml/cex" xmlns:w16cid="http://schemas.microsoft.com/office/word/2016/wordml/cid" xmlns:w16="http://schemas.microsoft.com/office/word/2018/wordml" xmlns:w16sdtdh="http://schemas.microsoft.com/office/word/2020/wordml/sdtdatahash" xmlns:w16sdtfl="http://schemas.microsoft.com/office/word/2024/wordml/sdtformatlock" xmlns:w16se="http://schemas.microsoft.com/office/word/2015/wordml/symex" xmlns:w16du="http://schemas.microsoft.com/office/word/2023/wordml/word16du" xmlns:wne="http://schemas.microsoft.com/office/word/2006/wordml" mc:Ignorable="w14 w15 w16se w16cid w16 w16cex w16sdtdh w16sdtfl w16du wp14">
   <w:p>
     <w:pPr>
       <w:pStyle w:val="Header"/>
@@ -6884,7 +6845,7 @@
       <w:rPr>
         <w:noProof/>
       </w:rPr>
-      <w:pict w14:anchorId="1225F9B9">
+      <w:pict w14:anchorId="4CB23551">
         <v:shapetype id="_x0000_t136" coordsize="21600,21600" o:spt="136" adj="10800" path="m@7,l@8,m@5,21600l@6,21600e">
           <v:formulas>
             <v:f eqn="sum #0 0 10800"/>
@@ -6909,7 +6870,7 @@
           </v:handles>
           <o:lock v:ext="edit" text="t" shapetype="t"/>
         </v:shapetype>
-        <v:shape id="_x0000_s2055" type="#_x0000_t136" alt="" style="position:absolute;margin-left:0;margin-top:0;width:410.05pt;height:249.6pt;rotation:315;z-index:-251600875;mso-wrap-edited:f;mso-width-percent:0;mso-height-percent:0;mso-position-horizontal:center;mso-position-horizontal-relative:margin;mso-position-vertical:center;mso-position-vertical-relative:margin;mso-width-percent:0;mso-height-percent:0" o:allowincell="f" fillcolor="#7f7f7f [1612]" stroked="f">
+        <v:shape id="_x0000_s1031" type="#_x0000_t136" alt="" style="position:absolute;margin-left:0;margin-top:0;width:410.05pt;height:249.6pt;rotation:315;z-index:-251600875;mso-wrap-edited:f;mso-width-percent:0;mso-height-percent:0;mso-position-horizontal:center;mso-position-horizontal-relative:margin;mso-position-vertical:center;mso-position-vertical-relative:margin;mso-width-percent:0;mso-height-percent:0" o:allowincell="f" fillcolor="#7f7f7f [1612]" stroked="f">
           <v:fill opacity="6553f"/>
           <v:textpath style="font-family:&quot;Helvetica Neue&quot;;font-size:1pt" string="JGS"/>
           <w10:wrap anchorx="margin" anchory="margin"/>
@@ -6920,7 +6881,7 @@
       <w:rPr>
         <w:noProof/>
       </w:rPr>
-      <w:pict w14:anchorId="7BD5AA55">
+      <w:pict w14:anchorId="53665604">
         <v:shapetype id="_x0000_t75" coordsize="21600,21600" o:spt="75" o:preferrelative="t" path="m@4@5l@4@11@9@11@9@5xe" filled="f" stroked="f">
           <v:stroke joinstyle="miter"/>
           <v:formulas>
@@ -6940,7 +6901,7 @@
           <v:path o:extrusionok="f" gradientshapeok="t" o:connecttype="rect"/>
           <o:lock v:ext="edit" aspectratio="t"/>
         </v:shapetype>
-        <v:shape id="_x0000_s2054" type="#_x0000_t75" alt="" style="position:absolute;margin-left:0;margin-top:0;width:459pt;height:594pt;z-index:-251658221;mso-wrap-edited:f;mso-width-percent:0;mso-height-percent:0;mso-position-horizontal:center;mso-position-horizontal-relative:margin;mso-position-vertical:center;mso-position-vertical-relative:margin;mso-width-percent:0;mso-height-percent:0" o:allowincell="f">
+        <v:shape id="_x0000_s1030" type="#_x0000_t75" alt="" style="position:absolute;margin-left:0;margin-top:0;width:459pt;height:594pt;z-index:-251658221;mso-wrap-edited:f;mso-width-percent:0;mso-height-percent:0;mso-position-horizontal:center;mso-position-horizontal-relative:margin;mso-position-vertical:center;mso-position-vertical-relative:margin;mso-width-percent:0;mso-height-percent:0" o:allowincell="f">
           <v:imagedata r:id="rId1" o:title="doc-front-page"/>
           <w10:wrap anchorx="margin" anchory="margin"/>
         </v:shape>
@@ -6950,8 +6911,8 @@
       <w:rPr>
         <w:noProof/>
       </w:rPr>
-      <w:pict w14:anchorId="026EDB68">
-        <v:shape id="_x0000_s2053" type="#_x0000_t75" alt="" style="position:absolute;margin-left:0;margin-top:0;width:459pt;height:594pt;z-index:-251658230;mso-wrap-edited:f;mso-width-percent:0;mso-height-percent:0;mso-position-horizontal:center;mso-position-horizontal-relative:margin;mso-position-vertical:center;mso-position-vertical-relative:margin;mso-width-percent:0;mso-height-percent:0" o:allowincell="f">
+      <w:pict w14:anchorId="5DF2E2D5">
+        <v:shape id="_x0000_s1029" type="#_x0000_t75" alt="" style="position:absolute;margin-left:0;margin-top:0;width:459pt;height:594pt;z-index:-251658230;mso-wrap-edited:f;mso-width-percent:0;mso-height-percent:0;mso-position-horizontal:center;mso-position-horizontal-relative:margin;mso-position-vertical:center;mso-position-vertical-relative:margin;mso-width-percent:0;mso-height-percent:0" o:allowincell="f">
           <v:imagedata r:id="rId1" o:title="doc-front-page"/>
           <w10:wrap anchorx="margin" anchory="margin"/>
         </v:shape>
@@ -6962,7 +6923,7 @@
 </file>
 
 <file path=word/header14.xml><?xml version="1.0" encoding="utf-8"?>
-<w:hdr xmlns:wpc="http://schemas.microsoft.com/office/word/2010/wordprocessingCanvas" xmlns:cx="http://schemas.microsoft.com/office/drawing/2014/chartex" xmlns:cx1="http://schemas.microsoft.com/office/drawing/2015/9/8/chartex" xmlns:cx2="http://schemas.microsoft.com/office/drawing/2015/10/21/chartex" xmlns:cx3="http://schemas.microsoft.com/office/drawing/2016/5/9/chartex" xmlns:cx4="http://schemas.microsoft.com/office/drawing/2016/5/10/chartex" xmlns:cx5="http://schemas.microsoft.com/office/drawing/2016/5/11/chartex" xmlns:cx6="http://schemas.microsoft.com/office/drawing/2016/5/12/chartex" xmlns:cx7="http://schemas.microsoft.com/office/drawing/2016/5/13/chartex" xmlns:cx8="http://schemas.microsoft.com/office/drawing/2016/5/14/chartex" xmlns:mc="http://schemas.openxmlformats.org/markup-compatibility/2006" xmlns:aink="http://schemas.microsoft.com/office/drawing/2016/ink" xmlns:am3d="http://schemas.microsoft.com/office/drawing/2017/model3d" xmlns:o="urn:schemas-microsoft-com:office:office" xmlns:r="http://schemas.openxmlformats.org/officeDocument/2006/relationships" xmlns:m="http://schemas.openxmlformats.org/officeDocument/2006/math" xmlns:v="urn:schemas-microsoft-com:vml" xmlns:wp14="http://schemas.microsoft.com/office/word/2010/wordprocessingDrawing" xmlns:wp="http://schemas.openxmlformats.org/drawingml/2006/wordprocessingDrawing" xmlns:w10="urn:schemas-microsoft-com:office:word" xmlns:w="http://schemas.openxmlformats.org/wordprocessingml/2006/main" xmlns:w14="http://schemas.microsoft.com/office/word/2010/wordml" xmlns:w15="http://schemas.microsoft.com/office/word/2012/wordml" xmlns:w16cid="http://schemas.microsoft.com/office/word/2016/wordml/cid" xmlns:w16se="http://schemas.microsoft.com/office/word/2015/wordml/symex" xmlns:wpg="http://schemas.microsoft.com/office/word/2010/wordprocessingGroup" xmlns:wpi="http://schemas.microsoft.com/office/word/2010/wordprocessingInk" xmlns:wne="http://schemas.microsoft.com/office/word/2006/wordml" xmlns:wps="http://schemas.microsoft.com/office/word/2010/wordprocessingShape" mc:Ignorable="w14 w15 w16se w16cid wp14">
+<w:hdr xmlns:wpc="http://schemas.microsoft.com/office/word/2010/wordprocessingCanvas" xmlns:cx="http://schemas.microsoft.com/office/drawing/2014/chartex" xmlns:cx1="http://schemas.microsoft.com/office/drawing/2015/9/8/chartex" xmlns:cx2="http://schemas.microsoft.com/office/drawing/2015/10/21/chartex" xmlns:cx3="http://schemas.microsoft.com/office/drawing/2016/5/9/chartex" xmlns:cx4="http://schemas.microsoft.com/office/drawing/2016/5/10/chartex" xmlns:cx5="http://schemas.microsoft.com/office/drawing/2016/5/11/chartex" xmlns:cx6="http://schemas.microsoft.com/office/drawing/2016/5/12/chartex" xmlns:cx7="http://schemas.microsoft.com/office/drawing/2016/5/13/chartex" xmlns:cx8="http://schemas.microsoft.com/office/drawing/2016/5/14/chartex" xmlns:mc="http://schemas.openxmlformats.org/markup-compatibility/2006" xmlns:m="http://schemas.openxmlformats.org/officeDocument/2006/math" xmlns:aink="http://schemas.microsoft.com/office/drawing/2016/ink" xmlns:am3d="http://schemas.microsoft.com/office/drawing/2017/model3d" xmlns:oel="http://schemas.microsoft.com/office/2019/extlst" xmlns:r="http://schemas.openxmlformats.org/officeDocument/2006/relationships" xmlns:wp14="http://schemas.microsoft.com/office/word/2010/wordprocessingDrawing" xmlns:wp="http://schemas.openxmlformats.org/drawingml/2006/wordprocessingDrawing" xmlns:wpg="http://schemas.microsoft.com/office/word/2010/wordprocessingGroup" xmlns:wpi="http://schemas.microsoft.com/office/word/2010/wordprocessingInk" xmlns:wps="http://schemas.microsoft.com/office/word/2010/wordprocessingShape" xmlns:o="urn:schemas-microsoft-com:office:office" xmlns:v="urn:schemas-microsoft-com:vml" xmlns:w10="urn:schemas-microsoft-com:office:word" xmlns:w="http://schemas.openxmlformats.org/wordprocessingml/2006/main" xmlns:w14="http://schemas.microsoft.com/office/word/2010/wordml" xmlns:w15="http://schemas.microsoft.com/office/word/2012/wordml" xmlns:w16cex="http://schemas.microsoft.com/office/word/2018/wordml/cex" xmlns:w16cid="http://schemas.microsoft.com/office/word/2016/wordml/cid" xmlns:w16="http://schemas.microsoft.com/office/word/2018/wordml" xmlns:w16sdtdh="http://schemas.microsoft.com/office/word/2020/wordml/sdtdatahash" xmlns:w16sdtfl="http://schemas.microsoft.com/office/word/2024/wordml/sdtformatlock" xmlns:w16se="http://schemas.microsoft.com/office/word/2015/wordml/symex" xmlns:w16du="http://schemas.microsoft.com/office/word/2023/wordml/word16du" xmlns:wne="http://schemas.microsoft.com/office/word/2006/wordml" mc:Ignorable="w14 w15 w16se w16cid w16 w16cex w16sdtdh w16sdtfl w16du wp14">
   <w:p>
     <w:pPr>
       <w:pStyle w:val="Header"/>
@@ -6975,7 +6936,7 @@
       <w:rPr>
         <w:noProof/>
       </w:rPr>
-      <w:pict w14:anchorId="7AEFC3F5">
+      <w:pict w14:anchorId="177B68B7">
         <v:shapetype id="_x0000_t136" coordsize="21600,21600" o:spt="136" adj="10800" path="m@7,l@8,m@5,21600l@6,21600e">
           <v:formulas>
             <v:f eqn="sum #0 0 10800"/>
@@ -7000,7 +6961,7 @@
           </v:handles>
           <o:lock v:ext="edit" text="t" shapetype="t"/>
         </v:shapetype>
-        <v:shape id="_x0000_s2052" type="#_x0000_t136" alt="" style="position:absolute;left:0;text-align:left;margin-left:0;margin-top:0;width:410.05pt;height:249.6pt;rotation:315;z-index:-251596779;mso-wrap-edited:f;mso-width-percent:0;mso-height-percent:0;mso-position-horizontal:center;mso-position-horizontal-relative:margin;mso-position-vertical:center;mso-position-vertical-relative:margin;mso-width-percent:0;mso-height-percent:0" o:allowincell="f" fillcolor="#7f7f7f [1612]" stroked="f">
+        <v:shape id="_x0000_s1028" type="#_x0000_t136" alt="" style="position:absolute;left:0;text-align:left;margin-left:0;margin-top:0;width:410.05pt;height:249.6pt;rotation:315;z-index:-251596779;mso-wrap-edited:f;mso-width-percent:0;mso-height-percent:0;mso-position-horizontal:center;mso-position-horizontal-relative:margin;mso-position-vertical:center;mso-position-vertical-relative:margin;mso-width-percent:0;mso-height-percent:0" o:allowincell="f" fillcolor="#7f7f7f [1612]" stroked="f">
           <v:fill opacity="6553f"/>
           <v:textpath style="font-family:&quot;Helvetica Neue&quot;;font-size:1pt" string="JGS"/>
           <w10:wrap anchorx="margin" anchory="margin"/>
@@ -7099,7 +7060,7 @@
 </file>
 
 <file path=word/header15.xml><?xml version="1.0" encoding="utf-8"?>
-<w:hdr xmlns:wpc="http://schemas.microsoft.com/office/word/2010/wordprocessingCanvas" xmlns:cx="http://schemas.microsoft.com/office/drawing/2014/chartex" xmlns:cx1="http://schemas.microsoft.com/office/drawing/2015/9/8/chartex" xmlns:cx2="http://schemas.microsoft.com/office/drawing/2015/10/21/chartex" xmlns:cx3="http://schemas.microsoft.com/office/drawing/2016/5/9/chartex" xmlns:cx4="http://schemas.microsoft.com/office/drawing/2016/5/10/chartex" xmlns:cx5="http://schemas.microsoft.com/office/drawing/2016/5/11/chartex" xmlns:cx6="http://schemas.microsoft.com/office/drawing/2016/5/12/chartex" xmlns:cx7="http://schemas.microsoft.com/office/drawing/2016/5/13/chartex" xmlns:cx8="http://schemas.microsoft.com/office/drawing/2016/5/14/chartex" xmlns:mc="http://schemas.openxmlformats.org/markup-compatibility/2006" xmlns:aink="http://schemas.microsoft.com/office/drawing/2016/ink" xmlns:am3d="http://schemas.microsoft.com/office/drawing/2017/model3d" xmlns:o="urn:schemas-microsoft-com:office:office" xmlns:r="http://schemas.openxmlformats.org/officeDocument/2006/relationships" xmlns:m="http://schemas.openxmlformats.org/officeDocument/2006/math" xmlns:v="urn:schemas-microsoft-com:vml" xmlns:wp14="http://schemas.microsoft.com/office/word/2010/wordprocessingDrawing" xmlns:wp="http://schemas.openxmlformats.org/drawingml/2006/wordprocessingDrawing" xmlns:w10="urn:schemas-microsoft-com:office:word" xmlns:w="http://schemas.openxmlformats.org/wordprocessingml/2006/main" xmlns:w14="http://schemas.microsoft.com/office/word/2010/wordml" xmlns:w15="http://schemas.microsoft.com/office/word/2012/wordml" xmlns:w16cid="http://schemas.microsoft.com/office/word/2016/wordml/cid" xmlns:w16se="http://schemas.microsoft.com/office/word/2015/wordml/symex" xmlns:wpg="http://schemas.microsoft.com/office/word/2010/wordprocessingGroup" xmlns:wpi="http://schemas.microsoft.com/office/word/2010/wordprocessingInk" xmlns:wne="http://schemas.microsoft.com/office/word/2006/wordml" xmlns:wps="http://schemas.microsoft.com/office/word/2010/wordprocessingShape" mc:Ignorable="w14 w15 w16se w16cid wp14">
+<w:hdr xmlns:wpc="http://schemas.microsoft.com/office/word/2010/wordprocessingCanvas" xmlns:cx="http://schemas.microsoft.com/office/drawing/2014/chartex" xmlns:cx1="http://schemas.microsoft.com/office/drawing/2015/9/8/chartex" xmlns:cx2="http://schemas.microsoft.com/office/drawing/2015/10/21/chartex" xmlns:cx3="http://schemas.microsoft.com/office/drawing/2016/5/9/chartex" xmlns:cx4="http://schemas.microsoft.com/office/drawing/2016/5/10/chartex" xmlns:cx5="http://schemas.microsoft.com/office/drawing/2016/5/11/chartex" xmlns:cx6="http://schemas.microsoft.com/office/drawing/2016/5/12/chartex" xmlns:cx7="http://schemas.microsoft.com/office/drawing/2016/5/13/chartex" xmlns:cx8="http://schemas.microsoft.com/office/drawing/2016/5/14/chartex" xmlns:mc="http://schemas.openxmlformats.org/markup-compatibility/2006" xmlns:m="http://schemas.openxmlformats.org/officeDocument/2006/math" xmlns:aink="http://schemas.microsoft.com/office/drawing/2016/ink" xmlns:am3d="http://schemas.microsoft.com/office/drawing/2017/model3d" xmlns:oel="http://schemas.microsoft.com/office/2019/extlst" xmlns:r="http://schemas.openxmlformats.org/officeDocument/2006/relationships" xmlns:wp14="http://schemas.microsoft.com/office/word/2010/wordprocessingDrawing" xmlns:wp="http://schemas.openxmlformats.org/drawingml/2006/wordprocessingDrawing" xmlns:wpg="http://schemas.microsoft.com/office/word/2010/wordprocessingGroup" xmlns:wpi="http://schemas.microsoft.com/office/word/2010/wordprocessingInk" xmlns:wps="http://schemas.microsoft.com/office/word/2010/wordprocessingShape" xmlns:o="urn:schemas-microsoft-com:office:office" xmlns:v="urn:schemas-microsoft-com:vml" xmlns:w10="urn:schemas-microsoft-com:office:word" xmlns:w="http://schemas.openxmlformats.org/wordprocessingml/2006/main" xmlns:w14="http://schemas.microsoft.com/office/word/2010/wordml" xmlns:w15="http://schemas.microsoft.com/office/word/2012/wordml" xmlns:w16cex="http://schemas.microsoft.com/office/word/2018/wordml/cex" xmlns:w16cid="http://schemas.microsoft.com/office/word/2016/wordml/cid" xmlns:w16="http://schemas.microsoft.com/office/word/2018/wordml" xmlns:w16sdtdh="http://schemas.microsoft.com/office/word/2020/wordml/sdtdatahash" xmlns:w16sdtfl="http://schemas.microsoft.com/office/word/2024/wordml/sdtformatlock" xmlns:w16se="http://schemas.microsoft.com/office/word/2015/wordml/symex" xmlns:w16du="http://schemas.microsoft.com/office/word/2023/wordml/word16du" xmlns:wne="http://schemas.microsoft.com/office/word/2006/wordml" mc:Ignorable="w14 w15 w16se w16cid w16 w16cex w16sdtdh w16sdtfl w16du wp14">
   <w:p>
     <w:pPr>
       <w:pStyle w:val="Header"/>
@@ -7108,7 +7069,7 @@
       <w:rPr>
         <w:noProof/>
       </w:rPr>
-      <w:pict w14:anchorId="00FF7062">
+      <w:pict w14:anchorId="7B795AC5">
         <v:shapetype id="_x0000_t136" coordsize="21600,21600" o:spt="136" adj="10800" path="m@7,l@8,m@5,21600l@6,21600e">
           <v:formulas>
             <v:f eqn="sum #0 0 10800"/>
@@ -7133,7 +7094,7 @@
           </v:handles>
           <o:lock v:ext="edit" text="t" shapetype="t"/>
         </v:shapetype>
-        <v:shape id="_x0000_s2051" type="#_x0000_t136" alt="" style="position:absolute;margin-left:0;margin-top:0;width:410.05pt;height:249.6pt;rotation:315;z-index:-251604971;mso-wrap-edited:f;mso-width-percent:0;mso-height-percent:0;mso-position-horizontal:center;mso-position-horizontal-relative:margin;mso-position-vertical:center;mso-position-vertical-relative:margin;mso-width-percent:0;mso-height-percent:0" o:allowincell="f" fillcolor="#7f7f7f [1612]" stroked="f">
+        <v:shape id="_x0000_s1027" type="#_x0000_t136" alt="" style="position:absolute;margin-left:0;margin-top:0;width:410.05pt;height:249.6pt;rotation:315;z-index:-251604971;mso-wrap-edited:f;mso-width-percent:0;mso-height-percent:0;mso-position-horizontal:center;mso-position-horizontal-relative:margin;mso-position-vertical:center;mso-position-vertical-relative:margin;mso-width-percent:0;mso-height-percent:0" o:allowincell="f" fillcolor="#7f7f7f [1612]" stroked="f">
           <v:fill opacity="6553f"/>
           <v:textpath style="font-family:&quot;Helvetica Neue&quot;;font-size:1pt" string="JGS"/>
           <w10:wrap anchorx="margin" anchory="margin"/>
@@ -7144,7 +7105,7 @@
       <w:rPr>
         <w:noProof/>
       </w:rPr>
-      <w:pict w14:anchorId="4CF58F32">
+      <w:pict w14:anchorId="5DBD5FD8">
         <v:shapetype id="_x0000_t75" coordsize="21600,21600" o:spt="75" o:preferrelative="t" path="m@4@5l@4@11@9@11@9@5xe" filled="f" stroked="f">
           <v:stroke joinstyle="miter"/>
           <v:formulas>
@@ -7164,7 +7125,7 @@
           <v:path o:extrusionok="f" gradientshapeok="t" o:connecttype="rect"/>
           <o:lock v:ext="edit" aspectratio="t"/>
         </v:shapetype>
-        <v:shape id="_x0000_s2050" type="#_x0000_t75" alt="" style="position:absolute;margin-left:0;margin-top:0;width:459pt;height:594pt;z-index:-251658222;mso-wrap-edited:f;mso-width-percent:0;mso-height-percent:0;mso-position-horizontal:center;mso-position-horizontal-relative:margin;mso-position-vertical:center;mso-position-vertical-relative:margin;mso-width-percent:0;mso-height-percent:0" o:allowincell="f">
+        <v:shape id="_x0000_s1026" type="#_x0000_t75" alt="" style="position:absolute;margin-left:0;margin-top:0;width:459pt;height:594pt;z-index:-251658222;mso-wrap-edited:f;mso-width-percent:0;mso-height-percent:0;mso-position-horizontal:center;mso-position-horizontal-relative:margin;mso-position-vertical:center;mso-position-vertical-relative:margin;mso-width-percent:0;mso-height-percent:0" o:allowincell="f">
           <v:imagedata r:id="rId1" o:title="doc-front-page"/>
           <w10:wrap anchorx="margin" anchory="margin"/>
         </v:shape>
@@ -7174,8 +7135,8 @@
       <w:rPr>
         <w:noProof/>
       </w:rPr>
-      <w:pict w14:anchorId="412879C0">
-        <v:shape id="_x0000_s2049" type="#_x0000_t75" alt="" style="position:absolute;margin-left:0;margin-top:0;width:459pt;height:594pt;z-index:-251658231;mso-wrap-edited:f;mso-width-percent:0;mso-height-percent:0;mso-position-horizontal:center;mso-position-horizontal-relative:margin;mso-position-vertical:center;mso-position-vertical-relative:margin;mso-width-percent:0;mso-height-percent:0" o:allowincell="f">
+      <w:pict w14:anchorId="1E9E7B1C">
+        <v:shape id="_x0000_s1025" type="#_x0000_t75" alt="" style="position:absolute;margin-left:0;margin-top:0;width:459pt;height:594pt;z-index:-251658231;mso-wrap-edited:f;mso-width-percent:0;mso-height-percent:0;mso-position-horizontal:center;mso-position-horizontal-relative:margin;mso-position-vertical:center;mso-position-vertical-relative:margin;mso-width-percent:0;mso-height-percent:0" o:allowincell="f">
           <v:imagedata r:id="rId1" o:title="doc-front-page"/>
           <w10:wrap anchorx="margin" anchory="margin"/>
         </v:shape>
@@ -7186,7 +7147,7 @@
 </file>
 
 <file path=word/header2.xml><?xml version="1.0" encoding="utf-8"?>
-<w:hdr xmlns:wpc="http://schemas.microsoft.com/office/word/2010/wordprocessingCanvas" xmlns:cx="http://schemas.microsoft.com/office/drawing/2014/chartex" xmlns:cx1="http://schemas.microsoft.com/office/drawing/2015/9/8/chartex" xmlns:cx2="http://schemas.microsoft.com/office/drawing/2015/10/21/chartex" xmlns:cx3="http://schemas.microsoft.com/office/drawing/2016/5/9/chartex" xmlns:cx4="http://schemas.microsoft.com/office/drawing/2016/5/10/chartex" xmlns:cx5="http://schemas.microsoft.com/office/drawing/2016/5/11/chartex" xmlns:cx6="http://schemas.microsoft.com/office/drawing/2016/5/12/chartex" xmlns:cx7="http://schemas.microsoft.com/office/drawing/2016/5/13/chartex" xmlns:cx8="http://schemas.microsoft.com/office/drawing/2016/5/14/chartex" xmlns:mc="http://schemas.openxmlformats.org/markup-compatibility/2006" xmlns:aink="http://schemas.microsoft.com/office/drawing/2016/ink" xmlns:am3d="http://schemas.microsoft.com/office/drawing/2017/model3d" xmlns:o="urn:schemas-microsoft-com:office:office" xmlns:r="http://schemas.openxmlformats.org/officeDocument/2006/relationships" xmlns:m="http://schemas.openxmlformats.org/officeDocument/2006/math" xmlns:v="urn:schemas-microsoft-com:vml" xmlns:wp14="http://schemas.microsoft.com/office/word/2010/wordprocessingDrawing" xmlns:wp="http://schemas.openxmlformats.org/drawingml/2006/wordprocessingDrawing" xmlns:w10="urn:schemas-microsoft-com:office:word" xmlns:w="http://schemas.openxmlformats.org/wordprocessingml/2006/main" xmlns:w14="http://schemas.microsoft.com/office/word/2010/wordml" xmlns:w15="http://schemas.microsoft.com/office/word/2012/wordml" xmlns:w16cid="http://schemas.microsoft.com/office/word/2016/wordml/cid" xmlns:w16se="http://schemas.microsoft.com/office/word/2015/wordml/symex" xmlns:wpg="http://schemas.microsoft.com/office/word/2010/wordprocessingGroup" xmlns:wpi="http://schemas.microsoft.com/office/word/2010/wordprocessingInk" xmlns:wne="http://schemas.microsoft.com/office/word/2006/wordml" xmlns:wps="http://schemas.microsoft.com/office/word/2010/wordprocessingShape" mc:Ignorable="w14 w15 w16se w16cid wp14">
+<w:hdr xmlns:wpc="http://schemas.microsoft.com/office/word/2010/wordprocessingCanvas" xmlns:cx="http://schemas.microsoft.com/office/drawing/2014/chartex" xmlns:cx1="http://schemas.microsoft.com/office/drawing/2015/9/8/chartex" xmlns:cx2="http://schemas.microsoft.com/office/drawing/2015/10/21/chartex" xmlns:cx3="http://schemas.microsoft.com/office/drawing/2016/5/9/chartex" xmlns:cx4="http://schemas.microsoft.com/office/drawing/2016/5/10/chartex" xmlns:cx5="http://schemas.microsoft.com/office/drawing/2016/5/11/chartex" xmlns:cx6="http://schemas.microsoft.com/office/drawing/2016/5/12/chartex" xmlns:cx7="http://schemas.microsoft.com/office/drawing/2016/5/13/chartex" xmlns:cx8="http://schemas.microsoft.com/office/drawing/2016/5/14/chartex" xmlns:mc="http://schemas.openxmlformats.org/markup-compatibility/2006" xmlns:m="http://schemas.openxmlformats.org/officeDocument/2006/math" xmlns:aink="http://schemas.microsoft.com/office/drawing/2016/ink" xmlns:am3d="http://schemas.microsoft.com/office/drawing/2017/model3d" xmlns:oel="http://schemas.microsoft.com/office/2019/extlst" xmlns:r="http://schemas.openxmlformats.org/officeDocument/2006/relationships" xmlns:wp14="http://schemas.microsoft.com/office/word/2010/wordprocessingDrawing" xmlns:wp="http://schemas.openxmlformats.org/drawingml/2006/wordprocessingDrawing" xmlns:wpg="http://schemas.microsoft.com/office/word/2010/wordprocessingGroup" xmlns:wpi="http://schemas.microsoft.com/office/word/2010/wordprocessingInk" xmlns:wps="http://schemas.microsoft.com/office/word/2010/wordprocessingShape" xmlns:o="urn:schemas-microsoft-com:office:office" xmlns:v="urn:schemas-microsoft-com:vml" xmlns:w10="urn:schemas-microsoft-com:office:word" xmlns:w="http://schemas.openxmlformats.org/wordprocessingml/2006/main" xmlns:w14="http://schemas.microsoft.com/office/word/2010/wordml" xmlns:w15="http://schemas.microsoft.com/office/word/2012/wordml" xmlns:w16cex="http://schemas.microsoft.com/office/word/2018/wordml/cex" xmlns:w16cid="http://schemas.microsoft.com/office/word/2016/wordml/cid" xmlns:w16="http://schemas.microsoft.com/office/word/2018/wordml" xmlns:w16sdtdh="http://schemas.microsoft.com/office/word/2020/wordml/sdtdatahash" xmlns:w16sdtfl="http://schemas.microsoft.com/office/word/2024/wordml/sdtformatlock" xmlns:w16se="http://schemas.microsoft.com/office/word/2015/wordml/symex" xmlns:w16du="http://schemas.microsoft.com/office/word/2023/wordml/word16du" xmlns:wne="http://schemas.microsoft.com/office/word/2006/wordml" mc:Ignorable="w14 w15 w16se w16cid w16 w16cex w16sdtdh w16sdtfl w16du wp14">
   <w:p>
     <w:pPr>
       <w:pStyle w:val="Header"/>
@@ -7195,7 +7156,7 @@
       <w:rPr>
         <w:noProof/>
       </w:rPr>
-      <w:pict w14:anchorId="6A3A514B">
+      <w:pict w14:anchorId="0C9CD621">
         <v:shapetype id="_x0000_t136" coordsize="21600,21600" o:spt="136" adj="10800" path="m@7,l@8,m@5,21600l@6,21600e">
           <v:formulas>
             <v:f eqn="sum #0 0 10800"/>
@@ -7220,7 +7181,7 @@
           </v:handles>
           <o:lock v:ext="edit" text="t" shapetype="t"/>
         </v:shapetype>
-        <v:shape id="_x0000_s2077" type="#_x0000_t136" alt="" style="position:absolute;margin-left:0;margin-top:0;width:410.05pt;height:249.6pt;rotation:315;z-index:-251645931;mso-wrap-edited:f;mso-width-percent:0;mso-height-percent:0;mso-position-horizontal:center;mso-position-horizontal-relative:margin;mso-position-vertical:center;mso-position-vertical-relative:margin;mso-width-percent:0;mso-height-percent:0" o:allowincell="f" fillcolor="#7f7f7f [1612]" stroked="f">
+        <v:shape id="_x0000_s1053" type="#_x0000_t136" alt="" style="position:absolute;margin-left:0;margin-top:0;width:410.05pt;height:249.6pt;rotation:315;z-index:-251645931;mso-wrap-edited:f;mso-width-percent:0;mso-height-percent:0;mso-position-horizontal:center;mso-position-horizontal-relative:margin;mso-position-vertical:center;mso-position-vertical-relative:margin;mso-width-percent:0;mso-height-percent:0" o:allowincell="f" fillcolor="#7f7f7f [1612]" stroked="f">
           <v:fill opacity="6553f"/>
           <v:textpath style="font-family:&quot;Helvetica Neue&quot;;font-size:1pt" string="JGS"/>
           <w10:wrap anchorx="margin" anchory="margin"/>
@@ -7364,7 +7325,6 @@
                               <w:calendar w:val="gregorian"/>
                             </w:date>
                           </w:sdtPr>
-                          <w:sdtEndPr/>
                           <w:sdtContent>
                             <w:p>
                               <w:pPr>
@@ -7461,7 +7421,7 @@
 </file>
 
 <file path=word/header3.xml><?xml version="1.0" encoding="utf-8"?>
-<w:hdr xmlns:wpc="http://schemas.microsoft.com/office/word/2010/wordprocessingCanvas" xmlns:cx="http://schemas.microsoft.com/office/drawing/2014/chartex" xmlns:cx1="http://schemas.microsoft.com/office/drawing/2015/9/8/chartex" xmlns:cx2="http://schemas.microsoft.com/office/drawing/2015/10/21/chartex" xmlns:cx3="http://schemas.microsoft.com/office/drawing/2016/5/9/chartex" xmlns:cx4="http://schemas.microsoft.com/office/drawing/2016/5/10/chartex" xmlns:cx5="http://schemas.microsoft.com/office/drawing/2016/5/11/chartex" xmlns:cx6="http://schemas.microsoft.com/office/drawing/2016/5/12/chartex" xmlns:cx7="http://schemas.microsoft.com/office/drawing/2016/5/13/chartex" xmlns:cx8="http://schemas.microsoft.com/office/drawing/2016/5/14/chartex" xmlns:mc="http://schemas.openxmlformats.org/markup-compatibility/2006" xmlns:aink="http://schemas.microsoft.com/office/drawing/2016/ink" xmlns:am3d="http://schemas.microsoft.com/office/drawing/2017/model3d" xmlns:o="urn:schemas-microsoft-com:office:office" xmlns:r="http://schemas.openxmlformats.org/officeDocument/2006/relationships" xmlns:m="http://schemas.openxmlformats.org/officeDocument/2006/math" xmlns:v="urn:schemas-microsoft-com:vml" xmlns:wp14="http://schemas.microsoft.com/office/word/2010/wordprocessingDrawing" xmlns:wp="http://schemas.openxmlformats.org/drawingml/2006/wordprocessingDrawing" xmlns:w10="urn:schemas-microsoft-com:office:word" xmlns:w="http://schemas.openxmlformats.org/wordprocessingml/2006/main" xmlns:w14="http://schemas.microsoft.com/office/word/2010/wordml" xmlns:w15="http://schemas.microsoft.com/office/word/2012/wordml" xmlns:w16cid="http://schemas.microsoft.com/office/word/2016/wordml/cid" xmlns:w16se="http://schemas.microsoft.com/office/word/2015/wordml/symex" xmlns:wpg="http://schemas.microsoft.com/office/word/2010/wordprocessingGroup" xmlns:wpi="http://schemas.microsoft.com/office/word/2010/wordprocessingInk" xmlns:wne="http://schemas.microsoft.com/office/word/2006/wordml" xmlns:wps="http://schemas.microsoft.com/office/word/2010/wordprocessingShape" mc:Ignorable="w14 w15 w16se w16cid wp14">
+<w:hdr xmlns:wpc="http://schemas.microsoft.com/office/word/2010/wordprocessingCanvas" xmlns:cx="http://schemas.microsoft.com/office/drawing/2014/chartex" xmlns:cx1="http://schemas.microsoft.com/office/drawing/2015/9/8/chartex" xmlns:cx2="http://schemas.microsoft.com/office/drawing/2015/10/21/chartex" xmlns:cx3="http://schemas.microsoft.com/office/drawing/2016/5/9/chartex" xmlns:cx4="http://schemas.microsoft.com/office/drawing/2016/5/10/chartex" xmlns:cx5="http://schemas.microsoft.com/office/drawing/2016/5/11/chartex" xmlns:cx6="http://schemas.microsoft.com/office/drawing/2016/5/12/chartex" xmlns:cx7="http://schemas.microsoft.com/office/drawing/2016/5/13/chartex" xmlns:cx8="http://schemas.microsoft.com/office/drawing/2016/5/14/chartex" xmlns:mc="http://schemas.openxmlformats.org/markup-compatibility/2006" xmlns:m="http://schemas.openxmlformats.org/officeDocument/2006/math" xmlns:aink="http://schemas.microsoft.com/office/drawing/2016/ink" xmlns:am3d="http://schemas.microsoft.com/office/drawing/2017/model3d" xmlns:oel="http://schemas.microsoft.com/office/2019/extlst" xmlns:r="http://schemas.openxmlformats.org/officeDocument/2006/relationships" xmlns:wp14="http://schemas.microsoft.com/office/word/2010/wordprocessingDrawing" xmlns:wp="http://schemas.openxmlformats.org/drawingml/2006/wordprocessingDrawing" xmlns:wpg="http://schemas.microsoft.com/office/word/2010/wordprocessingGroup" xmlns:wpi="http://schemas.microsoft.com/office/word/2010/wordprocessingInk" xmlns:wps="http://schemas.microsoft.com/office/word/2010/wordprocessingShape" xmlns:o="urn:schemas-microsoft-com:office:office" xmlns:v="urn:schemas-microsoft-com:vml" xmlns:w10="urn:schemas-microsoft-com:office:word" xmlns:w="http://schemas.openxmlformats.org/wordprocessingml/2006/main" xmlns:w14="http://schemas.microsoft.com/office/word/2010/wordml" xmlns:w15="http://schemas.microsoft.com/office/word/2012/wordml" xmlns:w16cex="http://schemas.microsoft.com/office/word/2018/wordml/cex" xmlns:w16cid="http://schemas.microsoft.com/office/word/2016/wordml/cid" xmlns:w16="http://schemas.microsoft.com/office/word/2018/wordml" xmlns:w16sdtdh="http://schemas.microsoft.com/office/word/2020/wordml/sdtdatahash" xmlns:w16sdtfl="http://schemas.microsoft.com/office/word/2024/wordml/sdtformatlock" xmlns:w16se="http://schemas.microsoft.com/office/word/2015/wordml/symex" xmlns:w16du="http://schemas.microsoft.com/office/word/2023/wordml/word16du" xmlns:wne="http://schemas.microsoft.com/office/word/2006/wordml" mc:Ignorable="w14 w15 w16se w16cid w16 w16cex w16sdtdh w16sdtfl w16du wp14">
   <w:p>
     <w:pPr>
       <w:pStyle w:val="Header"/>
@@ -7470,7 +7430,7 @@
       <w:rPr>
         <w:noProof/>
       </w:rPr>
-      <w:pict w14:anchorId="1B29AB9D">
+      <w:pict w14:anchorId="77BA6633">
         <v:shapetype id="_x0000_t136" coordsize="21600,21600" o:spt="136" adj="10800" path="m@7,l@8,m@5,21600l@6,21600e">
           <v:formulas>
             <v:f eqn="sum #0 0 10800"/>
@@ -7495,7 +7455,7 @@
           </v:handles>
           <o:lock v:ext="edit" text="t" shapetype="t"/>
         </v:shapetype>
-        <v:shape id="PowerPlusWaterMarkObject" o:spid="_x0000_s2076" type="#_x0000_t136" alt="" style="position:absolute;margin-left:0;margin-top:0;width:410.05pt;height:249.6pt;rotation:315;z-index:-251654123;mso-wrap-edited:f;mso-width-percent:0;mso-height-percent:0;mso-position-horizontal:center;mso-position-horizontal-relative:margin;mso-position-vertical:center;mso-position-vertical-relative:margin;mso-width-percent:0;mso-height-percent:0" o:allowincell="f" fillcolor="#7f7f7f [1612]" stroked="f">
+        <v:shape id="PowerPlusWaterMarkObject" o:spid="_x0000_s1052" type="#_x0000_t136" alt="" style="position:absolute;margin-left:0;margin-top:0;width:410.05pt;height:249.6pt;rotation:315;z-index:-251654123;mso-wrap-edited:f;mso-width-percent:0;mso-height-percent:0;mso-position-horizontal:center;mso-position-horizontal-relative:margin;mso-position-vertical:center;mso-position-vertical-relative:margin;mso-width-percent:0;mso-height-percent:0" o:allowincell="f" fillcolor="#7f7f7f [1612]" stroked="f">
           <v:fill opacity="6553f"/>
           <v:textpath style="font-family:&quot;Helvetica Neue&quot;;font-size:1pt" string="JGS"/>
           <w10:wrap anchorx="margin" anchory="margin"/>
@@ -7506,7 +7466,7 @@
       <w:rPr>
         <w:noProof/>
       </w:rPr>
-      <w:pict w14:anchorId="3C1EBDAF">
+      <w:pict w14:anchorId="71C64319">
         <v:shapetype id="_x0000_t75" coordsize="21600,21600" o:spt="75" o:preferrelative="t" path="m@4@5l@4@11@9@11@9@5xe" filled="f" stroked="f">
           <v:stroke joinstyle="miter"/>
           <v:formulas>
@@ -7526,7 +7486,7 @@
           <v:path o:extrusionok="f" gradientshapeok="t" o:connecttype="rect"/>
           <o:lock v:ext="edit" aspectratio="t"/>
         </v:shapetype>
-        <v:shape id="_x0000_s2075" type="#_x0000_t75" alt="" style="position:absolute;margin-left:0;margin-top:0;width:459pt;height:594pt;z-index:-251658229;mso-wrap-edited:f;mso-width-percent:0;mso-height-percent:0;mso-position-horizontal:center;mso-position-horizontal-relative:margin;mso-position-vertical:center;mso-position-vertical-relative:margin;mso-width-percent:0;mso-height-percent:0" o:allowincell="f">
+        <v:shape id="_x0000_s1051" type="#_x0000_t75" alt="" style="position:absolute;margin-left:0;margin-top:0;width:459pt;height:594pt;z-index:-251658229;mso-wrap-edited:f;mso-width-percent:0;mso-height-percent:0;mso-position-horizontal:center;mso-position-horizontal-relative:margin;mso-position-vertical:center;mso-position-vertical-relative:margin;mso-width-percent:0;mso-height-percent:0" o:allowincell="f">
           <v:imagedata r:id="rId1" o:title="doc-front-page"/>
           <w10:wrap anchorx="margin" anchory="margin"/>
         </v:shape>
@@ -7537,7 +7497,7 @@
 </file>
 
 <file path=word/header4.xml><?xml version="1.0" encoding="utf-8"?>
-<w:hdr xmlns:wpc="http://schemas.microsoft.com/office/word/2010/wordprocessingCanvas" xmlns:cx="http://schemas.microsoft.com/office/drawing/2014/chartex" xmlns:cx1="http://schemas.microsoft.com/office/drawing/2015/9/8/chartex" xmlns:cx2="http://schemas.microsoft.com/office/drawing/2015/10/21/chartex" xmlns:cx3="http://schemas.microsoft.com/office/drawing/2016/5/9/chartex" xmlns:cx4="http://schemas.microsoft.com/office/drawing/2016/5/10/chartex" xmlns:cx5="http://schemas.microsoft.com/office/drawing/2016/5/11/chartex" xmlns:cx6="http://schemas.microsoft.com/office/drawing/2016/5/12/chartex" xmlns:cx7="http://schemas.microsoft.com/office/drawing/2016/5/13/chartex" xmlns:cx8="http://schemas.microsoft.com/office/drawing/2016/5/14/chartex" xmlns:mc="http://schemas.openxmlformats.org/markup-compatibility/2006" xmlns:aink="http://schemas.microsoft.com/office/drawing/2016/ink" xmlns:am3d="http://schemas.microsoft.com/office/drawing/2017/model3d" xmlns:o="urn:schemas-microsoft-com:office:office" xmlns:r="http://schemas.openxmlformats.org/officeDocument/2006/relationships" xmlns:m="http://schemas.openxmlformats.org/officeDocument/2006/math" xmlns:v="urn:schemas-microsoft-com:vml" xmlns:wp14="http://schemas.microsoft.com/office/word/2010/wordprocessingDrawing" xmlns:wp="http://schemas.openxmlformats.org/drawingml/2006/wordprocessingDrawing" xmlns:w10="urn:schemas-microsoft-com:office:word" xmlns:w="http://schemas.openxmlformats.org/wordprocessingml/2006/main" xmlns:w14="http://schemas.microsoft.com/office/word/2010/wordml" xmlns:w15="http://schemas.microsoft.com/office/word/2012/wordml" xmlns:w16cid="http://schemas.microsoft.com/office/word/2016/wordml/cid" xmlns:w16se="http://schemas.microsoft.com/office/word/2015/wordml/symex" xmlns:wpg="http://schemas.microsoft.com/office/word/2010/wordprocessingGroup" xmlns:wpi="http://schemas.microsoft.com/office/word/2010/wordprocessingInk" xmlns:wne="http://schemas.microsoft.com/office/word/2006/wordml" xmlns:wps="http://schemas.microsoft.com/office/word/2010/wordprocessingShape" mc:Ignorable="w14 w15 w16se w16cid wp14">
+<w:hdr xmlns:wpc="http://schemas.microsoft.com/office/word/2010/wordprocessingCanvas" xmlns:cx="http://schemas.microsoft.com/office/drawing/2014/chartex" xmlns:cx1="http://schemas.microsoft.com/office/drawing/2015/9/8/chartex" xmlns:cx2="http://schemas.microsoft.com/office/drawing/2015/10/21/chartex" xmlns:cx3="http://schemas.microsoft.com/office/drawing/2016/5/9/chartex" xmlns:cx4="http://schemas.microsoft.com/office/drawing/2016/5/10/chartex" xmlns:cx5="http://schemas.microsoft.com/office/drawing/2016/5/11/chartex" xmlns:cx6="http://schemas.microsoft.com/office/drawing/2016/5/12/chartex" xmlns:cx7="http://schemas.microsoft.com/office/drawing/2016/5/13/chartex" xmlns:cx8="http://schemas.microsoft.com/office/drawing/2016/5/14/chartex" xmlns:mc="http://schemas.openxmlformats.org/markup-compatibility/2006" xmlns:m="http://schemas.openxmlformats.org/officeDocument/2006/math" xmlns:aink="http://schemas.microsoft.com/office/drawing/2016/ink" xmlns:am3d="http://schemas.microsoft.com/office/drawing/2017/model3d" xmlns:oel="http://schemas.microsoft.com/office/2019/extlst" xmlns:r="http://schemas.openxmlformats.org/officeDocument/2006/relationships" xmlns:wp14="http://schemas.microsoft.com/office/word/2010/wordprocessingDrawing" xmlns:wp="http://schemas.openxmlformats.org/drawingml/2006/wordprocessingDrawing" xmlns:wpg="http://schemas.microsoft.com/office/word/2010/wordprocessingGroup" xmlns:wpi="http://schemas.microsoft.com/office/word/2010/wordprocessingInk" xmlns:wps="http://schemas.microsoft.com/office/word/2010/wordprocessingShape" xmlns:o="urn:schemas-microsoft-com:office:office" xmlns:v="urn:schemas-microsoft-com:vml" xmlns:w10="urn:schemas-microsoft-com:office:word" xmlns:w="http://schemas.openxmlformats.org/wordprocessingml/2006/main" xmlns:w14="http://schemas.microsoft.com/office/word/2010/wordml" xmlns:w15="http://schemas.microsoft.com/office/word/2012/wordml" xmlns:w16cex="http://schemas.microsoft.com/office/word/2018/wordml/cex" xmlns:w16cid="http://schemas.microsoft.com/office/word/2016/wordml/cid" xmlns:w16="http://schemas.microsoft.com/office/word/2018/wordml" xmlns:w16sdtdh="http://schemas.microsoft.com/office/word/2020/wordml/sdtdatahash" xmlns:w16sdtfl="http://schemas.microsoft.com/office/word/2024/wordml/sdtformatlock" xmlns:w16se="http://schemas.microsoft.com/office/word/2015/wordml/symex" xmlns:w16du="http://schemas.microsoft.com/office/word/2023/wordml/word16du" xmlns:wne="http://schemas.microsoft.com/office/word/2006/wordml" mc:Ignorable="w14 w15 w16se w16cid w16 w16cex w16sdtdh w16sdtfl w16du wp14">
   <w:p>
     <w:pPr>
       <w:pStyle w:val="Header"/>
@@ -7546,7 +7506,7 @@
       <w:rPr>
         <w:noProof/>
       </w:rPr>
-      <w:pict w14:anchorId="75895A06">
+      <w:pict w14:anchorId="09A1EF2B">
         <v:shapetype id="_x0000_t136" coordsize="21600,21600" o:spt="136" adj="10800" path="m@7,l@8,m@5,21600l@6,21600e">
           <v:formulas>
             <v:f eqn="sum #0 0 10800"/>
@@ -7571,7 +7531,7 @@
           </v:handles>
           <o:lock v:ext="edit" text="t" shapetype="t"/>
         </v:shapetype>
-        <v:shape id="_x0000_s2074" type="#_x0000_t136" alt="" style="position:absolute;margin-left:0;margin-top:0;width:410.05pt;height:249.6pt;rotation:315;z-index:-251637739;mso-wrap-edited:f;mso-width-percent:0;mso-height-percent:0;mso-position-horizontal:center;mso-position-horizontal-relative:margin;mso-position-vertical:center;mso-position-vertical-relative:margin;mso-width-percent:0;mso-height-percent:0" o:allowincell="f" fillcolor="#7f7f7f [1612]" stroked="f">
+        <v:shape id="_x0000_s1050" type="#_x0000_t136" alt="" style="position:absolute;margin-left:0;margin-top:0;width:410.05pt;height:249.6pt;rotation:315;z-index:-251637739;mso-wrap-edited:f;mso-width-percent:0;mso-height-percent:0;mso-position-horizontal:center;mso-position-horizontal-relative:margin;mso-position-vertical:center;mso-position-vertical-relative:margin;mso-width-percent:0;mso-height-percent:0" o:allowincell="f" fillcolor="#7f7f7f [1612]" stroked="f">
           <v:fill opacity="6553f"/>
           <v:textpath style="font-family:&quot;Helvetica Neue&quot;;font-size:1pt" string="JGS"/>
           <w10:wrap anchorx="margin" anchory="margin"/>
@@ -7582,7 +7542,7 @@
       <w:rPr>
         <w:noProof/>
       </w:rPr>
-      <w:pict w14:anchorId="00896132">
+      <w:pict w14:anchorId="72129ABD">
         <v:shapetype id="_x0000_t75" coordsize="21600,21600" o:spt="75" o:preferrelative="t" path="m@4@5l@4@11@9@11@9@5xe" filled="f" stroked="f">
           <v:stroke joinstyle="miter"/>
           <v:formulas>
@@ -7602,7 +7562,7 @@
           <v:path o:extrusionok="f" gradientshapeok="t" o:connecttype="rect"/>
           <o:lock v:ext="edit" aspectratio="t"/>
         </v:shapetype>
-        <v:shape id="_x0000_s2073" type="#_x0000_t75" alt="" style="position:absolute;margin-left:0;margin-top:0;width:459pt;height:594pt;z-index:-251658226;mso-wrap-edited:f;mso-width-percent:0;mso-height-percent:0;mso-position-horizontal:center;mso-position-horizontal-relative:margin;mso-position-vertical:center;mso-position-vertical-relative:margin;mso-width-percent:0;mso-height-percent:0" o:allowincell="f">
+        <v:shape id="_x0000_s1049" type="#_x0000_t75" alt="" style="position:absolute;margin-left:0;margin-top:0;width:459pt;height:594pt;z-index:-251658226;mso-wrap-edited:f;mso-width-percent:0;mso-height-percent:0;mso-position-horizontal:center;mso-position-horizontal-relative:margin;mso-position-vertical:center;mso-position-vertical-relative:margin;mso-width-percent:0;mso-height-percent:0" o:allowincell="f">
           <v:imagedata r:id="rId1" o:title="doc-front-page"/>
           <w10:wrap anchorx="margin" anchory="margin"/>
         </v:shape>
@@ -7612,8 +7572,8 @@
       <w:rPr>
         <w:noProof/>
       </w:rPr>
-      <w:pict w14:anchorId="39CDF604">
-        <v:shape id="_x0000_s2072" type="#_x0000_t75" alt="" style="position:absolute;margin-left:0;margin-top:0;width:459pt;height:594pt;z-index:-251658235;mso-wrap-edited:f;mso-width-percent:0;mso-height-percent:0;mso-position-horizontal:center;mso-position-horizontal-relative:margin;mso-position-vertical:center;mso-position-vertical-relative:margin;mso-width-percent:0;mso-height-percent:0" o:allowincell="f">
+      <w:pict w14:anchorId="0641AB9F">
+        <v:shape id="_x0000_s1048" type="#_x0000_t75" alt="" style="position:absolute;margin-left:0;margin-top:0;width:459pt;height:594pt;z-index:-251658235;mso-wrap-edited:f;mso-width-percent:0;mso-height-percent:0;mso-position-horizontal:center;mso-position-horizontal-relative:margin;mso-position-vertical:center;mso-position-vertical-relative:margin;mso-width-percent:0;mso-height-percent:0" o:allowincell="f">
           <v:imagedata r:id="rId1" o:title="doc-front-page"/>
           <w10:wrap anchorx="margin" anchory="margin"/>
         </v:shape>
@@ -7624,7 +7584,7 @@
 </file>
 
 <file path=word/header5.xml><?xml version="1.0" encoding="utf-8"?>
-<w:hdr xmlns:wpc="http://schemas.microsoft.com/office/word/2010/wordprocessingCanvas" xmlns:cx="http://schemas.microsoft.com/office/drawing/2014/chartex" xmlns:cx1="http://schemas.microsoft.com/office/drawing/2015/9/8/chartex" xmlns:cx2="http://schemas.microsoft.com/office/drawing/2015/10/21/chartex" xmlns:cx3="http://schemas.microsoft.com/office/drawing/2016/5/9/chartex" xmlns:cx4="http://schemas.microsoft.com/office/drawing/2016/5/10/chartex" xmlns:cx5="http://schemas.microsoft.com/office/drawing/2016/5/11/chartex" xmlns:cx6="http://schemas.microsoft.com/office/drawing/2016/5/12/chartex" xmlns:cx7="http://schemas.microsoft.com/office/drawing/2016/5/13/chartex" xmlns:cx8="http://schemas.microsoft.com/office/drawing/2016/5/14/chartex" xmlns:mc="http://schemas.openxmlformats.org/markup-compatibility/2006" xmlns:aink="http://schemas.microsoft.com/office/drawing/2016/ink" xmlns:am3d="http://schemas.microsoft.com/office/drawing/2017/model3d" xmlns:o="urn:schemas-microsoft-com:office:office" xmlns:r="http://schemas.openxmlformats.org/officeDocument/2006/relationships" xmlns:m="http://schemas.openxmlformats.org/officeDocument/2006/math" xmlns:v="urn:schemas-microsoft-com:vml" xmlns:wp14="http://schemas.microsoft.com/office/word/2010/wordprocessingDrawing" xmlns:wp="http://schemas.openxmlformats.org/drawingml/2006/wordprocessingDrawing" xmlns:w10="urn:schemas-microsoft-com:office:word" xmlns:w="http://schemas.openxmlformats.org/wordprocessingml/2006/main" xmlns:w14="http://schemas.microsoft.com/office/word/2010/wordml" xmlns:w15="http://schemas.microsoft.com/office/word/2012/wordml" xmlns:w16cid="http://schemas.microsoft.com/office/word/2016/wordml/cid" xmlns:w16se="http://schemas.microsoft.com/office/word/2015/wordml/symex" xmlns:wpg="http://schemas.microsoft.com/office/word/2010/wordprocessingGroup" xmlns:wpi="http://schemas.microsoft.com/office/word/2010/wordprocessingInk" xmlns:wne="http://schemas.microsoft.com/office/word/2006/wordml" xmlns:wps="http://schemas.microsoft.com/office/word/2010/wordprocessingShape" mc:Ignorable="w14 w15 w16se w16cid wp14">
+<w:hdr xmlns:wpc="http://schemas.microsoft.com/office/word/2010/wordprocessingCanvas" xmlns:cx="http://schemas.microsoft.com/office/drawing/2014/chartex" xmlns:cx1="http://schemas.microsoft.com/office/drawing/2015/9/8/chartex" xmlns:cx2="http://schemas.microsoft.com/office/drawing/2015/10/21/chartex" xmlns:cx3="http://schemas.microsoft.com/office/drawing/2016/5/9/chartex" xmlns:cx4="http://schemas.microsoft.com/office/drawing/2016/5/10/chartex" xmlns:cx5="http://schemas.microsoft.com/office/drawing/2016/5/11/chartex" xmlns:cx6="http://schemas.microsoft.com/office/drawing/2016/5/12/chartex" xmlns:cx7="http://schemas.microsoft.com/office/drawing/2016/5/13/chartex" xmlns:cx8="http://schemas.microsoft.com/office/drawing/2016/5/14/chartex" xmlns:mc="http://schemas.openxmlformats.org/markup-compatibility/2006" xmlns:m="http://schemas.openxmlformats.org/officeDocument/2006/math" xmlns:aink="http://schemas.microsoft.com/office/drawing/2016/ink" xmlns:am3d="http://schemas.microsoft.com/office/drawing/2017/model3d" xmlns:oel="http://schemas.microsoft.com/office/2019/extlst" xmlns:r="http://schemas.openxmlformats.org/officeDocument/2006/relationships" xmlns:wp14="http://schemas.microsoft.com/office/word/2010/wordprocessingDrawing" xmlns:wp="http://schemas.openxmlformats.org/drawingml/2006/wordprocessingDrawing" xmlns:wpg="http://schemas.microsoft.com/office/word/2010/wordprocessingGroup" xmlns:wpi="http://schemas.microsoft.com/office/word/2010/wordprocessingInk" xmlns:wps="http://schemas.microsoft.com/office/word/2010/wordprocessingShape" xmlns:o="urn:schemas-microsoft-com:office:office" xmlns:v="urn:schemas-microsoft-com:vml" xmlns:w10="urn:schemas-microsoft-com:office:word" xmlns:w="http://schemas.openxmlformats.org/wordprocessingml/2006/main" xmlns:w14="http://schemas.microsoft.com/office/word/2010/wordml" xmlns:w15="http://schemas.microsoft.com/office/word/2012/wordml" xmlns:w16cex="http://schemas.microsoft.com/office/word/2018/wordml/cex" xmlns:w16cid="http://schemas.microsoft.com/office/word/2016/wordml/cid" xmlns:w16="http://schemas.microsoft.com/office/word/2018/wordml" xmlns:w16sdtdh="http://schemas.microsoft.com/office/word/2020/wordml/sdtdatahash" xmlns:w16sdtfl="http://schemas.microsoft.com/office/word/2024/wordml/sdtformatlock" xmlns:w16se="http://schemas.microsoft.com/office/word/2015/wordml/symex" xmlns:w16du="http://schemas.microsoft.com/office/word/2023/wordml/word16du" xmlns:wne="http://schemas.microsoft.com/office/word/2006/wordml" mc:Ignorable="w14 w15 w16se w16cid w16 w16cex w16sdtdh w16sdtfl w16du wp14">
   <w:p>
     <w:pPr>
       <w:pStyle w:val="Header"/>
@@ -7633,7 +7593,7 @@
       <w:rPr>
         <w:noProof/>
       </w:rPr>
-      <w:pict w14:anchorId="63D0BB2E">
+      <w:pict w14:anchorId="250F925F">
         <v:shapetype id="_x0000_t136" coordsize="21600,21600" o:spt="136" adj="10800" path="m@7,l@8,m@5,21600l@6,21600e">
           <v:formulas>
             <v:f eqn="sum #0 0 10800"/>
@@ -7658,7 +7618,7 @@
           </v:handles>
           <o:lock v:ext="edit" text="t" shapetype="t"/>
         </v:shapetype>
-        <v:shape id="_x0000_s2071" type="#_x0000_t136" alt="" style="position:absolute;margin-left:0;margin-top:0;width:410.05pt;height:249.6pt;rotation:315;z-index:-251633643;mso-wrap-edited:f;mso-width-percent:0;mso-height-percent:0;mso-position-horizontal:center;mso-position-horizontal-relative:margin;mso-position-vertical:center;mso-position-vertical-relative:margin;mso-width-percent:0;mso-height-percent:0" o:allowincell="f" fillcolor="#7f7f7f [1612]" stroked="f">
+        <v:shape id="_x0000_s1047" type="#_x0000_t136" alt="" style="position:absolute;margin-left:0;margin-top:0;width:410.05pt;height:249.6pt;rotation:315;z-index:-251633643;mso-wrap-edited:f;mso-width-percent:0;mso-height-percent:0;mso-position-horizontal:center;mso-position-horizontal-relative:margin;mso-position-vertical:center;mso-position-vertical-relative:margin;mso-width-percent:0;mso-height-percent:0" o:allowincell="f" fillcolor="#7f7f7f [1612]" stroked="f">
           <v:fill opacity="6553f"/>
           <v:textpath style="font-family:&quot;Helvetica Neue&quot;;font-size:1pt" string="JGS"/>
           <w10:wrap anchorx="margin" anchory="margin"/>
@@ -7670,7 +7630,7 @@
 </file>
 
 <file path=word/header6.xml><?xml version="1.0" encoding="utf-8"?>
-<w:hdr xmlns:wpc="http://schemas.microsoft.com/office/word/2010/wordprocessingCanvas" xmlns:cx="http://schemas.microsoft.com/office/drawing/2014/chartex" xmlns:cx1="http://schemas.microsoft.com/office/drawing/2015/9/8/chartex" xmlns:cx2="http://schemas.microsoft.com/office/drawing/2015/10/21/chartex" xmlns:cx3="http://schemas.microsoft.com/office/drawing/2016/5/9/chartex" xmlns:cx4="http://schemas.microsoft.com/office/drawing/2016/5/10/chartex" xmlns:cx5="http://schemas.microsoft.com/office/drawing/2016/5/11/chartex" xmlns:cx6="http://schemas.microsoft.com/office/drawing/2016/5/12/chartex" xmlns:cx7="http://schemas.microsoft.com/office/drawing/2016/5/13/chartex" xmlns:cx8="http://schemas.microsoft.com/office/drawing/2016/5/14/chartex" xmlns:mc="http://schemas.openxmlformats.org/markup-compatibility/2006" xmlns:aink="http://schemas.microsoft.com/office/drawing/2016/ink" xmlns:am3d="http://schemas.microsoft.com/office/drawing/2017/model3d" xmlns:o="urn:schemas-microsoft-com:office:office" xmlns:r="http://schemas.openxmlformats.org/officeDocument/2006/relationships" xmlns:m="http://schemas.openxmlformats.org/officeDocument/2006/math" xmlns:v="urn:schemas-microsoft-com:vml" xmlns:wp14="http://schemas.microsoft.com/office/word/2010/wordprocessingDrawing" xmlns:wp="http://schemas.openxmlformats.org/drawingml/2006/wordprocessingDrawing" xmlns:w10="urn:schemas-microsoft-com:office:word" xmlns:w="http://schemas.openxmlformats.org/wordprocessingml/2006/main" xmlns:w14="http://schemas.microsoft.com/office/word/2010/wordml" xmlns:w15="http://schemas.microsoft.com/office/word/2012/wordml" xmlns:w16cid="http://schemas.microsoft.com/office/word/2016/wordml/cid" xmlns:w16se="http://schemas.microsoft.com/office/word/2015/wordml/symex" xmlns:wpg="http://schemas.microsoft.com/office/word/2010/wordprocessingGroup" xmlns:wpi="http://schemas.microsoft.com/office/word/2010/wordprocessingInk" xmlns:wne="http://schemas.microsoft.com/office/word/2006/wordml" xmlns:wps="http://schemas.microsoft.com/office/word/2010/wordprocessingShape" mc:Ignorable="w14 w15 w16se w16cid wp14">
+<w:hdr xmlns:wpc="http://schemas.microsoft.com/office/word/2010/wordprocessingCanvas" xmlns:cx="http://schemas.microsoft.com/office/drawing/2014/chartex" xmlns:cx1="http://schemas.microsoft.com/office/drawing/2015/9/8/chartex" xmlns:cx2="http://schemas.microsoft.com/office/drawing/2015/10/21/chartex" xmlns:cx3="http://schemas.microsoft.com/office/drawing/2016/5/9/chartex" xmlns:cx4="http://schemas.microsoft.com/office/drawing/2016/5/10/chartex" xmlns:cx5="http://schemas.microsoft.com/office/drawing/2016/5/11/chartex" xmlns:cx6="http://schemas.microsoft.com/office/drawing/2016/5/12/chartex" xmlns:cx7="http://schemas.microsoft.com/office/drawing/2016/5/13/chartex" xmlns:cx8="http://schemas.microsoft.com/office/drawing/2016/5/14/chartex" xmlns:mc="http://schemas.openxmlformats.org/markup-compatibility/2006" xmlns:m="http://schemas.openxmlformats.org/officeDocument/2006/math" xmlns:aink="http://schemas.microsoft.com/office/drawing/2016/ink" xmlns:am3d="http://schemas.microsoft.com/office/drawing/2017/model3d" xmlns:oel="http://schemas.microsoft.com/office/2019/extlst" xmlns:r="http://schemas.openxmlformats.org/officeDocument/2006/relationships" xmlns:wp14="http://schemas.microsoft.com/office/word/2010/wordprocessingDrawing" xmlns:wp="http://schemas.openxmlformats.org/drawingml/2006/wordprocessingDrawing" xmlns:wpg="http://schemas.microsoft.com/office/word/2010/wordprocessingGroup" xmlns:wpi="http://schemas.microsoft.com/office/word/2010/wordprocessingInk" xmlns:wps="http://schemas.microsoft.com/office/word/2010/wordprocessingShape" xmlns:o="urn:schemas-microsoft-com:office:office" xmlns:v="urn:schemas-microsoft-com:vml" xmlns:w10="urn:schemas-microsoft-com:office:word" xmlns:w="http://schemas.openxmlformats.org/wordprocessingml/2006/main" xmlns:w14="http://schemas.microsoft.com/office/word/2010/wordml" xmlns:w15="http://schemas.microsoft.com/office/word/2012/wordml" xmlns:w16cex="http://schemas.microsoft.com/office/word/2018/wordml/cex" xmlns:w16cid="http://schemas.microsoft.com/office/word/2016/wordml/cid" xmlns:w16="http://schemas.microsoft.com/office/word/2018/wordml" xmlns:w16sdtdh="http://schemas.microsoft.com/office/word/2020/wordml/sdtdatahash" xmlns:w16sdtfl="http://schemas.microsoft.com/office/word/2024/wordml/sdtformatlock" xmlns:w16se="http://schemas.microsoft.com/office/word/2015/wordml/symex" xmlns:w16du="http://schemas.microsoft.com/office/word/2023/wordml/word16du" xmlns:wne="http://schemas.microsoft.com/office/word/2006/wordml" mc:Ignorable="w14 w15 w16se w16cid w16 w16cex w16sdtdh w16sdtfl w16du wp14">
   <w:p>
     <w:pPr>
       <w:pStyle w:val="Header"/>
@@ -7679,7 +7639,7 @@
       <w:rPr>
         <w:noProof/>
       </w:rPr>
-      <w:pict w14:anchorId="0931179C">
+      <w:pict w14:anchorId="3BFB5354">
         <v:shapetype id="_x0000_t136" coordsize="21600,21600" o:spt="136" adj="10800" path="m@7,l@8,m@5,21600l@6,21600e">
           <v:formulas>
             <v:f eqn="sum #0 0 10800"/>
@@ -7704,7 +7664,7 @@
           </v:handles>
           <o:lock v:ext="edit" text="t" shapetype="t"/>
         </v:shapetype>
-        <v:shape id="_x0000_s2070" type="#_x0000_t136" alt="" style="position:absolute;margin-left:0;margin-top:0;width:410.05pt;height:249.6pt;rotation:315;z-index:-251641835;mso-wrap-edited:f;mso-width-percent:0;mso-height-percent:0;mso-position-horizontal:center;mso-position-horizontal-relative:margin;mso-position-vertical:center;mso-position-vertical-relative:margin;mso-width-percent:0;mso-height-percent:0" o:allowincell="f" fillcolor="#7f7f7f [1612]" stroked="f">
+        <v:shape id="_x0000_s1046" type="#_x0000_t136" alt="" style="position:absolute;margin-left:0;margin-top:0;width:410.05pt;height:249.6pt;rotation:315;z-index:-251641835;mso-wrap-edited:f;mso-width-percent:0;mso-height-percent:0;mso-position-horizontal:center;mso-position-horizontal-relative:margin;mso-position-vertical:center;mso-position-vertical-relative:margin;mso-width-percent:0;mso-height-percent:0" o:allowincell="f" fillcolor="#7f7f7f [1612]" stroked="f">
           <v:fill opacity="6553f"/>
           <v:textpath style="font-family:&quot;Helvetica Neue&quot;;font-size:1pt" string="JGS"/>
           <w10:wrap anchorx="margin" anchory="margin"/>
@@ -7715,7 +7675,7 @@
       <w:rPr>
         <w:noProof/>
       </w:rPr>
-      <w:pict w14:anchorId="423BA528">
+      <w:pict w14:anchorId="390B126D">
         <v:shapetype id="_x0000_t75" coordsize="21600,21600" o:spt="75" o:preferrelative="t" path="m@4@5l@4@11@9@11@9@5xe" filled="f" stroked="f">
           <v:stroke joinstyle="miter"/>
           <v:formulas>
@@ -7735,7 +7695,7 @@
           <v:path o:extrusionok="f" gradientshapeok="t" o:connecttype="rect"/>
           <o:lock v:ext="edit" aspectratio="t"/>
         </v:shapetype>
-        <v:shape id="_x0000_s2069" type="#_x0000_t75" alt="" style="position:absolute;margin-left:0;margin-top:0;width:459pt;height:594pt;z-index:-251658227;mso-wrap-edited:f;mso-width-percent:0;mso-height-percent:0;mso-position-horizontal:center;mso-position-horizontal-relative:margin;mso-position-vertical:center;mso-position-vertical-relative:margin;mso-width-percent:0;mso-height-percent:0" o:allowincell="f">
+        <v:shape id="_x0000_s1045" type="#_x0000_t75" alt="" style="position:absolute;margin-left:0;margin-top:0;width:459pt;height:594pt;z-index:-251658227;mso-wrap-edited:f;mso-width-percent:0;mso-height-percent:0;mso-position-horizontal:center;mso-position-horizontal-relative:margin;mso-position-vertical:center;mso-position-vertical-relative:margin;mso-width-percent:0;mso-height-percent:0" o:allowincell="f">
           <v:imagedata r:id="rId1" o:title="doc-front-page"/>
           <w10:wrap anchorx="margin" anchory="margin"/>
         </v:shape>
@@ -7745,8 +7705,8 @@
       <w:rPr>
         <w:noProof/>
       </w:rPr>
-      <w:pict w14:anchorId="19C83090">
-        <v:shape id="_x0000_s2068" type="#_x0000_t75" alt="" style="position:absolute;margin-left:0;margin-top:0;width:459pt;height:594pt;z-index:-251658236;mso-wrap-edited:f;mso-width-percent:0;mso-height-percent:0;mso-position-horizontal:center;mso-position-horizontal-relative:margin;mso-position-vertical:center;mso-position-vertical-relative:margin;mso-width-percent:0;mso-height-percent:0" o:allowincell="f">
+      <w:pict w14:anchorId="6AE3C2F1">
+        <v:shape id="_x0000_s1044" type="#_x0000_t75" alt="" style="position:absolute;margin-left:0;margin-top:0;width:459pt;height:594pt;z-index:-251658236;mso-wrap-edited:f;mso-width-percent:0;mso-height-percent:0;mso-position-horizontal:center;mso-position-horizontal-relative:margin;mso-position-vertical:center;mso-position-vertical-relative:margin;mso-width-percent:0;mso-height-percent:0" o:allowincell="f">
           <v:imagedata r:id="rId1" o:title="doc-front-page"/>
           <w10:wrap anchorx="margin" anchory="margin"/>
         </v:shape>
@@ -7757,7 +7717,7 @@
 </file>
 
 <file path=word/header7.xml><?xml version="1.0" encoding="utf-8"?>
-<w:hdr xmlns:wpc="http://schemas.microsoft.com/office/word/2010/wordprocessingCanvas" xmlns:cx="http://schemas.microsoft.com/office/drawing/2014/chartex" xmlns:cx1="http://schemas.microsoft.com/office/drawing/2015/9/8/chartex" xmlns:cx2="http://schemas.microsoft.com/office/drawing/2015/10/21/chartex" xmlns:cx3="http://schemas.microsoft.com/office/drawing/2016/5/9/chartex" xmlns:cx4="http://schemas.microsoft.com/office/drawing/2016/5/10/chartex" xmlns:cx5="http://schemas.microsoft.com/office/drawing/2016/5/11/chartex" xmlns:cx6="http://schemas.microsoft.com/office/drawing/2016/5/12/chartex" xmlns:cx7="http://schemas.microsoft.com/office/drawing/2016/5/13/chartex" xmlns:cx8="http://schemas.microsoft.com/office/drawing/2016/5/14/chartex" xmlns:mc="http://schemas.openxmlformats.org/markup-compatibility/2006" xmlns:aink="http://schemas.microsoft.com/office/drawing/2016/ink" xmlns:am3d="http://schemas.microsoft.com/office/drawing/2017/model3d" xmlns:o="urn:schemas-microsoft-com:office:office" xmlns:r="http://schemas.openxmlformats.org/officeDocument/2006/relationships" xmlns:m="http://schemas.openxmlformats.org/officeDocument/2006/math" xmlns:v="urn:schemas-microsoft-com:vml" xmlns:wp14="http://schemas.microsoft.com/office/word/2010/wordprocessingDrawing" xmlns:wp="http://schemas.openxmlformats.org/drawingml/2006/wordprocessingDrawing" xmlns:w10="urn:schemas-microsoft-com:office:word" xmlns:w="http://schemas.openxmlformats.org/wordprocessingml/2006/main" xmlns:w14="http://schemas.microsoft.com/office/word/2010/wordml" xmlns:w15="http://schemas.microsoft.com/office/word/2012/wordml" xmlns:w16cid="http://schemas.microsoft.com/office/word/2016/wordml/cid" xmlns:w16se="http://schemas.microsoft.com/office/word/2015/wordml/symex" xmlns:wpg="http://schemas.microsoft.com/office/word/2010/wordprocessingGroup" xmlns:wpi="http://schemas.microsoft.com/office/word/2010/wordprocessingInk" xmlns:wne="http://schemas.microsoft.com/office/word/2006/wordml" xmlns:wps="http://schemas.microsoft.com/office/word/2010/wordprocessingShape" mc:Ignorable="w14 w15 w16se w16cid wp14">
+<w:hdr xmlns:wpc="http://schemas.microsoft.com/office/word/2010/wordprocessingCanvas" xmlns:cx="http://schemas.microsoft.com/office/drawing/2014/chartex" xmlns:cx1="http://schemas.microsoft.com/office/drawing/2015/9/8/chartex" xmlns:cx2="http://schemas.microsoft.com/office/drawing/2015/10/21/chartex" xmlns:cx3="http://schemas.microsoft.com/office/drawing/2016/5/9/chartex" xmlns:cx4="http://schemas.microsoft.com/office/drawing/2016/5/10/chartex" xmlns:cx5="http://schemas.microsoft.com/office/drawing/2016/5/11/chartex" xmlns:cx6="http://schemas.microsoft.com/office/drawing/2016/5/12/chartex" xmlns:cx7="http://schemas.microsoft.com/office/drawing/2016/5/13/chartex" xmlns:cx8="http://schemas.microsoft.com/office/drawing/2016/5/14/chartex" xmlns:mc="http://schemas.openxmlformats.org/markup-compatibility/2006" xmlns:m="http://schemas.openxmlformats.org/officeDocument/2006/math" xmlns:aink="http://schemas.microsoft.com/office/drawing/2016/ink" xmlns:am3d="http://schemas.microsoft.com/office/drawing/2017/model3d" xmlns:oel="http://schemas.microsoft.com/office/2019/extlst" xmlns:r="http://schemas.openxmlformats.org/officeDocument/2006/relationships" xmlns:wp14="http://schemas.microsoft.com/office/word/2010/wordprocessingDrawing" xmlns:wp="http://schemas.openxmlformats.org/drawingml/2006/wordprocessingDrawing" xmlns:wpg="http://schemas.microsoft.com/office/word/2010/wordprocessingGroup" xmlns:wpi="http://schemas.microsoft.com/office/word/2010/wordprocessingInk" xmlns:wps="http://schemas.microsoft.com/office/word/2010/wordprocessingShape" xmlns:o="urn:schemas-microsoft-com:office:office" xmlns:v="urn:schemas-microsoft-com:vml" xmlns:w10="urn:schemas-microsoft-com:office:word" xmlns:w="http://schemas.openxmlformats.org/wordprocessingml/2006/main" xmlns:w14="http://schemas.microsoft.com/office/word/2010/wordml" xmlns:w15="http://schemas.microsoft.com/office/word/2012/wordml" xmlns:w16cex="http://schemas.microsoft.com/office/word/2018/wordml/cex" xmlns:w16cid="http://schemas.microsoft.com/office/word/2016/wordml/cid" xmlns:w16="http://schemas.microsoft.com/office/word/2018/wordml" xmlns:w16sdtdh="http://schemas.microsoft.com/office/word/2020/wordml/sdtdatahash" xmlns:w16sdtfl="http://schemas.microsoft.com/office/word/2024/wordml/sdtformatlock" xmlns:w16se="http://schemas.microsoft.com/office/word/2015/wordml/symex" xmlns:w16du="http://schemas.microsoft.com/office/word/2023/wordml/word16du" xmlns:wne="http://schemas.microsoft.com/office/word/2006/wordml" mc:Ignorable="w14 w15 w16se w16cid w16 w16cex w16sdtdh w16sdtfl w16du wp14">
   <w:p>
     <w:pPr>
       <w:pStyle w:val="Header"/>
@@ -7766,7 +7726,7 @@
       <w:rPr>
         <w:noProof/>
       </w:rPr>
-      <w:pict w14:anchorId="33C167E1">
+      <w:pict w14:anchorId="71755620">
         <v:shapetype id="_x0000_t136" coordsize="21600,21600" o:spt="136" adj="10800" path="m@7,l@8,m@5,21600l@6,21600e">
           <v:formulas>
             <v:f eqn="sum #0 0 10800"/>
@@ -7791,7 +7751,7 @@
           </v:handles>
           <o:lock v:ext="edit" text="t" shapetype="t"/>
         </v:shapetype>
-        <v:shape id="_x0000_s2067" type="#_x0000_t136" alt="" style="position:absolute;margin-left:0;margin-top:0;width:410.05pt;height:249.6pt;rotation:315;z-index:-251625451;mso-wrap-edited:f;mso-width-percent:0;mso-height-percent:0;mso-position-horizontal:center;mso-position-horizontal-relative:margin;mso-position-vertical:center;mso-position-vertical-relative:margin;mso-width-percent:0;mso-height-percent:0" o:allowincell="f" fillcolor="#7f7f7f [1612]" stroked="f">
+        <v:shape id="_x0000_s1043" type="#_x0000_t136" alt="" style="position:absolute;margin-left:0;margin-top:0;width:410.05pt;height:249.6pt;rotation:315;z-index:-251625451;mso-wrap-edited:f;mso-width-percent:0;mso-height-percent:0;mso-position-horizontal:center;mso-position-horizontal-relative:margin;mso-position-vertical:center;mso-position-vertical-relative:margin;mso-width-percent:0;mso-height-percent:0" o:allowincell="f" fillcolor="#7f7f7f [1612]" stroked="f">
           <v:fill opacity="6553f"/>
           <v:textpath style="font-family:&quot;Helvetica Neue&quot;;font-size:1pt" string="JGS"/>
           <w10:wrap anchorx="margin" anchory="margin"/>
@@ -7802,7 +7762,7 @@
       <w:rPr>
         <w:noProof/>
       </w:rPr>
-      <w:pict w14:anchorId="0A4DD537">
+      <w:pict w14:anchorId="18FCE028">
         <v:shapetype id="_x0000_t75" coordsize="21600,21600" o:spt="75" o:preferrelative="t" path="m@4@5l@4@11@9@11@9@5xe" filled="f" stroked="f">
           <v:stroke joinstyle="miter"/>
           <v:formulas>
@@ -7822,7 +7782,7 @@
           <v:path o:extrusionok="f" gradientshapeok="t" o:connecttype="rect"/>
           <o:lock v:ext="edit" aspectratio="t"/>
         </v:shapetype>
-        <v:shape id="_x0000_s2066" type="#_x0000_t75" alt="" style="position:absolute;margin-left:0;margin-top:0;width:459pt;height:594pt;z-index:-251658225;mso-wrap-edited:f;mso-width-percent:0;mso-height-percent:0;mso-position-horizontal:center;mso-position-horizontal-relative:margin;mso-position-vertical:center;mso-position-vertical-relative:margin;mso-width-percent:0;mso-height-percent:0" o:allowincell="f">
+        <v:shape id="_x0000_s1042" type="#_x0000_t75" alt="" style="position:absolute;margin-left:0;margin-top:0;width:459pt;height:594pt;z-index:-251658225;mso-wrap-edited:f;mso-width-percent:0;mso-height-percent:0;mso-position-horizontal:center;mso-position-horizontal-relative:margin;mso-position-vertical:center;mso-position-vertical-relative:margin;mso-width-percent:0;mso-height-percent:0" o:allowincell="f">
           <v:imagedata r:id="rId1" o:title="doc-front-page"/>
           <w10:wrap anchorx="margin" anchory="margin"/>
         </v:shape>
@@ -7832,8 +7792,8 @@
       <w:rPr>
         <w:noProof/>
       </w:rPr>
-      <w:pict w14:anchorId="05AAD517">
-        <v:shape id="_x0000_s2065" type="#_x0000_t75" alt="" style="position:absolute;margin-left:0;margin-top:0;width:459pt;height:594pt;z-index:-251658234;mso-wrap-edited:f;mso-width-percent:0;mso-height-percent:0;mso-position-horizontal:center;mso-position-horizontal-relative:margin;mso-position-vertical:center;mso-position-vertical-relative:margin;mso-width-percent:0;mso-height-percent:0" o:allowincell="f">
+      <w:pict w14:anchorId="1A1CABE2">
+        <v:shape id="_x0000_s1041" type="#_x0000_t75" alt="" style="position:absolute;margin-left:0;margin-top:0;width:459pt;height:594pt;z-index:-251658234;mso-wrap-edited:f;mso-width-percent:0;mso-height-percent:0;mso-position-horizontal:center;mso-position-horizontal-relative:margin;mso-position-vertical:center;mso-position-vertical-relative:margin;mso-width-percent:0;mso-height-percent:0" o:allowincell="f">
           <v:imagedata r:id="rId1" o:title="doc-front-page"/>
           <w10:wrap anchorx="margin" anchory="margin"/>
         </v:shape>
@@ -7844,7 +7804,7 @@
 </file>
 
 <file path=word/header8.xml><?xml version="1.0" encoding="utf-8"?>
-<w:hdr xmlns:wpc="http://schemas.microsoft.com/office/word/2010/wordprocessingCanvas" xmlns:cx="http://schemas.microsoft.com/office/drawing/2014/chartex" xmlns:cx1="http://schemas.microsoft.com/office/drawing/2015/9/8/chartex" xmlns:cx2="http://schemas.microsoft.com/office/drawing/2015/10/21/chartex" xmlns:cx3="http://schemas.microsoft.com/office/drawing/2016/5/9/chartex" xmlns:cx4="http://schemas.microsoft.com/office/drawing/2016/5/10/chartex" xmlns:cx5="http://schemas.microsoft.com/office/drawing/2016/5/11/chartex" xmlns:cx6="http://schemas.microsoft.com/office/drawing/2016/5/12/chartex" xmlns:cx7="http://schemas.microsoft.com/office/drawing/2016/5/13/chartex" xmlns:cx8="http://schemas.microsoft.com/office/drawing/2016/5/14/chartex" xmlns:mc="http://schemas.openxmlformats.org/markup-compatibility/2006" xmlns:aink="http://schemas.microsoft.com/office/drawing/2016/ink" xmlns:am3d="http://schemas.microsoft.com/office/drawing/2017/model3d" xmlns:o="urn:schemas-microsoft-com:office:office" xmlns:r="http://schemas.openxmlformats.org/officeDocument/2006/relationships" xmlns:m="http://schemas.openxmlformats.org/officeDocument/2006/math" xmlns:v="urn:schemas-microsoft-com:vml" xmlns:wp14="http://schemas.microsoft.com/office/word/2010/wordprocessingDrawing" xmlns:wp="http://schemas.openxmlformats.org/drawingml/2006/wordprocessingDrawing" xmlns:w10="urn:schemas-microsoft-com:office:word" xmlns:w="http://schemas.openxmlformats.org/wordprocessingml/2006/main" xmlns:w14="http://schemas.microsoft.com/office/word/2010/wordml" xmlns:w15="http://schemas.microsoft.com/office/word/2012/wordml" xmlns:w16cid="http://schemas.microsoft.com/office/word/2016/wordml/cid" xmlns:w16se="http://schemas.microsoft.com/office/word/2015/wordml/symex" xmlns:wpg="http://schemas.microsoft.com/office/word/2010/wordprocessingGroup" xmlns:wpi="http://schemas.microsoft.com/office/word/2010/wordprocessingInk" xmlns:wne="http://schemas.microsoft.com/office/word/2006/wordml" xmlns:wps="http://schemas.microsoft.com/office/word/2010/wordprocessingShape" mc:Ignorable="w14 w15 w16se w16cid wp14">
+<w:hdr xmlns:wpc="http://schemas.microsoft.com/office/word/2010/wordprocessingCanvas" xmlns:cx="http://schemas.microsoft.com/office/drawing/2014/chartex" xmlns:cx1="http://schemas.microsoft.com/office/drawing/2015/9/8/chartex" xmlns:cx2="http://schemas.microsoft.com/office/drawing/2015/10/21/chartex" xmlns:cx3="http://schemas.microsoft.com/office/drawing/2016/5/9/chartex" xmlns:cx4="http://schemas.microsoft.com/office/drawing/2016/5/10/chartex" xmlns:cx5="http://schemas.microsoft.com/office/drawing/2016/5/11/chartex" xmlns:cx6="http://schemas.microsoft.com/office/drawing/2016/5/12/chartex" xmlns:cx7="http://schemas.microsoft.com/office/drawing/2016/5/13/chartex" xmlns:cx8="http://schemas.microsoft.com/office/drawing/2016/5/14/chartex" xmlns:mc="http://schemas.openxmlformats.org/markup-compatibility/2006" xmlns:m="http://schemas.openxmlformats.org/officeDocument/2006/math" xmlns:aink="http://schemas.microsoft.com/office/drawing/2016/ink" xmlns:am3d="http://schemas.microsoft.com/office/drawing/2017/model3d" xmlns:oel="http://schemas.microsoft.com/office/2019/extlst" xmlns:r="http://schemas.openxmlformats.org/officeDocument/2006/relationships" xmlns:wp14="http://schemas.microsoft.com/office/word/2010/wordprocessingDrawing" xmlns:wp="http://schemas.openxmlformats.org/drawingml/2006/wordprocessingDrawing" xmlns:wpg="http://schemas.microsoft.com/office/word/2010/wordprocessingGroup" xmlns:wpi="http://schemas.microsoft.com/office/word/2010/wordprocessingInk" xmlns:wps="http://schemas.microsoft.com/office/word/2010/wordprocessingShape" xmlns:o="urn:schemas-microsoft-com:office:office" xmlns:v="urn:schemas-microsoft-com:vml" xmlns:w10="urn:schemas-microsoft-com:office:word" xmlns:w="http://schemas.openxmlformats.org/wordprocessingml/2006/main" xmlns:w14="http://schemas.microsoft.com/office/word/2010/wordml" xmlns:w15="http://schemas.microsoft.com/office/word/2012/wordml" xmlns:w16cex="http://schemas.microsoft.com/office/word/2018/wordml/cex" xmlns:w16cid="http://schemas.microsoft.com/office/word/2016/wordml/cid" xmlns:w16="http://schemas.microsoft.com/office/word/2018/wordml" xmlns:w16sdtdh="http://schemas.microsoft.com/office/word/2020/wordml/sdtdatahash" xmlns:w16sdtfl="http://schemas.microsoft.com/office/word/2024/wordml/sdtformatlock" xmlns:w16se="http://schemas.microsoft.com/office/word/2015/wordml/symex" xmlns:w16du="http://schemas.microsoft.com/office/word/2023/wordml/word16du" xmlns:wne="http://schemas.microsoft.com/office/word/2006/wordml" mc:Ignorable="w14 w15 w16se w16cid w16 w16cex w16sdtdh w16sdtfl w16du wp14">
   <w:p>
     <w:pPr>
       <w:pStyle w:val="Header"/>
@@ -7853,7 +7813,7 @@
       <w:rPr>
         <w:noProof/>
       </w:rPr>
-      <w:pict w14:anchorId="7F671B7F">
+      <w:pict w14:anchorId="3E4B3B0A">
         <v:shapetype id="_x0000_t136" coordsize="21600,21600" o:spt="136" adj="10800" path="m@7,l@8,m@5,21600l@6,21600e">
           <v:formulas>
             <v:f eqn="sum #0 0 10800"/>
@@ -7878,7 +7838,7 @@
           </v:handles>
           <o:lock v:ext="edit" text="t" shapetype="t"/>
         </v:shapetype>
-        <v:shape id="_x0000_s2064" type="#_x0000_t136" alt="" style="position:absolute;margin-left:0;margin-top:0;width:410.05pt;height:249.6pt;rotation:315;z-index:-251621355;mso-wrap-edited:f;mso-width-percent:0;mso-height-percent:0;mso-position-horizontal:center;mso-position-horizontal-relative:margin;mso-position-vertical:center;mso-position-vertical-relative:margin;mso-width-percent:0;mso-height-percent:0" o:allowincell="f" fillcolor="#7f7f7f [1612]" stroked="f">
+        <v:shape id="_x0000_s1040" type="#_x0000_t136" alt="" style="position:absolute;margin-left:0;margin-top:0;width:410.05pt;height:249.6pt;rotation:315;z-index:-251621355;mso-wrap-edited:f;mso-width-percent:0;mso-height-percent:0;mso-position-horizontal:center;mso-position-horizontal-relative:margin;mso-position-vertical:center;mso-position-vertical-relative:margin;mso-width-percent:0;mso-height-percent:0" o:allowincell="f" fillcolor="#7f7f7f [1612]" stroked="f">
           <v:fill opacity="6553f"/>
           <v:textpath style="font-family:&quot;Helvetica Neue&quot;;font-size:1pt" string="JGS"/>
           <w10:wrap anchorx="margin" anchory="margin"/>
@@ -7889,7 +7849,7 @@
       <w:rPr>
         <w:noProof/>
       </w:rPr>
-      <w:pict w14:anchorId="1FBA5C74">
+      <w:pict w14:anchorId="7836F5D7">
         <v:shapetype id="_x0000_t75" coordsize="21600,21600" o:spt="75" o:preferrelative="t" path="m@4@5l@4@11@9@11@9@5xe" filled="f" stroked="f">
           <v:stroke joinstyle="miter"/>
           <v:formulas>
@@ -7909,7 +7869,7 @@
           <v:path o:extrusionok="f" gradientshapeok="t" o:connecttype="rect"/>
           <o:lock v:ext="edit" aspectratio="t"/>
         </v:shapetype>
-        <v:shape id="_x0000_s2063" type="#_x0000_t75" alt="" style="position:absolute;margin-left:0;margin-top:0;width:459pt;height:594pt;z-index:-251658224;mso-wrap-edited:f;mso-width-percent:0;mso-height-percent:0;mso-position-horizontal:center;mso-position-horizontal-relative:margin;mso-position-vertical:center;mso-position-vertical-relative:margin;mso-width-percent:0;mso-height-percent:0" o:allowincell="f">
+        <v:shape id="_x0000_s1039" type="#_x0000_t75" alt="" style="position:absolute;margin-left:0;margin-top:0;width:459pt;height:594pt;z-index:-251658224;mso-wrap-edited:f;mso-width-percent:0;mso-height-percent:0;mso-position-horizontal:center;mso-position-horizontal-relative:margin;mso-position-vertical:center;mso-position-vertical-relative:margin;mso-width-percent:0;mso-height-percent:0" o:allowincell="f">
           <v:imagedata r:id="rId1" o:title="doc-front-page"/>
           <w10:wrap anchorx="margin" anchory="margin"/>
         </v:shape>
@@ -7919,8 +7879,8 @@
       <w:rPr>
         <w:noProof/>
       </w:rPr>
-      <w:pict w14:anchorId="2D47C4C3">
-        <v:shape id="_x0000_s2062" type="#_x0000_t75" alt="" style="position:absolute;margin-left:0;margin-top:0;width:459pt;height:594pt;z-index:-251658233;mso-wrap-edited:f;mso-width-percent:0;mso-height-percent:0;mso-position-horizontal:center;mso-position-horizontal-relative:margin;mso-position-vertical:center;mso-position-vertical-relative:margin;mso-width-percent:0;mso-height-percent:0" o:allowincell="f">
+      <w:pict w14:anchorId="3638118E">
+        <v:shape id="_x0000_s1038" type="#_x0000_t75" alt="" style="position:absolute;margin-left:0;margin-top:0;width:459pt;height:594pt;z-index:-251658233;mso-wrap-edited:f;mso-width-percent:0;mso-height-percent:0;mso-position-horizontal:center;mso-position-horizontal-relative:margin;mso-position-vertical:center;mso-position-vertical-relative:margin;mso-width-percent:0;mso-height-percent:0" o:allowincell="f">
           <v:imagedata r:id="rId1" o:title="doc-front-page"/>
           <w10:wrap anchorx="margin" anchory="margin"/>
         </v:shape>
@@ -7931,7 +7891,7 @@
 </file>
 
 <file path=word/header9.xml><?xml version="1.0" encoding="utf-8"?>
-<w:hdr xmlns:wpc="http://schemas.microsoft.com/office/word/2010/wordprocessingCanvas" xmlns:cx="http://schemas.microsoft.com/office/drawing/2014/chartex" xmlns:cx1="http://schemas.microsoft.com/office/drawing/2015/9/8/chartex" xmlns:cx2="http://schemas.microsoft.com/office/drawing/2015/10/21/chartex" xmlns:cx3="http://schemas.microsoft.com/office/drawing/2016/5/9/chartex" xmlns:cx4="http://schemas.microsoft.com/office/drawing/2016/5/10/chartex" xmlns:cx5="http://schemas.microsoft.com/office/drawing/2016/5/11/chartex" xmlns:cx6="http://schemas.microsoft.com/office/drawing/2016/5/12/chartex" xmlns:cx7="http://schemas.microsoft.com/office/drawing/2016/5/13/chartex" xmlns:cx8="http://schemas.microsoft.com/office/drawing/2016/5/14/chartex" xmlns:mc="http://schemas.openxmlformats.org/markup-compatibility/2006" xmlns:aink="http://schemas.microsoft.com/office/drawing/2016/ink" xmlns:am3d="http://schemas.microsoft.com/office/drawing/2017/model3d" xmlns:o="urn:schemas-microsoft-com:office:office" xmlns:r="http://schemas.openxmlformats.org/officeDocument/2006/relationships" xmlns:m="http://schemas.openxmlformats.org/officeDocument/2006/math" xmlns:v="urn:schemas-microsoft-com:vml" xmlns:wp14="http://schemas.microsoft.com/office/word/2010/wordprocessingDrawing" xmlns:wp="http://schemas.openxmlformats.org/drawingml/2006/wordprocessingDrawing" xmlns:w10="urn:schemas-microsoft-com:office:word" xmlns:w="http://schemas.openxmlformats.org/wordprocessingml/2006/main" xmlns:w14="http://schemas.microsoft.com/office/word/2010/wordml" xmlns:w15="http://schemas.microsoft.com/office/word/2012/wordml" xmlns:w16cid="http://schemas.microsoft.com/office/word/2016/wordml/cid" xmlns:w16se="http://schemas.microsoft.com/office/word/2015/wordml/symex" xmlns:wpg="http://schemas.microsoft.com/office/word/2010/wordprocessingGroup" xmlns:wpi="http://schemas.microsoft.com/office/word/2010/wordprocessingInk" xmlns:wne="http://schemas.microsoft.com/office/word/2006/wordml" xmlns:wps="http://schemas.microsoft.com/office/word/2010/wordprocessingShape" mc:Ignorable="w14 w15 w16se w16cid wp14">
+<w:hdr xmlns:wpc="http://schemas.microsoft.com/office/word/2010/wordprocessingCanvas" xmlns:cx="http://schemas.microsoft.com/office/drawing/2014/chartex" xmlns:cx1="http://schemas.microsoft.com/office/drawing/2015/9/8/chartex" xmlns:cx2="http://schemas.microsoft.com/office/drawing/2015/10/21/chartex" xmlns:cx3="http://schemas.microsoft.com/office/drawing/2016/5/9/chartex" xmlns:cx4="http://schemas.microsoft.com/office/drawing/2016/5/10/chartex" xmlns:cx5="http://schemas.microsoft.com/office/drawing/2016/5/11/chartex" xmlns:cx6="http://schemas.microsoft.com/office/drawing/2016/5/12/chartex" xmlns:cx7="http://schemas.microsoft.com/office/drawing/2016/5/13/chartex" xmlns:cx8="http://schemas.microsoft.com/office/drawing/2016/5/14/chartex" xmlns:mc="http://schemas.openxmlformats.org/markup-compatibility/2006" xmlns:m="http://schemas.openxmlformats.org/officeDocument/2006/math" xmlns:aink="http://schemas.microsoft.com/office/drawing/2016/ink" xmlns:am3d="http://schemas.microsoft.com/office/drawing/2017/model3d" xmlns:oel="http://schemas.microsoft.com/office/2019/extlst" xmlns:r="http://schemas.openxmlformats.org/officeDocument/2006/relationships" xmlns:wp14="http://schemas.microsoft.com/office/word/2010/wordprocessingDrawing" xmlns:wp="http://schemas.openxmlformats.org/drawingml/2006/wordprocessingDrawing" xmlns:wpg="http://schemas.microsoft.com/office/word/2010/wordprocessingGroup" xmlns:wpi="http://schemas.microsoft.com/office/word/2010/wordprocessingInk" xmlns:wps="http://schemas.microsoft.com/office/word/2010/wordprocessingShape" xmlns:o="urn:schemas-microsoft-com:office:office" xmlns:v="urn:schemas-microsoft-com:vml" xmlns:w10="urn:schemas-microsoft-com:office:word" xmlns:w="http://schemas.openxmlformats.org/wordprocessingml/2006/main" xmlns:w14="http://schemas.microsoft.com/office/word/2010/wordml" xmlns:w15="http://schemas.microsoft.com/office/word/2012/wordml" xmlns:w16cex="http://schemas.microsoft.com/office/word/2018/wordml/cex" xmlns:w16cid="http://schemas.microsoft.com/office/word/2016/wordml/cid" xmlns:w16="http://schemas.microsoft.com/office/word/2018/wordml" xmlns:w16sdtdh="http://schemas.microsoft.com/office/word/2020/wordml/sdtdatahash" xmlns:w16sdtfl="http://schemas.microsoft.com/office/word/2024/wordml/sdtformatlock" xmlns:w16se="http://schemas.microsoft.com/office/word/2015/wordml/symex" xmlns:w16du="http://schemas.microsoft.com/office/word/2023/wordml/word16du" xmlns:wne="http://schemas.microsoft.com/office/word/2006/wordml" mc:Ignorable="w14 w15 w16se w16cid w16 w16cex w16sdtdh w16sdtfl w16du wp14">
   <w:p>
     <w:pPr>
       <w:pStyle w:val="Header"/>
@@ -7940,7 +7900,7 @@
       <w:rPr>
         <w:noProof/>
       </w:rPr>
-      <w:pict w14:anchorId="4B185C13">
+      <w:pict w14:anchorId="09C96B4C">
         <v:shapetype id="_x0000_t136" coordsize="21600,21600" o:spt="136" adj="10800" path="m@7,l@8,m@5,21600l@6,21600e">
           <v:formulas>
             <v:f eqn="sum #0 0 10800"/>
@@ -7965,7 +7925,7 @@
           </v:handles>
           <o:lock v:ext="edit" text="t" shapetype="t"/>
         </v:shapetype>
-        <v:shape id="_x0000_s2061" type="#_x0000_t136" alt="" style="position:absolute;margin-left:0;margin-top:0;width:410.05pt;height:249.6pt;rotation:315;z-index:-251629547;mso-wrap-edited:f;mso-width-percent:0;mso-height-percent:0;mso-position-horizontal:center;mso-position-horizontal-relative:margin;mso-position-vertical:center;mso-position-vertical-relative:margin;mso-width-percent:0;mso-height-percent:0" o:allowincell="f" fillcolor="#7f7f7f [1612]" stroked="f">
+        <v:shape id="_x0000_s1037" type="#_x0000_t136" alt="" style="position:absolute;margin-left:0;margin-top:0;width:410.05pt;height:249.6pt;rotation:315;z-index:-251629547;mso-wrap-edited:f;mso-width-percent:0;mso-height-percent:0;mso-position-horizontal:center;mso-position-horizontal-relative:margin;mso-position-vertical:center;mso-position-vertical-relative:margin;mso-width-percent:0;mso-height-percent:0" o:allowincell="f" fillcolor="#7f7f7f [1612]" stroked="f">
           <v:fill opacity="6553f"/>
           <v:textpath style="font-family:&quot;Helvetica Neue&quot;;font-size:1pt" string="JGS"/>
           <w10:wrap anchorx="margin" anchory="margin"/>
@@ -7977,7 +7937,7 @@
 </file>
 
 <file path=word/numbering.xml><?xml version="1.0" encoding="utf-8"?>
-<w:numbering xmlns:wpc="http://schemas.microsoft.com/office/word/2010/wordprocessingCanvas" xmlns:cx="http://schemas.microsoft.com/office/drawing/2014/chartex" xmlns:cx1="http://schemas.microsoft.com/office/drawing/2015/9/8/chartex" xmlns:cx2="http://schemas.microsoft.com/office/drawing/2015/10/21/chartex" xmlns:cx3="http://schemas.microsoft.com/office/drawing/2016/5/9/chartex" xmlns:cx4="http://schemas.microsoft.com/office/drawing/2016/5/10/chartex" xmlns:cx5="http://schemas.microsoft.com/office/drawing/2016/5/11/chartex" xmlns:cx6="http://schemas.microsoft.com/office/drawing/2016/5/12/chartex" xmlns:cx7="http://schemas.microsoft.com/office/drawing/2016/5/13/chartex" xmlns:cx8="http://schemas.microsoft.com/office/drawing/2016/5/14/chartex" xmlns:mc="http://schemas.openxmlformats.org/markup-compatibility/2006" xmlns:aink="http://schemas.microsoft.com/office/drawing/2016/ink" xmlns:am3d="http://schemas.microsoft.com/office/drawing/2017/model3d" xmlns:o="urn:schemas-microsoft-com:office:office" xmlns:r="http://schemas.openxmlformats.org/officeDocument/2006/relationships" xmlns:m="http://schemas.openxmlformats.org/officeDocument/2006/math" xmlns:v="urn:schemas-microsoft-com:vml" xmlns:wp14="http://schemas.microsoft.com/office/word/2010/wordprocessingDrawing" xmlns:wp="http://schemas.openxmlformats.org/drawingml/2006/wordprocessingDrawing" xmlns:w10="urn:schemas-microsoft-com:office:word" xmlns:w="http://schemas.openxmlformats.org/wordprocessingml/2006/main" xmlns:w14="http://schemas.microsoft.com/office/word/2010/wordml" xmlns:w15="http://schemas.microsoft.com/office/word/2012/wordml" xmlns:w16cid="http://schemas.microsoft.com/office/word/2016/wordml/cid" xmlns:w16se="http://schemas.microsoft.com/office/word/2015/wordml/symex" xmlns:wpg="http://schemas.microsoft.com/office/word/2010/wordprocessingGroup" xmlns:wpi="http://schemas.microsoft.com/office/word/2010/wordprocessingInk" xmlns:wne="http://schemas.microsoft.com/office/word/2006/wordml" xmlns:wps="http://schemas.microsoft.com/office/word/2010/wordprocessingShape" mc:Ignorable="w14 w15 w16se w16cid wp14">
+<w:numbering xmlns:wpc="http://schemas.microsoft.com/office/word/2010/wordprocessingCanvas" xmlns:cx="http://schemas.microsoft.com/office/drawing/2014/chartex" xmlns:cx1="http://schemas.microsoft.com/office/drawing/2015/9/8/chartex" xmlns:cx2="http://schemas.microsoft.com/office/drawing/2015/10/21/chartex" xmlns:cx3="http://schemas.microsoft.com/office/drawing/2016/5/9/chartex" xmlns:cx4="http://schemas.microsoft.com/office/drawing/2016/5/10/chartex" xmlns:cx5="http://schemas.microsoft.com/office/drawing/2016/5/11/chartex" xmlns:cx6="http://schemas.microsoft.com/office/drawing/2016/5/12/chartex" xmlns:cx7="http://schemas.microsoft.com/office/drawing/2016/5/13/chartex" xmlns:cx8="http://schemas.microsoft.com/office/drawing/2016/5/14/chartex" xmlns:mc="http://schemas.openxmlformats.org/markup-compatibility/2006" xmlns:m="http://schemas.openxmlformats.org/officeDocument/2006/math" xmlns:aink="http://schemas.microsoft.com/office/drawing/2016/ink" xmlns:am3d="http://schemas.microsoft.com/office/drawing/2017/model3d" xmlns:oel="http://schemas.microsoft.com/office/2019/extlst" xmlns:r="http://schemas.openxmlformats.org/officeDocument/2006/relationships" xmlns:wp14="http://schemas.microsoft.com/office/word/2010/wordprocessingDrawing" xmlns:wp="http://schemas.openxmlformats.org/drawingml/2006/wordprocessingDrawing" xmlns:wpg="http://schemas.microsoft.com/office/word/2010/wordprocessingGroup" xmlns:wpi="http://schemas.microsoft.com/office/word/2010/wordprocessingInk" xmlns:wps="http://schemas.microsoft.com/office/word/2010/wordprocessingShape" xmlns:o="urn:schemas-microsoft-com:office:office" xmlns:v="urn:schemas-microsoft-com:vml" xmlns:w10="urn:schemas-microsoft-com:office:word" xmlns:w="http://schemas.openxmlformats.org/wordprocessingml/2006/main" xmlns:w14="http://schemas.microsoft.com/office/word/2010/wordml" xmlns:w15="http://schemas.microsoft.com/office/word/2012/wordml" xmlns:w16cex="http://schemas.microsoft.com/office/word/2018/wordml/cex" xmlns:w16cid="http://schemas.microsoft.com/office/word/2016/wordml/cid" xmlns:w16="http://schemas.microsoft.com/office/word/2018/wordml" xmlns:w16sdtdh="http://schemas.microsoft.com/office/word/2020/wordml/sdtdatahash" xmlns:w16sdtfl="http://schemas.microsoft.com/office/word/2024/wordml/sdtformatlock" xmlns:w16se="http://schemas.microsoft.com/office/word/2015/wordml/symex" xmlns:w16du="http://schemas.microsoft.com/office/word/2023/wordml/word16du" xmlns:wne="http://schemas.microsoft.com/office/word/2006/wordml" mc:Ignorable="w14 w15 w16se w16cid w16 w16cex w16sdtdh w16sdtfl w16du wp14">
   <w:abstractNum w:abstractNumId="0" w15:restartNumberingAfterBreak="0">
     <w:nsid w:val="05FB155B"/>
     <w:multiLevelType w:val="hybridMultilevel"/>
@@ -10786,82 +10746,82 @@
       </w:pPr>
     </w:lvl>
   </w:abstractNum>
-  <w:num w:numId="1">
+  <w:num w:numId="1" w16cid:durableId="1762944737">
     <w:abstractNumId w:val="14"/>
   </w:num>
-  <w:num w:numId="2">
+  <w:num w:numId="2" w16cid:durableId="1918125128">
     <w:abstractNumId w:val="3"/>
   </w:num>
-  <w:num w:numId="3">
+  <w:num w:numId="3" w16cid:durableId="921379749">
     <w:abstractNumId w:val="16"/>
   </w:num>
-  <w:num w:numId="4">
+  <w:num w:numId="4" w16cid:durableId="2125414814">
     <w:abstractNumId w:val="11"/>
   </w:num>
-  <w:num w:numId="5">
+  <w:num w:numId="5" w16cid:durableId="1066142978">
     <w:abstractNumId w:val="10"/>
   </w:num>
-  <w:num w:numId="6">
+  <w:num w:numId="6" w16cid:durableId="721904790">
     <w:abstractNumId w:val="12"/>
   </w:num>
-  <w:num w:numId="7">
+  <w:num w:numId="7" w16cid:durableId="528687381">
     <w:abstractNumId w:val="7"/>
   </w:num>
-  <w:num w:numId="8">
+  <w:num w:numId="8" w16cid:durableId="128128620">
     <w:abstractNumId w:val="23"/>
   </w:num>
-  <w:num w:numId="9">
+  <w:num w:numId="9" w16cid:durableId="393703976">
     <w:abstractNumId w:val="5"/>
   </w:num>
-  <w:num w:numId="10">
+  <w:num w:numId="10" w16cid:durableId="1775904220">
     <w:abstractNumId w:val="9"/>
   </w:num>
-  <w:num w:numId="11">
+  <w:num w:numId="11" w16cid:durableId="709107133">
     <w:abstractNumId w:val="4"/>
   </w:num>
-  <w:num w:numId="12">
+  <w:num w:numId="12" w16cid:durableId="502625559">
     <w:abstractNumId w:val="15"/>
   </w:num>
-  <w:num w:numId="13">
+  <w:num w:numId="13" w16cid:durableId="1737701775">
     <w:abstractNumId w:val="2"/>
   </w:num>
-  <w:num w:numId="14">
+  <w:num w:numId="14" w16cid:durableId="2130660456">
     <w:abstractNumId w:val="6"/>
   </w:num>
-  <w:num w:numId="15">
+  <w:num w:numId="15" w16cid:durableId="1781753507">
     <w:abstractNumId w:val="24"/>
   </w:num>
-  <w:num w:numId="16">
+  <w:num w:numId="16" w16cid:durableId="1960525209">
     <w:abstractNumId w:val="17"/>
   </w:num>
-  <w:num w:numId="17">
+  <w:num w:numId="17" w16cid:durableId="520513197">
     <w:abstractNumId w:val="8"/>
   </w:num>
-  <w:num w:numId="18">
+  <w:num w:numId="18" w16cid:durableId="2145349555">
     <w:abstractNumId w:val="13"/>
   </w:num>
-  <w:num w:numId="19">
+  <w:num w:numId="19" w16cid:durableId="1227914411">
     <w:abstractNumId w:val="18"/>
   </w:num>
-  <w:num w:numId="20">
+  <w:num w:numId="20" w16cid:durableId="2097165911">
     <w:abstractNumId w:val="21"/>
   </w:num>
-  <w:num w:numId="21">
+  <w:num w:numId="21" w16cid:durableId="778795028">
     <w:abstractNumId w:val="0"/>
   </w:num>
-  <w:num w:numId="22">
+  <w:num w:numId="22" w16cid:durableId="1546987821">
     <w:abstractNumId w:val="19"/>
   </w:num>
-  <w:num w:numId="23">
+  <w:num w:numId="23" w16cid:durableId="1594052570">
     <w:abstractNumId w:val="25"/>
   </w:num>
-  <w:num w:numId="24">
+  <w:num w:numId="24" w16cid:durableId="1826239941">
     <w:abstractNumId w:val="22"/>
   </w:num>
-  <w:num w:numId="25">
+  <w:num w:numId="25" w16cid:durableId="513572815">
     <w:abstractNumId w:val="1"/>
   </w:num>
-  <w:num w:numId="26">
+  <w:num w:numId="26" w16cid:durableId="1311905136">
     <w:abstractNumId w:val="20"/>
   </w:num>
   <w:numIdMacAtCleanup w:val="24"/>
@@ -10869,7 +10829,7 @@
 </file>
 
 <file path=word/styles.xml><?xml version="1.0" encoding="utf-8"?>
-<w:styles xmlns:mc="http://schemas.openxmlformats.org/markup-compatibility/2006" xmlns:r="http://schemas.openxmlformats.org/officeDocument/2006/relationships" xmlns:w="http://schemas.openxmlformats.org/wordprocessingml/2006/main" xmlns:w14="http://schemas.microsoft.com/office/word/2010/wordml" xmlns:w15="http://schemas.microsoft.com/office/word/2012/wordml" xmlns:w16cid="http://schemas.microsoft.com/office/word/2016/wordml/cid" xmlns:w16se="http://schemas.microsoft.com/office/word/2015/wordml/symex" mc:Ignorable="w14 w15 w16se w16cid">
+<w:styles xmlns:mc="http://schemas.openxmlformats.org/markup-compatibility/2006" xmlns:r="http://schemas.openxmlformats.org/officeDocument/2006/relationships" xmlns:w="http://schemas.openxmlformats.org/wordprocessingml/2006/main" xmlns:w14="http://schemas.microsoft.com/office/word/2010/wordml" xmlns:w15="http://schemas.microsoft.com/office/word/2012/wordml" xmlns:w16cex="http://schemas.microsoft.com/office/word/2018/wordml/cex" xmlns:w16cid="http://schemas.microsoft.com/office/word/2016/wordml/cid" xmlns:w16="http://schemas.microsoft.com/office/word/2018/wordml" xmlns:w16sdtdh="http://schemas.microsoft.com/office/word/2020/wordml/sdtdatahash" xmlns:w16sdtfl="http://schemas.microsoft.com/office/word/2024/wordml/sdtformatlock" xmlns:w16se="http://schemas.microsoft.com/office/word/2015/wordml/symex" xmlns:w16du="http://schemas.microsoft.com/office/word/2023/wordml/word16du" mc:Ignorable="w14 w15 w16se w16cid w16 w16cex w16sdtdh w16sdtfl w16du">
   <w:docDefaults>
     <w:rPrDefault>
       <w:rPr>
@@ -10885,7 +10845,7 @@
       </w:pPr>
     </w:pPrDefault>
   </w:docDefaults>
-  <w:latentStyles w:defLockedState="0" w:defUIPriority="99" w:defSemiHidden="0" w:defUnhideWhenUsed="0" w:defQFormat="0" w:count="375">
+  <w:latentStyles w:defLockedState="0" w:defUIPriority="99" w:defSemiHidden="0" w:defUnhideWhenUsed="0" w:defQFormat="0" w:count="376">
     <w:lsdException w:name="Normal" w:uiPriority="0" w:qFormat="1"/>
     <w:lsdException w:name="heading 1" w:uiPriority="9" w:qFormat="1"/>
     <w:lsdException w:name="heading 2" w:semiHidden="1" w:uiPriority="9" w:unhideWhenUsed="1"/>
@@ -11261,6 +11221,7 @@
     <w:lsdException w:name="Smart Hyperlink" w:semiHidden="1" w:unhideWhenUsed="1"/>
     <w:lsdException w:name="Hashtag" w:semiHidden="1" w:unhideWhenUsed="1"/>
     <w:lsdException w:name="Unresolved Mention" w:semiHidden="1" w:unhideWhenUsed="1"/>
+    <w:lsdException w:name="Smart Link" w:semiHidden="1" w:unhideWhenUsed="1"/>
   </w:latentStyles>
   <w:style w:type="paragraph" w:default="1" w:styleId="Normal">
     <w:name w:val="Normal"/>
@@ -12027,7 +11988,7 @@
 </file>
 
 <file path=word/glossary/document.xml><?xml version="1.0" encoding="utf-8"?>
-<w:glossaryDocument xmlns:wpc="http://schemas.microsoft.com/office/word/2010/wordprocessingCanvas" xmlns:cx="http://schemas.microsoft.com/office/drawing/2014/chartex" xmlns:cx1="http://schemas.microsoft.com/office/drawing/2015/9/8/chartex" xmlns:cx2="http://schemas.microsoft.com/office/drawing/2015/10/21/chartex" xmlns:cx3="http://schemas.microsoft.com/office/drawing/2016/5/9/chartex" xmlns:cx4="http://schemas.microsoft.com/office/drawing/2016/5/10/chartex" xmlns:cx5="http://schemas.microsoft.com/office/drawing/2016/5/11/chartex" xmlns:cx6="http://schemas.microsoft.com/office/drawing/2016/5/12/chartex" xmlns:cx7="http://schemas.microsoft.com/office/drawing/2016/5/13/chartex" xmlns:cx8="http://schemas.microsoft.com/office/drawing/2016/5/14/chartex" xmlns:mc="http://schemas.openxmlformats.org/markup-compatibility/2006" xmlns:aink="http://schemas.microsoft.com/office/drawing/2016/ink" xmlns:am3d="http://schemas.microsoft.com/office/drawing/2017/model3d" xmlns:o="urn:schemas-microsoft-com:office:office" xmlns:r="http://schemas.openxmlformats.org/officeDocument/2006/relationships" xmlns:m="http://schemas.openxmlformats.org/officeDocument/2006/math" xmlns:v="urn:schemas-microsoft-com:vml" xmlns:wp14="http://schemas.microsoft.com/office/word/2010/wordprocessingDrawing" xmlns:wp="http://schemas.openxmlformats.org/drawingml/2006/wordprocessingDrawing" xmlns:w10="urn:schemas-microsoft-com:office:word" xmlns:w="http://schemas.openxmlformats.org/wordprocessingml/2006/main" xmlns:w14="http://schemas.microsoft.com/office/word/2010/wordml" xmlns:w15="http://schemas.microsoft.com/office/word/2012/wordml" xmlns:w16cid="http://schemas.microsoft.com/office/word/2016/wordml/cid" xmlns:w16se="http://schemas.microsoft.com/office/word/2015/wordml/symex" xmlns:wpg="http://schemas.microsoft.com/office/word/2010/wordprocessingGroup" xmlns:wpi="http://schemas.microsoft.com/office/word/2010/wordprocessingInk" xmlns:wne="http://schemas.microsoft.com/office/word/2006/wordml" xmlns:wps="http://schemas.microsoft.com/office/word/2010/wordprocessingShape" mc:Ignorable="w14 w15 w16se w16cid wp14">
+<w:glossaryDocument xmlns:wpc="http://schemas.microsoft.com/office/word/2010/wordprocessingCanvas" xmlns:cx="http://schemas.microsoft.com/office/drawing/2014/chartex" xmlns:cx1="http://schemas.microsoft.com/office/drawing/2015/9/8/chartex" xmlns:cx2="http://schemas.microsoft.com/office/drawing/2015/10/21/chartex" xmlns:cx3="http://schemas.microsoft.com/office/drawing/2016/5/9/chartex" xmlns:cx4="http://schemas.microsoft.com/office/drawing/2016/5/10/chartex" xmlns:cx5="http://schemas.microsoft.com/office/drawing/2016/5/11/chartex" xmlns:cx6="http://schemas.microsoft.com/office/drawing/2016/5/12/chartex" xmlns:cx7="http://schemas.microsoft.com/office/drawing/2016/5/13/chartex" xmlns:cx8="http://schemas.microsoft.com/office/drawing/2016/5/14/chartex" xmlns:mc="http://schemas.openxmlformats.org/markup-compatibility/2006" xmlns:m="http://schemas.openxmlformats.org/officeDocument/2006/math" xmlns:aink="http://schemas.microsoft.com/office/drawing/2016/ink" xmlns:am3d="http://schemas.microsoft.com/office/drawing/2017/model3d" xmlns:oel="http://schemas.microsoft.com/office/2019/extlst" xmlns:r="http://schemas.openxmlformats.org/officeDocument/2006/relationships" xmlns:wp14="http://schemas.microsoft.com/office/word/2010/wordprocessingDrawing" xmlns:wp="http://schemas.openxmlformats.org/drawingml/2006/wordprocessingDrawing" xmlns:wpg="http://schemas.microsoft.com/office/word/2010/wordprocessingGroup" xmlns:wpi="http://schemas.microsoft.com/office/word/2010/wordprocessingInk" xmlns:wps="http://schemas.microsoft.com/office/word/2010/wordprocessingShape" xmlns:o="urn:schemas-microsoft-com:office:office" xmlns:v="urn:schemas-microsoft-com:vml" xmlns:w10="urn:schemas-microsoft-com:office:word" xmlns:w="http://schemas.openxmlformats.org/wordprocessingml/2006/main" xmlns:w14="http://schemas.microsoft.com/office/word/2010/wordml" xmlns:w15="http://schemas.microsoft.com/office/word/2012/wordml" xmlns:w16cex="http://schemas.microsoft.com/office/word/2018/wordml/cex" xmlns:w16cid="http://schemas.microsoft.com/office/word/2016/wordml/cid" xmlns:w16="http://schemas.microsoft.com/office/word/2018/wordml" xmlns:w16sdtdh="http://schemas.microsoft.com/office/word/2020/wordml/sdtdatahash" xmlns:w16sdtfl="http://schemas.microsoft.com/office/word/2024/wordml/sdtformatlock" xmlns:w16se="http://schemas.microsoft.com/office/word/2015/wordml/symex" xmlns:w16du="http://schemas.microsoft.com/office/word/2023/wordml/word16du" xmlns:wne="http://schemas.microsoft.com/office/word/2006/wordml" mc:Ignorable="w14 w15 w16se w16cid w16 w16cex w16sdtdh w16sdtfl w16du wp14">
   <w:docParts>
     <w:docPart>
       <w:docPartPr>
@@ -12054,7 +12015,7 @@
               <w:rFonts w:ascii="Dubai Light" w:hAnsi="Dubai Light" w:cs="Dubai Light"/>
               <w:b/>
               <w:caps/>
-              <w:color w:val="1F4E79" w:themeColor="accent5" w:themeShade="80"/>
+              <w:color w:val="501549" w:themeColor="accent5" w:themeShade="80"/>
               <w:sz w:val="28"/>
               <w:szCs w:val="28"/>
             </w:rPr>
@@ -12099,11 +12060,11 @@
 </file>
 
 <file path=word/glossary/fontTable.xml><?xml version="1.0" encoding="utf-8"?>
-<w:fonts xmlns:mc="http://schemas.openxmlformats.org/markup-compatibility/2006" xmlns:r="http://schemas.openxmlformats.org/officeDocument/2006/relationships" xmlns:w="http://schemas.openxmlformats.org/wordprocessingml/2006/main" xmlns:w14="http://schemas.microsoft.com/office/word/2010/wordml" xmlns:w15="http://schemas.microsoft.com/office/word/2012/wordml" xmlns:w16cid="http://schemas.microsoft.com/office/word/2016/wordml/cid" xmlns:w16se="http://schemas.microsoft.com/office/word/2015/wordml/symex" mc:Ignorable="w14 w15 w16se w16cid">
+<w:fonts xmlns:mc="http://schemas.openxmlformats.org/markup-compatibility/2006" xmlns:r="http://schemas.openxmlformats.org/officeDocument/2006/relationships" xmlns:w="http://schemas.openxmlformats.org/wordprocessingml/2006/main" xmlns:w14="http://schemas.microsoft.com/office/word/2010/wordml" xmlns:w15="http://schemas.microsoft.com/office/word/2012/wordml" xmlns:w16cex="http://schemas.microsoft.com/office/word/2018/wordml/cex" xmlns:w16cid="http://schemas.microsoft.com/office/word/2016/wordml/cid" xmlns:w16="http://schemas.microsoft.com/office/word/2018/wordml" xmlns:w16sdtdh="http://schemas.microsoft.com/office/word/2020/wordml/sdtdatahash" xmlns:w16sdtfl="http://schemas.microsoft.com/office/word/2024/wordml/sdtformatlock" xmlns:w16se="http://schemas.microsoft.com/office/word/2015/wordml/symex" xmlns:w16du="http://schemas.microsoft.com/office/word/2023/wordml/word16du" mc:Ignorable="w14 w15 w16se w16cid w16 w16cex w16sdtdh w16sdtfl w16du">
   <w:font w:name="Symbol">
     <w:panose1 w:val="05050102010706020507"/>
     <w:charset w:val="02"/>
-    <w:family w:val="roman"/>
+    <w:family w:val="decorative"/>
     <w:pitch w:val="variable"/>
     <w:sig w:usb0="00000000" w:usb1="10000000" w:usb2="00000000" w:usb3="00000000" w:csb0="80000000" w:csb1="00000000"/>
   </w:font>
@@ -12136,7 +12097,7 @@
     <w:sig w:usb0="E4002EFF" w:usb1="C200247B" w:usb2="00000009" w:usb3="00000000" w:csb0="000001FF" w:csb1="00000000"/>
   </w:font>
   <w:font w:name="Helvetica Neue">
-    <w:altName w:val="Sylfaen"/>
+    <w:panose1 w:val="02000503000000020004"/>
     <w:charset w:val="00"/>
     <w:family w:val="auto"/>
     <w:pitch w:val="variable"/>
@@ -12170,11 +12131,25 @@
     <w:pitch w:val="variable"/>
     <w:sig w:usb0="E4002EFF" w:usb1="C200247B" w:usb2="00000009" w:usb3="00000000" w:csb0="000001FF" w:csb1="00000000"/>
   </w:font>
+  <w:font w:name="Aptos">
+    <w:panose1 w:val="020B0004020202020204"/>
+    <w:charset w:val="00"/>
+    <w:family w:val="swiss"/>
+    <w:pitch w:val="variable"/>
+    <w:sig w:usb0="20000287" w:usb1="00000003" w:usb2="00000000" w:usb3="00000000" w:csb0="0000019F" w:csb1="00000000"/>
+  </w:font>
+  <w:font w:name="Aptos Display">
+    <w:panose1 w:val="020B0004020202020204"/>
+    <w:charset w:val="00"/>
+    <w:family w:val="roman"/>
+    <w:notTrueType/>
+    <w:pitch w:val="default"/>
+  </w:font>
 </w:fonts>
 </file>
 
 <file path=word/glossary/settings.xml><?xml version="1.0" encoding="utf-8"?>
-<w:settings xmlns:mc="http://schemas.openxmlformats.org/markup-compatibility/2006" xmlns:o="urn:schemas-microsoft-com:office:office" xmlns:r="http://schemas.openxmlformats.org/officeDocument/2006/relationships" xmlns:m="http://schemas.openxmlformats.org/officeDocument/2006/math" xmlns:v="urn:schemas-microsoft-com:vml" xmlns:w10="urn:schemas-microsoft-com:office:word" xmlns:w="http://schemas.openxmlformats.org/wordprocessingml/2006/main" xmlns:w14="http://schemas.microsoft.com/office/word/2010/wordml" xmlns:w15="http://schemas.microsoft.com/office/word/2012/wordml" xmlns:w16cid="http://schemas.microsoft.com/office/word/2016/wordml/cid" xmlns:w16se="http://schemas.microsoft.com/office/word/2015/wordml/symex" xmlns:sl="http://schemas.openxmlformats.org/schemaLibrary/2006/main" mc:Ignorable="w14 w15 w16se w16cid">
+<w:settings xmlns:mc="http://schemas.openxmlformats.org/markup-compatibility/2006" xmlns:m="http://schemas.openxmlformats.org/officeDocument/2006/math" xmlns:r="http://schemas.openxmlformats.org/officeDocument/2006/relationships" xmlns:sl="http://schemas.openxmlformats.org/schemaLibrary/2006/main" xmlns:o="urn:schemas-microsoft-com:office:office" xmlns:v="urn:schemas-microsoft-com:vml" xmlns:w10="urn:schemas-microsoft-com:office:word" xmlns:w="http://schemas.openxmlformats.org/wordprocessingml/2006/main" xmlns:w14="http://schemas.microsoft.com/office/word/2010/wordml" xmlns:w15="http://schemas.microsoft.com/office/word/2012/wordml" xmlns:w16cex="http://schemas.microsoft.com/office/word/2018/wordml/cex" xmlns:w16cid="http://schemas.microsoft.com/office/word/2016/wordml/cid" xmlns:w16="http://schemas.microsoft.com/office/word/2018/wordml" xmlns:w16sdtdh="http://schemas.microsoft.com/office/word/2020/wordml/sdtdatahash" xmlns:w16sdtfl="http://schemas.microsoft.com/office/word/2024/wordml/sdtformatlock" xmlns:w16se="http://schemas.microsoft.com/office/word/2015/wordml/symex" xmlns:w16du="http://schemas.microsoft.com/office/word/2023/wordml/word16du" mc:Ignorable="w14 w15 w16se w16cid w16 w16cex w16sdtdh w16sdtfl w16du">
   <w:view w:val="normal"/>
   <w:revisionView w:insDel="0" w:formatting="0" w:inkAnnotations="0"/>
   <w:defaultTabStop w:val="720"/>
@@ -12190,11 +12165,13 @@
   </w:compat>
   <w:rsids>
     <w:rsidRoot w:val="00271A74"/>
+    <w:rsid w:val="000F4985"/>
     <w:rsid w:val="001906F5"/>
     <w:rsid w:val="001A7EF2"/>
     <w:rsid w:val="00271A74"/>
     <w:rsid w:val="00357557"/>
     <w:rsid w:val="003649AB"/>
+    <w:rsid w:val="003C1E13"/>
     <w:rsid w:val="003C429F"/>
     <w:rsid w:val="004203CF"/>
     <w:rsid w:val="004C02BB"/>
@@ -12238,7 +12215,7 @@
 </file>
 
 <file path=word/glossary/styles.xml><?xml version="1.0" encoding="utf-8"?>
-<w:styles xmlns:mc="http://schemas.openxmlformats.org/markup-compatibility/2006" xmlns:r="http://schemas.openxmlformats.org/officeDocument/2006/relationships" xmlns:w="http://schemas.openxmlformats.org/wordprocessingml/2006/main" xmlns:w14="http://schemas.microsoft.com/office/word/2010/wordml" xmlns:w15="http://schemas.microsoft.com/office/word/2012/wordml" xmlns:w16cid="http://schemas.microsoft.com/office/word/2016/wordml/cid" xmlns:w16se="http://schemas.microsoft.com/office/word/2015/wordml/symex" mc:Ignorable="w14 w15 w16se w16cid">
+<w:styles xmlns:mc="http://schemas.openxmlformats.org/markup-compatibility/2006" xmlns:r="http://schemas.openxmlformats.org/officeDocument/2006/relationships" xmlns:w="http://schemas.openxmlformats.org/wordprocessingml/2006/main" xmlns:w14="http://schemas.microsoft.com/office/word/2010/wordml" xmlns:w15="http://schemas.microsoft.com/office/word/2012/wordml" xmlns:w16cex="http://schemas.microsoft.com/office/word/2018/wordml/cex" xmlns:w16cid="http://schemas.microsoft.com/office/word/2016/wordml/cid" xmlns:w16="http://schemas.microsoft.com/office/word/2018/wordml" xmlns:w16sdtdh="http://schemas.microsoft.com/office/word/2020/wordml/sdtdatahash" xmlns:w16sdtfl="http://schemas.microsoft.com/office/word/2024/wordml/sdtformatlock" xmlns:w16se="http://schemas.microsoft.com/office/word/2015/wordml/symex" xmlns:w16du="http://schemas.microsoft.com/office/word/2023/wordml/word16du" mc:Ignorable="w14 w15 w16se w16cid w16 w16cex w16sdtdh w16sdtfl w16du">
   <w:docDefaults>
     <w:rPrDefault>
       <w:rPr>
@@ -12256,7 +12233,7 @@
       </w:pPr>
     </w:pPrDefault>
   </w:docDefaults>
-  <w:latentStyles w:defLockedState="0" w:defUIPriority="99" w:defSemiHidden="0" w:defUnhideWhenUsed="0" w:defQFormat="0" w:count="375">
+  <w:latentStyles w:defLockedState="0" w:defUIPriority="99" w:defSemiHidden="0" w:defUnhideWhenUsed="0" w:defQFormat="0" w:count="376">
     <w:lsdException w:name="Normal" w:uiPriority="0" w:qFormat="1"/>
     <w:lsdException w:name="heading 1" w:uiPriority="9" w:qFormat="1"/>
     <w:lsdException w:name="heading 2" w:semiHidden="1" w:uiPriority="9" w:unhideWhenUsed="1" w:qFormat="1"/>
@@ -12632,6 +12609,7 @@
     <w:lsdException w:name="Smart Hyperlink" w:semiHidden="1" w:unhideWhenUsed="1"/>
     <w:lsdException w:name="Hashtag" w:semiHidden="1" w:unhideWhenUsed="1"/>
     <w:lsdException w:name="Unresolved Mention" w:semiHidden="1" w:unhideWhenUsed="1"/>
+    <w:lsdException w:name="Smart Link" w:semiHidden="1" w:unhideWhenUsed="1"/>
   </w:latentStyles>
   <w:style w:type="paragraph" w:default="1" w:styleId="Normal">
     <w:name w:val="Normal"/>
@@ -12683,7 +12661,7 @@
 </file>
 
 <file path=word/glossary/webSettings.xml><?xml version="1.0" encoding="utf-8"?>
-<w:webSettings xmlns:mc="http://schemas.openxmlformats.org/markup-compatibility/2006" xmlns:r="http://schemas.openxmlformats.org/officeDocument/2006/relationships" xmlns:w="http://schemas.openxmlformats.org/wordprocessingml/2006/main" xmlns:w14="http://schemas.microsoft.com/office/word/2010/wordml" xmlns:w15="http://schemas.microsoft.com/office/word/2012/wordml" xmlns:w16cid="http://schemas.microsoft.com/office/word/2016/wordml/cid" xmlns:w16se="http://schemas.microsoft.com/office/word/2015/wordml/symex" mc:Ignorable="w14 w15 w16se w16cid">
+<w:webSettings xmlns:mc="http://schemas.openxmlformats.org/markup-compatibility/2006" xmlns:r="http://schemas.openxmlformats.org/officeDocument/2006/relationships" xmlns:w="http://schemas.openxmlformats.org/wordprocessingml/2006/main" xmlns:w14="http://schemas.microsoft.com/office/word/2010/wordml" xmlns:w15="http://schemas.microsoft.com/office/word/2012/wordml" xmlns:w16cex="http://schemas.microsoft.com/office/word/2018/wordml/cex" xmlns:w16cid="http://schemas.microsoft.com/office/word/2016/wordml/cid" xmlns:w16="http://schemas.microsoft.com/office/word/2018/wordml" xmlns:w16sdtdh="http://schemas.microsoft.com/office/word/2020/wordml/sdtdatahash" xmlns:w16sdtfl="http://schemas.microsoft.com/office/word/2024/wordml/sdtformatlock" xmlns:w16se="http://schemas.microsoft.com/office/word/2015/wordml/symex" xmlns:w16du="http://schemas.microsoft.com/office/word/2023/wordml/word16du" mc:Ignorable="w14 w15 w16se w16cid w16 w16cex w16sdtdh w16sdtfl w16du">
   <w:optimizeForBrowser/>
   <w:allowPNG/>
 </w:webSettings>

</xml_diff>